<commit_message>
Installateur Windows fiabilisé : batch pur, détection du ZIP non extrait, raccourcis avec solution de secours
- Plus de dépendance obligatoire à PowerShell ; messages d'erreur explicites
- Lanceur « Ouvrir Label Pack Studio » (Edge, Chrome ou navigateur par défaut)
- Lanceur Mac sans Python ; note Word mise à jour

Co-Authored-By: Claude Opus 5.5 <noreply@anthropic.com>
Claude-Session: https://claude.ai/code/session_01WZ3wizDnKCJzxgWNJLJomm
</commit_message>
<xml_diff>
--- a/label-pack-studio/docs/Note-Label-Pack-Studio.docx
+++ b/label-pack-studio/docs/Note-Label-Pack-Studio.docx
@@ -1582,7 +1582,7 @@
           <w:b/>
           <w:bCs/>
         </w:rPr>
-        <w:t xml:space="preserve">« 1 - Installer sur ce PC (Windows).bat »</w:t>
+        <w:t xml:space="preserve">« 1 - Installer sur ce PC (Windows) »</w:t>
       </w:r>
       <w:r>
         <w:t xml:space="preserve">. Un raccourci </w:t>
@@ -1595,7 +1595,7 @@
         <w:t xml:space="preserve">Label Pack Studio</w:t>
       </w:r>
       <w:r>
-        <w:t xml:space="preserve"> est créé sur le Bureau et dans le menu Démarrer.</w:t>
+        <w:t xml:space="preserve"> est créé sur le Bureau et dans le menu Démarrer, puis l'application s'ouvre.</w:t>
       </w:r>
     </w:p>
     <w:p>
@@ -1632,6 +1632,65 @@
             <w:tcW w:type="dxa" w:w="9638"/>
             <w:tcBorders>
               <w:top w:val="none" w:color="FFFFFF" w:sz="0"/>
+              <w:left w:val="single" w:color="17784A" w:sz="24"/>
+              <w:bottom w:val="none" w:color="FFFFFF" w:sz="0"/>
+              <w:right w:val="none" w:color="FFFFFF" w:sz="0"/>
+            </w:tcBorders>
+            <w:shd w:fill="E8F5EE" w:color="auto" w:val="clear"/>
+            <w:tcMar>
+              <w:top w:type="dxa" w:w="120"/>
+              <w:left w:type="dxa" w:w="200"/>
+              <w:bottom w:type="dxa" w:w="120"/>
+              <w:right w:type="dxa" w:w="200"/>
+            </w:tcMar>
+          </w:tcPr>
+          <w:p>
+            <w:pPr>
+              <w:spacing w:after="60"/>
+            </w:pPr>
+            <w:r>
+              <w:rPr>
+                <w:b/>
+                <w:bCs/>
+                <w:color w:val="17784A"/>
+              </w:rPr>
+              <w:t xml:space="preserve">Solution de secours, toujours valable</w:t>
+            </w:r>
+          </w:p>
+          <w:p>
+            <w:r>
+              <w:t xml:space="preserve">Dans le dossier extrait, double-cliquer sur « LabelPackStudio.html » : l'application s'ouvre directement dans le navigateur, sans installation. Si l'installateur affiche un message d'erreur, il indique la marche à suivre.</w:t>
+            </w:r>
+          </w:p>
+        </w:tc>
+      </w:tr>
+    </w:tbl>
+    <w:p>
+      <w:pPr>
+        <w:spacing w:after="80"/>
+      </w:pPr>
+    </w:p>
+    <w:tbl>
+      <w:tblPr>
+        <w:tblW w:type="dxa" w:w="9638"/>
+        <w:tblBorders>
+          <w:top w:val="single" w:color="auto" w:sz="4"/>
+          <w:left w:val="single" w:color="auto" w:sz="4"/>
+          <w:bottom w:val="single" w:color="auto" w:sz="4"/>
+          <w:right w:val="single" w:color="auto" w:sz="4"/>
+          <w:insideH w:val="single" w:color="auto" w:sz="4"/>
+          <w:insideV w:val="single" w:color="auto" w:sz="4"/>
+        </w:tblBorders>
+      </w:tblPr>
+      <w:tblGrid>
+        <w:gridCol w:w="9638"/>
+      </w:tblGrid>
+      <w:tr>
+        <w:tc>
+          <w:tcPr>
+            <w:tcW w:type="dxa" w:w="9638"/>
+            <w:tcBorders>
+              <w:top w:val="none" w:color="FFFFFF" w:sz="0"/>
               <w:left w:val="single" w:color="B80F5A" w:sz="24"/>
               <w:bottom w:val="none" w:color="FFFFFF" w:sz="0"/>
               <w:right w:val="none" w:color="FFFFFF" w:sz="0"/>
@@ -1705,10 +1764,10 @@
           <w:b/>
           <w:bCs/>
         </w:rPr>
-        <w:t xml:space="preserve">« Installer le panneau Illustrator (Windows).bat »</w:t>
-      </w:r>
-      <w:r>
-        <w:t xml:space="preserve"> (ou « (Mac).command »).</w:t>
+        <w:t xml:space="preserve">« Installer le panneau Illustrator (Windows) »</w:t>
+      </w:r>
+      <w:r>
+        <w:t xml:space="preserve"> (ou « (Mac) » sur Mac).</w:t>
       </w:r>
     </w:p>
     <w:p>
@@ -5504,7 +5563,7 @@
       <w:r>
         <w:t xml:space="preserve">Vidéos jointes : </w:t>
       </w:r>
-      <w:hyperlink w:history="1" r:id="rId-zcadna5bxxugov_-p2m2">
+      <w:hyperlink w:history="1" r:id="rIdapqauw9o0du4w-v4mu4cz">
         <w:r>
           <w:rPr>
             <w:rStyle w:val="Hyperlink"/>
@@ -5515,7 +5574,7 @@
       <w:r>
         <w:t xml:space="preserve"> et </w:t>
       </w:r>
-      <w:hyperlink w:history="1" r:id="rIdunbzvwz2rxej9bmkopd52">
+      <w:hyperlink w:history="1" r:id="rId7lig1akarquhn2xdj3jyu">
         <w:r>
           <w:rPr>
             <w:rStyle w:val="Hyperlink"/>

</xml_diff>

<commit_message>
Note Word : imposition tête-bêche, dossier formiste, codes GS1, braille, BAT en ligne, suivi des dossiers, PDF/X-3
Co-Authored-By: Claude Opus 5.5 <noreply@anthropic.com>
Claude-Session: https://claude.ai/code/session_01WZ3wizDnKCJzxgWNJLJomm
</commit_message>
<xml_diff>
--- a/label-pack-studio/docs/Note-Label-Pack-Studio.docx
+++ b/label-pack-studio/docs/Note-Label-Pack-Studio.docx
@@ -99,7 +99,7 @@
         <w:jc w:val="left"/>
       </w:pPr>
       <w:r>
-        <w:t xml:space="preserve">Configurateur d'emballages en 3D, du gabarit au fichier d'impression : 22 modèles paramétriques, maquette 3D, plan de découpe compensé, devis instantané en TND, BAT, PDF d'impression avec masques de finition, catalogue client, panneau Illustrator.</w:t>
+        <w:t xml:space="preserve">Configurateur d'emballages en 3D, du gabarit au fichier d'impression : 22 modèles paramétriques, maquette 3D, plan de découpe compensé, devis instantané en TND, imposition tête-bêche avec calcul de la chute, dossier formiste DXF, codes-barres GS1, braille, BAT validé en ligne par le client, PDF d'impression PDF/X-3, catalogue client, panneau Illustrator.</w:t>
       </w:r>
     </w:p>
     <w:p>
@@ -112,7 +112,7 @@
           <w:sz w:val="19"/>
           <w:szCs w:val="19"/>
         </w:rPr>
-        <w:t xml:space="preserve">Note destinée à l'équipe Label Pack (direction, commercial, infographie, atelier) · 24 octobre 2026</w:t>
+        <w:t xml:space="preserve">Note destinée à l'équipe Label Pack (direction, commercial, infographie, atelier) · 25 octobre 2026</w:t>
       </w:r>
     </w:p>
     <w:p>
@@ -480,7 +480,7 @@
                 <w:sz w:val="19"/>
                 <w:szCs w:val="19"/>
               </w:rPr>
-              <w:t xml:space="preserve">Plan de découpe 1:1 (PDF, SVG, DXF), forme de découpe et masques de finition séparés, fiche technique, imposition et nombre de feuilles.</w:t>
+              <w:t xml:space="preserve">Plan de découpe 1:1 (PDF, SVG, DXF), dossier formiste (forme 1 pose et montage feuille), imposition tête-bêche optimisée avec sens des fibres et taux de chute, masques de finition séparés, fiche technique.</w:t>
             </w:r>
           </w:p>
         </w:tc>
@@ -548,7 +548,7 @@
                 <w:sz w:val="19"/>
                 <w:szCs w:val="19"/>
               </w:rPr>
-              <w:t xml:space="preserve">Devis homogènes calculés sur la grille tarifaire de l'imprimerie, suivi des projets par statut, catalogue des produits.</w:t>
+              <w:t xml:space="preserve">Devis homogènes calculés sur la grille tarifaire, coût de la chute chiffré, suivi des dossiers par statut et par client, relances automatiques, BAT validés en ligne et tracés.</w:t>
             </w:r>
           </w:p>
         </w:tc>
@@ -855,7 +855,7 @@
                 <w:sz w:val="19"/>
                 <w:szCs w:val="19"/>
               </w:rPr>
-              <w:t xml:space="preserve">PDF d'impression 300 dpi, plan PDF 1:1, SVG à calques, DXF, BAT, devis, images HD / 4K / 8K, vidéos MP4, packs ZIP, script Illustrator</w:t>
+              <w:t xml:space="preserve">PDF d'impression PDF/X-3 300 dpi, plan PDF 1:1, SVG à calques, DXF R12, dossier formiste, BAT, devis, images HD / 4K / 8K, vidéos MP4, packs ZIP, script Illustrator</w:t>
             </w:r>
           </w:p>
         </w:tc>
@@ -890,6 +890,74 @@
                 <w:sz w:val="19"/>
                 <w:szCs w:val="19"/>
               </w:rPr>
+              <w:t xml:space="preserve">Production</w:t>
+            </w:r>
+          </w:p>
+        </w:tc>
+        <w:tc>
+          <w:tcPr>
+            <w:tcW w:type="dxa" w:w="7438"/>
+            <w:tcBorders>
+              <w:top w:val="single" w:color="D6D9D2" w:sz="4"/>
+              <w:left w:val="single" w:color="D6D9D2" w:sz="4"/>
+              <w:bottom w:val="single" w:color="D6D9D2" w:sz="4"/>
+              <w:right w:val="single" w:color="D6D9D2" w:sz="4"/>
+            </w:tcBorders>
+            <w:tcMar>
+              <w:top w:type="dxa" w:w="70"/>
+              <w:left w:type="dxa" w:w="110"/>
+              <w:bottom w:type="dxa" w:w="70"/>
+              <w:right w:type="dxa" w:w="110"/>
+            </w:tcMar>
+            <w:vAlign w:val="center"/>
+          </w:tcPr>
+          <w:p>
+            <w:pPr>
+              <w:spacing w:after="0"/>
+            </w:pPr>
+            <w:r>
+              <w:rPr>
+                <w:b w:val="false"/>
+                <w:bCs w:val="false"/>
+                <w:color w:val="15181D"/>
+                <w:sz w:val="19"/>
+                <w:szCs w:val="19"/>
+              </w:rPr>
+              <w:t xml:space="preserve">Imposition en grille ou tête-bêche, sens des fibres, attaches, filets d'éjection, contre-rainage, coupe-rainage, perforation, bande d'ouverture facile</w:t>
+            </w:r>
+          </w:p>
+        </w:tc>
+      </w:tr>
+      <w:tr>
+        <w:tc>
+          <w:tcPr>
+            <w:tcW w:type="dxa" w:w="2200"/>
+            <w:tcBorders>
+              <w:top w:val="single" w:color="D6D9D2" w:sz="4"/>
+              <w:left w:val="single" w:color="D6D9D2" w:sz="4"/>
+              <w:bottom w:val="single" w:color="D6D9D2" w:sz="4"/>
+              <w:right w:val="single" w:color="D6D9D2" w:sz="4"/>
+            </w:tcBorders>
+            <w:tcMar>
+              <w:top w:type="dxa" w:w="70"/>
+              <w:left w:type="dxa" w:w="110"/>
+              <w:bottom w:type="dxa" w:w="70"/>
+              <w:right w:type="dxa" w:w="110"/>
+            </w:tcMar>
+            <w:vAlign w:val="center"/>
+          </w:tcPr>
+          <w:p>
+            <w:pPr>
+              <w:spacing w:after="0"/>
+            </w:pPr>
+            <w:r>
+              <w:rPr>
+                <w:b w:val="false"/>
+                <w:bCs w:val="false"/>
+                <w:color w:val="15181D"/>
+                <w:sz w:val="19"/>
+                <w:szCs w:val="19"/>
+              </w:rPr>
               <w:t xml:space="preserve">Contrôles</w:t>
             </w:r>
           </w:p>
@@ -923,7 +991,7 @@
                 <w:sz w:val="19"/>
                 <w:szCs w:val="19"/>
               </w:rPr>
-              <w:t xml:space="preserve">Résolution des images, corps minimum, zones de sécurité, code-barres EAN-13, couleurs hors gamut CMJN, format feuille</w:t>
+              <w:t xml:space="preserve">Résolution des images, corps minimum, zones de sécurité, codes EAN-13 et GS1-128, braille, couleurs hors gamut CMJN, conformité du tracé de découpe, format feuille</w:t>
             </w:r>
           </w:p>
         </w:tc>
@@ -2927,6 +2995,24 @@
     </w:p>
     <w:p>
       <w:pPr>
+        <w:spacing w:after="120"/>
+      </w:pPr>
+      <w:r>
+        <w:t xml:space="preserve">La section Format contient aussi le volet </w:t>
+      </w:r>
+      <w:r>
+        <w:rPr>
+          <w:b/>
+          <w:bCs/>
+        </w:rPr>
+        <w:t xml:space="preserve">Forme de découpe, montage et traits spéciaux</w:t>
+      </w:r>
+      <w:r>
+        <w:t xml:space="preserve"> : sens des fibres, attaches, type de chaque pli et bande d'ouverture. Voir le chapitre 7.</w:t>
+      </w:r>
+    </w:p>
+    <w:p>
+      <w:pPr>
         <w:pStyle w:val="Heading2"/>
       </w:pPr>
       <w:r>
@@ -3153,7 +3239,7 @@
                 <w:sz w:val="19"/>
                 <w:szCs w:val="19"/>
               </w:rPr>
-              <w:t xml:space="preserve">Textes (français et arabe), images et formes posés librement et déplacés à la souris sur le plan ; chaque élément peut être doré, verni ou gaufré.</w:t>
+              <w:t xml:space="preserve">Textes (français et arabe), images et formes posés librement et déplacés à la souris sur le plan ; chaque élément peut être doré, verni ou gaufré. Le menu « + Code, braille, picto… » ajoute codes-barres, braille, pictogrammes, zone de marquage et kits de mentions (chapitre 8).</w:t>
             </w:r>
           </w:p>
         </w:tc>
@@ -4187,7 +4273,7 @@
                 <w:sz w:val="19"/>
                 <w:szCs w:val="19"/>
               </w:rPr>
-              <w:t xml:space="preserve">PDF d'impression</w:t>
+              <w:t xml:space="preserve">PDF d'impression (PDF/X-3)</w:t>
             </w:r>
           </w:p>
         </w:tc>
@@ -4220,7 +4306,7 @@
                 <w:sz w:val="19"/>
                 <w:szCs w:val="19"/>
               </w:rPr>
-              <w:t xml:space="preserve">Page 1 : visuel 300 dpi, fond perdu, repères ; page 2 : forme de découpe vectorielle (coupe magenta, rainage cyan) ; pages suivantes : un masque par finition</w:t>
+              <w:t xml:space="preserve">Page 1 : visuel 300 dpi, fond perdu, repères ; page 2 : forme de découpe vectorielle (coupe magenta, rainage cyan, traits spéciaux) ; pages suivantes : un masque par finition (dorure, vernis, gaufrage et braille). Norme PDF/X-3:2003 : zones de coupe et de fond perdu déclarées, condition d'impression FOGRA39 ou FOGRA47, images en sRGB calibré, aucune police</w:t>
             </w:r>
           </w:p>
         </w:tc>
@@ -4254,6 +4340,107 @@
                 <w:szCs w:val="19"/>
               </w:rPr>
               <w:t xml:space="preserve">Prépresse, flasheur</w:t>
+            </w:r>
+          </w:p>
+        </w:tc>
+      </w:tr>
+      <w:tr>
+        <w:tc>
+          <w:tcPr>
+            <w:tcW w:type="dxa" w:w="2400"/>
+            <w:tcBorders>
+              <w:top w:val="single" w:color="D6D9D2" w:sz="4"/>
+              <w:left w:val="single" w:color="D6D9D2" w:sz="4"/>
+              <w:bottom w:val="single" w:color="D6D9D2" w:sz="4"/>
+              <w:right w:val="single" w:color="D6D9D2" w:sz="4"/>
+            </w:tcBorders>
+            <w:tcMar>
+              <w:top w:type="dxa" w:w="70"/>
+              <w:left w:type="dxa" w:w="110"/>
+              <w:bottom w:type="dxa" w:w="70"/>
+              <w:right w:type="dxa" w:w="110"/>
+            </w:tcMar>
+            <w:vAlign w:val="center"/>
+          </w:tcPr>
+          <w:p>
+            <w:pPr>
+              <w:spacing w:after="0"/>
+            </w:pPr>
+            <w:r>
+              <w:rPr>
+                <w:b w:val="false"/>
+                <w:bCs w:val="false"/>
+                <w:color w:val="15181D"/>
+                <w:sz w:val="19"/>
+                <w:szCs w:val="19"/>
+              </w:rPr>
+              <w:t xml:space="preserve">Dossier formiste (.zip)</w:t>
+            </w:r>
+          </w:p>
+        </w:tc>
+        <w:tc>
+          <w:tcPr>
+            <w:tcW w:type="dxa" w:w="5038"/>
+            <w:tcBorders>
+              <w:top w:val="single" w:color="D6D9D2" w:sz="4"/>
+              <w:left w:val="single" w:color="D6D9D2" w:sz="4"/>
+              <w:bottom w:val="single" w:color="D6D9D2" w:sz="4"/>
+              <w:right w:val="single" w:color="D6D9D2" w:sz="4"/>
+            </w:tcBorders>
+            <w:tcMar>
+              <w:top w:type="dxa" w:w="70"/>
+              <w:left w:type="dxa" w:w="110"/>
+              <w:bottom w:type="dxa" w:w="70"/>
+              <w:right w:type="dxa" w:w="110"/>
+            </w:tcMar>
+            <w:vAlign w:val="center"/>
+          </w:tcPr>
+          <w:p>
+            <w:pPr>
+              <w:spacing w:after="0"/>
+            </w:pPr>
+            <w:r>
+              <w:rPr>
+                <w:b w:val="false"/>
+                <w:bCs w:val="false"/>
+                <w:color w:val="15181D"/>
+                <w:sz w:val="19"/>
+                <w:szCs w:val="19"/>
+              </w:rPr>
+              <w:t xml:space="preserve">Forme 1 pose et montage feuille en DXF R12 et PDF, un calque par type de trait, vrais arcs, attaches, sens des fibres, braille, filets conseillés, contrôle du tracé</w:t>
+            </w:r>
+          </w:p>
+        </w:tc>
+        <w:tc>
+          <w:tcPr>
+            <w:tcW w:type="dxa" w:w="2200"/>
+            <w:tcBorders>
+              <w:top w:val="single" w:color="D6D9D2" w:sz="4"/>
+              <w:left w:val="single" w:color="D6D9D2" w:sz="4"/>
+              <w:bottom w:val="single" w:color="D6D9D2" w:sz="4"/>
+              <w:right w:val="single" w:color="D6D9D2" w:sz="4"/>
+            </w:tcBorders>
+            <w:tcMar>
+              <w:top w:type="dxa" w:w="70"/>
+              <w:left w:type="dxa" w:w="110"/>
+              <w:bottom w:type="dxa" w:w="70"/>
+              <w:right w:type="dxa" w:w="110"/>
+            </w:tcMar>
+            <w:vAlign w:val="center"/>
+          </w:tcPr>
+          <w:p>
+            <w:pPr>
+              <w:spacing w:after="0"/>
+            </w:pPr>
+            <w:r>
+              <w:rPr>
+                <w:b w:val="false"/>
+                <w:bCs w:val="false"/>
+                <w:color w:val="15181D"/>
+                <w:sz w:val="19"/>
+                <w:szCs w:val="19"/>
+              </w:rPr>
+              <w:t xml:space="preserve">Formiste</w:t>
             </w:r>
           </w:p>
         </w:tc>
@@ -5563,7 +5750,7 @@
       <w:r>
         <w:t xml:space="preserve">Vidéos jointes : </w:t>
       </w:r>
-      <w:hyperlink w:history="1" r:id="rIdapqauw9o0du4w-v4mu4cz">
+      <w:hyperlink w:history="1" r:id="rIdw19ivjl3qbusvvreasrj6">
         <w:r>
           <w:rPr>
             <w:rStyle w:val="Hyperlink"/>
@@ -5574,7 +5761,7 @@
       <w:r>
         <w:t xml:space="preserve"> et </w:t>
       </w:r>
-      <w:hyperlink w:history="1" r:id="rId7lig1akarquhn2xdj3jyu">
+      <w:hyperlink w:history="1" r:id="rIdapclo9h6nxvzyfqc7b5az">
         <w:r>
           <w:rPr>
             <w:rStyle w:val="Hyperlink"/>
@@ -5949,8 +6136,176 @@
         <w:t xml:space="preserve">Lien client 3D</w:t>
       </w:r>
       <w:r>
-        <w:t xml:space="preserve"> (en ligne) : le client fait tourner sa maquette, voit le prix et valide ou demande une modification par WhatsApp.</w:t>
-      </w:r>
+        <w:t xml:space="preserve"> (en ligne) : le client fait tourner sa maquette et voit le prix.</w:t>
+      </w:r>
+    </w:p>
+    <w:p>
+      <w:pPr>
+        <w:pStyle w:val="Heading2"/>
+      </w:pPr>
+      <w:r>
+        <w:t xml:space="preserve">Validation du BAT en ligne</w:t>
+      </w:r>
+    </w:p>
+    <w:p>
+      <w:pPr>
+        <w:spacing w:after="120"/>
+      </w:pPr>
+      <w:r>
+        <w:t xml:space="preserve">En créant le lien client, laissez cochée l'option </w:t>
+      </w:r>
+      <w:r>
+        <w:rPr>
+          <w:b/>
+          <w:bCs/>
+        </w:rPr>
+        <w:t xml:space="preserve">Validation du BAT en ligne</w:t>
+      </w:r>
+      <w:r>
+        <w:t xml:space="preserve">. Le dossier passe en « BAT envoyé ». Le client indique son nom, coche la case de vérification puis clique sur </w:t>
+      </w:r>
+      <w:r>
+        <w:rPr>
+          <w:b/>
+          <w:bCs/>
+        </w:rPr>
+        <w:t xml:space="preserve">Valider le BAT</w:t>
+      </w:r>
+      <w:r>
+        <w:t xml:space="preserve"> ou </w:t>
+      </w:r>
+      <w:r>
+        <w:rPr>
+          <w:b/>
+          <w:bCs/>
+        </w:rPr>
+        <w:t xml:space="preserve">Demander une correction</w:t>
+      </w:r>
+      <w:r>
+        <w:t xml:space="preserve"> avec son commentaire. Sa réponse s'inscrit dans l'historique du dossier avec la date, et le statut passe à « BAT validé ».</w:t>
+      </w:r>
+    </w:p>
+    <w:p>
+      <w:pPr>
+        <w:keepNext/>
+        <w:spacing w:after="60" w:before="120"/>
+        <w:jc w:val="center"/>
+      </w:pPr>
+      <w:r>
+        <w:drawing>
+          <wp:inline distT="0" distB="0" distL="0" distR="0">
+            <wp:extent cx="5905500" cy="3933825"/>
+            <wp:effectExtent t="0" r="0" b="0" l="0"/>
+            <wp:docPr id="1" name="26-bat-en-ligne.jpg" descr="26-bat-en-ligne.jpg" title="26-bat-en-ligne.jpg"/>
+            <wp:cNvGraphicFramePr>
+              <a:graphicFrameLocks xmlns:a="http://schemas.openxmlformats.org/drawingml/2006/main" noChangeAspect="1"/>
+            </wp:cNvGraphicFramePr>
+            <a:graphic xmlns:a="http://schemas.openxmlformats.org/drawingml/2006/main">
+              <a:graphicData uri="http://schemas.openxmlformats.org/drawingml/2006/picture">
+                <pic:pic xmlns:pic="http://schemas.openxmlformats.org/drawingml/2006/picture">
+                  <pic:nvPicPr>
+                    <pic:cNvPr id="0" name="" descr=""/>
+                    <pic:cNvPicPr>
+                      <a:picLocks noChangeAspect="1" noChangeArrowheads="1"/>
+                    </pic:cNvPicPr>
+                  </pic:nvPicPr>
+                  <pic:blipFill>
+                    <a:blip r:embed="rId32" cstate="none"/>
+                    <a:srcRect/>
+                    <a:stretch>
+                      <a:fillRect/>
+                    </a:stretch>
+                  </pic:blipFill>
+                  <pic:spPr bwMode="auto">
+                    <a:xfrm>
+                      <a:off x="0" y="0"/>
+                      <a:ext cx="5905500" cy="3933825"/>
+                    </a:xfrm>
+                    <a:prstGeom prst="rect">
+                      <a:avLst/>
+                    </a:prstGeom>
+                  </pic:spPr>
+                </pic:pic>
+              </a:graphicData>
+            </a:graphic>
+          </wp:inline>
+        </w:drawing>
+      </w:r>
+    </w:p>
+    <w:p>
+      <w:pPr>
+        <w:pStyle w:val="Caption"/>
+        <w:jc w:val="center"/>
+      </w:pPr>
+      <w:r>
+        <w:rPr>
+          <w:b/>
+          <w:bCs/>
+        </w:rPr>
+        <w:t xml:space="preserve">Figure 9 — </w:t>
+      </w:r>
+      <w:r>
+        <w:t xml:space="preserve">Le client valide son BAT depuis le lien 3D : nom, vérification, commentaire</w:t>
+      </w:r>
+    </w:p>
+    <w:tbl>
+      <w:tblPr>
+        <w:tblW w:type="dxa" w:w="9638"/>
+        <w:tblBorders>
+          <w:top w:val="single" w:color="auto" w:sz="4"/>
+          <w:left w:val="single" w:color="auto" w:sz="4"/>
+          <w:bottom w:val="single" w:color="auto" w:sz="4"/>
+          <w:right w:val="single" w:color="auto" w:sz="4"/>
+          <w:insideH w:val="single" w:color="auto" w:sz="4"/>
+          <w:insideV w:val="single" w:color="auto" w:sz="4"/>
+        </w:tblBorders>
+      </w:tblPr>
+      <w:tblGrid>
+        <w:gridCol w:w="9638"/>
+      </w:tblGrid>
+      <w:tr>
+        <w:tc>
+          <w:tcPr>
+            <w:tcW w:type="dxa" w:w="9638"/>
+            <w:tcBorders>
+              <w:top w:val="none" w:color="FFFFFF" w:sz="0"/>
+              <w:left w:val="single" w:color="B80F5A" w:sz="24"/>
+              <w:bottom w:val="none" w:color="FFFFFF" w:sz="0"/>
+              <w:right w:val="none" w:color="FFFFFF" w:sz="0"/>
+            </w:tcBorders>
+            <w:shd w:fill="F7E7EF" w:color="auto" w:val="clear"/>
+            <w:tcMar>
+              <w:top w:type="dxa" w:w="120"/>
+              <w:left w:type="dxa" w:w="200"/>
+              <w:bottom w:type="dxa" w:w="120"/>
+              <w:right w:type="dxa" w:w="200"/>
+            </w:tcMar>
+          </w:tcPr>
+          <w:p>
+            <w:pPr>
+              <w:spacing w:after="60"/>
+            </w:pPr>
+            <w:r>
+              <w:rPr>
+                <w:b/>
+                <w:bCs/>
+                <w:color w:val="B80F5A"/>
+              </w:rPr>
+              <w:t xml:space="preserve">Accès du client</w:t>
+            </w:r>
+          </w:p>
+          <w:p>
+            <w:r>
+              <w:t xml:space="preserve">Pour enregistrer sa réponse en ligne, le client doit avoir au moins le niveau « Contributeur » sur la page (menu Partager). Sinon, l'application lui propose d'envoyer sa réponse par WhatsApp ou par e-mail. Une réponse reçue par téléphone ou par mail s'enregistre avec le bouton « Réponse client au BAT… » de la carte du projet.</w:t>
+            </w:r>
+          </w:p>
+        </w:tc>
+      </w:tr>
+    </w:tbl>
+    <w:p>
+      <w:pPr>
+        <w:spacing w:after="80"/>
+      </w:pPr>
     </w:p>
     <w:p>
       <w:pPr>
@@ -5958,7 +6313,2075 @@
         <w:pageBreakBefore/>
       </w:pPr>
       <w:r>
-        <w:t xml:space="preserve">7. La bibliothèque de modèles</w:t>
+        <w:t xml:space="preserve">7. Forme de découpe et montage</w:t>
+      </w:r>
+    </w:p>
+    <w:p>
+      <w:pPr>
+        <w:spacing w:after="120"/>
+      </w:pPr>
+      <w:r>
+        <w:t xml:space="preserve">Le volet « Forme de découpe, montage et traits spéciaux » (section Format) prépare le travail du formiste et calcule la meilleure imposition sur la feuille.</w:t>
+      </w:r>
+    </w:p>
+    <w:p>
+      <w:pPr>
+        <w:keepNext/>
+        <w:spacing w:after="60" w:before="120"/>
+        <w:jc w:val="center"/>
+      </w:pPr>
+      <w:r>
+        <w:drawing>
+          <wp:inline distT="0" distB="0" distL="0" distR="0">
+            <wp:extent cx="5905500" cy="3933825"/>
+            <wp:effectExtent t="0" r="0" b="0" l="0"/>
+            <wp:docPr id="1" name="22-forme.jpg" descr="22-forme.jpg" title="22-forme.jpg"/>
+            <wp:cNvGraphicFramePr>
+              <a:graphicFrameLocks xmlns:a="http://schemas.openxmlformats.org/drawingml/2006/main" noChangeAspect="1"/>
+            </wp:cNvGraphicFramePr>
+            <a:graphic xmlns:a="http://schemas.openxmlformats.org/drawingml/2006/main">
+              <a:graphicData uri="http://schemas.openxmlformats.org/drawingml/2006/picture">
+                <pic:pic xmlns:pic="http://schemas.openxmlformats.org/drawingml/2006/picture">
+                  <pic:nvPicPr>
+                    <pic:cNvPr id="0" name="" descr=""/>
+                    <pic:cNvPicPr>
+                      <a:picLocks noChangeAspect="1" noChangeArrowheads="1"/>
+                    </pic:cNvPicPr>
+                  </pic:nvPicPr>
+                  <pic:blipFill>
+                    <a:blip r:embed="rId33" cstate="none"/>
+                    <a:srcRect/>
+                    <a:stretch>
+                      <a:fillRect/>
+                    </a:stretch>
+                  </pic:blipFill>
+                  <pic:spPr bwMode="auto">
+                    <a:xfrm>
+                      <a:off x="0" y="0"/>
+                      <a:ext cx="5905500" cy="3933825"/>
+                    </a:xfrm>
+                    <a:prstGeom prst="rect">
+                      <a:avLst/>
+                    </a:prstGeom>
+                  </pic:spPr>
+                </pic:pic>
+              </a:graphicData>
+            </a:graphic>
+          </wp:inline>
+        </w:drawing>
+      </w:r>
+    </w:p>
+    <w:p>
+      <w:pPr>
+        <w:pStyle w:val="Caption"/>
+        <w:jc w:val="center"/>
+      </w:pPr>
+      <w:r>
+        <w:rPr>
+          <w:b/>
+          <w:bCs/>
+        </w:rPr>
+        <w:t xml:space="preserve">Figure 10 — </w:t>
+      </w:r>
+      <w:r>
+        <w:t xml:space="preserve">Réglages de la forme : fibres, attaches, plis et bande d'ouverture ; perforation et zipper visibles sur le plan</w:t>
+      </w:r>
+    </w:p>
+    <w:p>
+      <w:pPr>
+        <w:pStyle w:val="Heading2"/>
+      </w:pPr>
+      <w:r>
+        <w:t xml:space="preserve">7.1 Imposition et chute</w:t>
+      </w:r>
+    </w:p>
+    <w:p>
+      <w:pPr>
+        <w:pStyle w:val="ListParagraph"/>
+        <w:numPr>
+          <w:ilvl w:val="0"/>
+          <w:numId w:val="5"/>
+        </w:numPr>
+        <w:spacing w:after="60"/>
+      </w:pPr>
+      <w:r>
+        <w:rPr>
+          <w:b/>
+          <w:bCs/>
+        </w:rPr>
+        <w:t xml:space="preserve">Grille ou tête-bêche</w:t>
+      </w:r>
+      <w:r>
+        <w:t xml:space="preserve"> : l'application essaie les deux dispositions (poses alternées et emboîtées) et garde celle qui donne le plus de poses, avec 4 mm minimum entre poses et la prise de pince respectée.</w:t>
+      </w:r>
+    </w:p>
+    <w:p>
+      <w:pPr>
+        <w:pStyle w:val="ListParagraph"/>
+        <w:numPr>
+          <w:ilvl w:val="0"/>
+          <w:numId w:val="5"/>
+        </w:numPr>
+        <w:spacing w:after="60"/>
+      </w:pPr>
+      <w:r>
+        <w:rPr>
+          <w:b/>
+          <w:bCs/>
+        </w:rPr>
+        <w:t xml:space="preserve">Sens des fibres</w:t>
+      </w:r>
+      <w:r>
+        <w:t xml:space="preserve"> : choisi sur le plan (perpendiculaire aux plis du corps, conseillé) et respecté pour toutes les poses. En mode « Automatique », l'application choisit le sens de fibre de la feuille et indique le papier à commander.</w:t>
+      </w:r>
+    </w:p>
+    <w:p>
+      <w:pPr>
+        <w:pStyle w:val="ListParagraph"/>
+        <w:numPr>
+          <w:ilvl w:val="0"/>
+          <w:numId w:val="5"/>
+        </w:numPr>
+        <w:spacing w:after="60"/>
+      </w:pPr>
+      <w:r>
+        <w:rPr>
+          <w:b/>
+          <w:bCs/>
+        </w:rPr>
+        <w:t xml:space="preserve">Rendement et chute</w:t>
+      </w:r>
+      <w:r>
+        <w:t xml:space="preserve"> : affichés dans la section Format et dans la fiche technique du devis, avec le coût du carton perdu.</w:t>
+      </w:r>
+    </w:p>
+    <w:tbl>
+      <w:tblPr>
+        <w:tblW w:type="dxa" w:w="9638"/>
+        <w:tblBorders>
+          <w:top w:val="single" w:color="auto" w:sz="4"/>
+          <w:left w:val="single" w:color="auto" w:sz="4"/>
+          <w:bottom w:val="single" w:color="auto" w:sz="4"/>
+          <w:right w:val="single" w:color="auto" w:sz="4"/>
+          <w:insideH w:val="single" w:color="auto" w:sz="4"/>
+          <w:insideV w:val="single" w:color="auto" w:sz="4"/>
+        </w:tblBorders>
+      </w:tblPr>
+      <w:tblGrid>
+        <w:gridCol w:w="4600"/>
+        <w:gridCol w:w="2200"/>
+        <w:gridCol w:w="2838"/>
+      </w:tblGrid>
+      <w:tr>
+        <w:trPr>
+          <w:tblHeader/>
+        </w:trPr>
+        <w:tc>
+          <w:tcPr>
+            <w:tcW w:type="dxa" w:w="4600"/>
+            <w:tcBorders>
+              <w:top w:val="single" w:color="D6D9D2" w:sz="4"/>
+              <w:left w:val="single" w:color="D6D9D2" w:sz="4"/>
+              <w:bottom w:val="single" w:color="D6D9D2" w:sz="4"/>
+              <w:right w:val="single" w:color="D6D9D2" w:sz="4"/>
+            </w:tcBorders>
+            <w:shd w:fill="15181D" w:color="auto" w:val="clear"/>
+            <w:tcMar>
+              <w:top w:type="dxa" w:w="70"/>
+              <w:left w:type="dxa" w:w="110"/>
+              <w:bottom w:type="dxa" w:w="70"/>
+              <w:right w:type="dxa" w:w="110"/>
+            </w:tcMar>
+            <w:vAlign w:val="center"/>
+          </w:tcPr>
+          <w:p>
+            <w:pPr>
+              <w:spacing w:after="0"/>
+            </w:pPr>
+            <w:r>
+              <w:rPr>
+                <w:b/>
+                <w:bCs/>
+                <w:color w:val="FFFFFF"/>
+                <w:sz w:val="19"/>
+                <w:szCs w:val="19"/>
+              </w:rPr>
+              <w:t xml:space="preserve">Modèle (feuille 70 × 100)</w:t>
+            </w:r>
+          </w:p>
+        </w:tc>
+        <w:tc>
+          <w:tcPr>
+            <w:tcW w:type="dxa" w:w="2200"/>
+            <w:tcBorders>
+              <w:top w:val="single" w:color="D6D9D2" w:sz="4"/>
+              <w:left w:val="single" w:color="D6D9D2" w:sz="4"/>
+              <w:bottom w:val="single" w:color="D6D9D2" w:sz="4"/>
+              <w:right w:val="single" w:color="D6D9D2" w:sz="4"/>
+            </w:tcBorders>
+            <w:shd w:fill="15181D" w:color="auto" w:val="clear"/>
+            <w:tcMar>
+              <w:top w:type="dxa" w:w="70"/>
+              <w:left w:type="dxa" w:w="110"/>
+              <w:bottom w:type="dxa" w:w="70"/>
+              <w:right w:type="dxa" w:w="110"/>
+            </w:tcMar>
+            <w:vAlign w:val="center"/>
+          </w:tcPr>
+          <w:p>
+            <w:pPr>
+              <w:spacing w:after="0"/>
+            </w:pPr>
+            <w:r>
+              <w:rPr>
+                <w:b/>
+                <w:bCs/>
+                <w:color w:val="FFFFFF"/>
+                <w:sz w:val="19"/>
+                <w:szCs w:val="19"/>
+              </w:rPr>
+              <w:t xml:space="preserve">Avant</w:t>
+            </w:r>
+          </w:p>
+        </w:tc>
+        <w:tc>
+          <w:tcPr>
+            <w:tcW w:type="dxa" w:w="2838"/>
+            <w:tcBorders>
+              <w:top w:val="single" w:color="D6D9D2" w:sz="4"/>
+              <w:left w:val="single" w:color="D6D9D2" w:sz="4"/>
+              <w:bottom w:val="single" w:color="D6D9D2" w:sz="4"/>
+              <w:right w:val="single" w:color="D6D9D2" w:sz="4"/>
+            </w:tcBorders>
+            <w:shd w:fill="15181D" w:color="auto" w:val="clear"/>
+            <w:tcMar>
+              <w:top w:type="dxa" w:w="70"/>
+              <w:left w:type="dxa" w:w="110"/>
+              <w:bottom w:type="dxa" w:w="70"/>
+              <w:right w:type="dxa" w:w="110"/>
+            </w:tcMar>
+            <w:vAlign w:val="center"/>
+          </w:tcPr>
+          <w:p>
+            <w:pPr>
+              <w:spacing w:after="0"/>
+            </w:pPr>
+            <w:r>
+              <w:rPr>
+                <w:b/>
+                <w:bCs/>
+                <w:color w:val="FFFFFF"/>
+                <w:sz w:val="19"/>
+                <w:szCs w:val="19"/>
+              </w:rPr>
+              <w:t xml:space="preserve">Maintenant</w:t>
+            </w:r>
+          </w:p>
+        </w:tc>
+      </w:tr>
+      <w:tr>
+        <w:tc>
+          <w:tcPr>
+            <w:tcW w:type="dxa" w:w="4600"/>
+            <w:tcBorders>
+              <w:top w:val="single" w:color="D6D9D2" w:sz="4"/>
+              <w:left w:val="single" w:color="D6D9D2" w:sz="4"/>
+              <w:bottom w:val="single" w:color="D6D9D2" w:sz="4"/>
+              <w:right w:val="single" w:color="D6D9D2" w:sz="4"/>
+            </w:tcBorders>
+            <w:tcMar>
+              <w:top w:type="dxa" w:w="70"/>
+              <w:left w:type="dxa" w:w="110"/>
+              <w:bottom w:type="dxa" w:w="70"/>
+              <w:right w:type="dxa" w:w="110"/>
+            </w:tcMar>
+            <w:vAlign w:val="center"/>
+          </w:tcPr>
+          <w:p>
+            <w:pPr>
+              <w:spacing w:after="0"/>
+            </w:pPr>
+            <w:r>
+              <w:rPr>
+                <w:b w:val="false"/>
+                <w:bCs w:val="false"/>
+                <w:color w:val="15181D"/>
+                <w:sz w:val="19"/>
+                <w:szCs w:val="19"/>
+              </w:rPr>
+              <w:t xml:space="preserve">Étui rabats inversés 60 × 40 × 150</w:t>
+            </w:r>
+          </w:p>
+        </w:tc>
+        <w:tc>
+          <w:tcPr>
+            <w:tcW w:type="dxa" w:w="2200"/>
+            <w:tcBorders>
+              <w:top w:val="single" w:color="D6D9D2" w:sz="4"/>
+              <w:left w:val="single" w:color="D6D9D2" w:sz="4"/>
+              <w:bottom w:val="single" w:color="D6D9D2" w:sz="4"/>
+              <w:right w:val="single" w:color="D6D9D2" w:sz="4"/>
+            </w:tcBorders>
+            <w:tcMar>
+              <w:top w:type="dxa" w:w="70"/>
+              <w:left w:type="dxa" w:w="110"/>
+              <w:bottom w:type="dxa" w:w="70"/>
+              <w:right w:type="dxa" w:w="110"/>
+            </w:tcMar>
+            <w:vAlign w:val="center"/>
+          </w:tcPr>
+          <w:p>
+            <w:pPr>
+              <w:spacing w:after="0"/>
+            </w:pPr>
+            <w:r>
+              <w:rPr>
+                <w:b w:val="false"/>
+                <w:bCs w:val="false"/>
+                <w:color w:val="15181D"/>
+                <w:sz w:val="19"/>
+                <w:szCs w:val="19"/>
+              </w:rPr>
+              <w:t xml:space="preserve">9 poses</w:t>
+            </w:r>
+          </w:p>
+        </w:tc>
+        <w:tc>
+          <w:tcPr>
+            <w:tcW w:type="dxa" w:w="2838"/>
+            <w:tcBorders>
+              <w:top w:val="single" w:color="D6D9D2" w:sz="4"/>
+              <w:left w:val="single" w:color="D6D9D2" w:sz="4"/>
+              <w:bottom w:val="single" w:color="D6D9D2" w:sz="4"/>
+              <w:right w:val="single" w:color="D6D9D2" w:sz="4"/>
+            </w:tcBorders>
+            <w:tcMar>
+              <w:top w:type="dxa" w:w="70"/>
+              <w:left w:type="dxa" w:w="110"/>
+              <w:bottom w:type="dxa" w:w="70"/>
+              <w:right w:type="dxa" w:w="110"/>
+            </w:tcMar>
+            <w:vAlign w:val="center"/>
+          </w:tcPr>
+          <w:p>
+            <w:pPr>
+              <w:spacing w:after="0"/>
+            </w:pPr>
+            <w:r>
+              <w:rPr>
+                <w:b w:val="false"/>
+                <w:bCs w:val="false"/>
+                <w:color w:val="15181D"/>
+                <w:sz w:val="19"/>
+                <w:szCs w:val="19"/>
+              </w:rPr>
+              <w:t xml:space="preserve">12 poses</w:t>
+            </w:r>
+          </w:p>
+        </w:tc>
+      </w:tr>
+      <w:tr>
+        <w:tc>
+          <w:tcPr>
+            <w:tcW w:type="dxa" w:w="4600"/>
+            <w:tcBorders>
+              <w:top w:val="single" w:color="D6D9D2" w:sz="4"/>
+              <w:left w:val="single" w:color="D6D9D2" w:sz="4"/>
+              <w:bottom w:val="single" w:color="D6D9D2" w:sz="4"/>
+              <w:right w:val="single" w:color="D6D9D2" w:sz="4"/>
+            </w:tcBorders>
+            <w:tcMar>
+              <w:top w:type="dxa" w:w="70"/>
+              <w:left w:type="dxa" w:w="110"/>
+              <w:bottom w:type="dxa" w:w="70"/>
+              <w:right w:type="dxa" w:w="110"/>
+            </w:tcMar>
+            <w:vAlign w:val="center"/>
+          </w:tcPr>
+          <w:p>
+            <w:pPr>
+              <w:spacing w:after="0"/>
+            </w:pPr>
+            <w:r>
+              <w:rPr>
+                <w:b w:val="false"/>
+                <w:bCs w:val="false"/>
+                <w:color w:val="15181D"/>
+                <w:sz w:val="19"/>
+                <w:szCs w:val="19"/>
+              </w:rPr>
+              <w:t xml:space="preserve">Étui à suspente</w:t>
+            </w:r>
+          </w:p>
+        </w:tc>
+        <w:tc>
+          <w:tcPr>
+            <w:tcW w:type="dxa" w:w="2200"/>
+            <w:tcBorders>
+              <w:top w:val="single" w:color="D6D9D2" w:sz="4"/>
+              <w:left w:val="single" w:color="D6D9D2" w:sz="4"/>
+              <w:bottom w:val="single" w:color="D6D9D2" w:sz="4"/>
+              <w:right w:val="single" w:color="D6D9D2" w:sz="4"/>
+            </w:tcBorders>
+            <w:tcMar>
+              <w:top w:type="dxa" w:w="70"/>
+              <w:left w:type="dxa" w:w="110"/>
+              <w:bottom w:type="dxa" w:w="70"/>
+              <w:right w:type="dxa" w:w="110"/>
+            </w:tcMar>
+            <w:vAlign w:val="center"/>
+          </w:tcPr>
+          <w:p>
+            <w:pPr>
+              <w:spacing w:after="0"/>
+            </w:pPr>
+            <w:r>
+              <w:rPr>
+                <w:b w:val="false"/>
+                <w:bCs w:val="false"/>
+                <w:color w:val="15181D"/>
+                <w:sz w:val="19"/>
+                <w:szCs w:val="19"/>
+              </w:rPr>
+              <w:t xml:space="preserve">9 poses</w:t>
+            </w:r>
+          </w:p>
+        </w:tc>
+        <w:tc>
+          <w:tcPr>
+            <w:tcW w:type="dxa" w:w="2838"/>
+            <w:tcBorders>
+              <w:top w:val="single" w:color="D6D9D2" w:sz="4"/>
+              <w:left w:val="single" w:color="D6D9D2" w:sz="4"/>
+              <w:bottom w:val="single" w:color="D6D9D2" w:sz="4"/>
+              <w:right w:val="single" w:color="D6D9D2" w:sz="4"/>
+            </w:tcBorders>
+            <w:tcMar>
+              <w:top w:type="dxa" w:w="70"/>
+              <w:left w:type="dxa" w:w="110"/>
+              <w:bottom w:type="dxa" w:w="70"/>
+              <w:right w:type="dxa" w:w="110"/>
+            </w:tcMar>
+            <w:vAlign w:val="center"/>
+          </w:tcPr>
+          <w:p>
+            <w:pPr>
+              <w:spacing w:after="0"/>
+            </w:pPr>
+            <w:r>
+              <w:rPr>
+                <w:b w:val="false"/>
+                <w:bCs w:val="false"/>
+                <w:color w:val="15181D"/>
+                <w:sz w:val="19"/>
+                <w:szCs w:val="19"/>
+              </w:rPr>
+              <w:t xml:space="preserve">12 poses</w:t>
+            </w:r>
+          </w:p>
+        </w:tc>
+      </w:tr>
+      <w:tr>
+        <w:tc>
+          <w:tcPr>
+            <w:tcW w:type="dxa" w:w="4600"/>
+            <w:tcBorders>
+              <w:top w:val="single" w:color="D6D9D2" w:sz="4"/>
+              <w:left w:val="single" w:color="D6D9D2" w:sz="4"/>
+              <w:bottom w:val="single" w:color="D6D9D2" w:sz="4"/>
+              <w:right w:val="single" w:color="D6D9D2" w:sz="4"/>
+            </w:tcBorders>
+            <w:tcMar>
+              <w:top w:type="dxa" w:w="70"/>
+              <w:left w:type="dxa" w:w="110"/>
+              <w:bottom w:type="dxa" w:w="70"/>
+              <w:right w:type="dxa" w:w="110"/>
+            </w:tcMar>
+            <w:vAlign w:val="center"/>
+          </w:tcPr>
+          <w:p>
+            <w:pPr>
+              <w:spacing w:after="0"/>
+            </w:pPr>
+            <w:r>
+              <w:rPr>
+                <w:b w:val="false"/>
+                <w:bCs w:val="false"/>
+                <w:color w:val="15181D"/>
+                <w:sz w:val="19"/>
+                <w:szCs w:val="19"/>
+              </w:rPr>
+              <w:t xml:space="preserve">Boîte hexagonale</w:t>
+            </w:r>
+          </w:p>
+        </w:tc>
+        <w:tc>
+          <w:tcPr>
+            <w:tcW w:type="dxa" w:w="2200"/>
+            <w:tcBorders>
+              <w:top w:val="single" w:color="D6D9D2" w:sz="4"/>
+              <w:left w:val="single" w:color="D6D9D2" w:sz="4"/>
+              <w:bottom w:val="single" w:color="D6D9D2" w:sz="4"/>
+              <w:right w:val="single" w:color="D6D9D2" w:sz="4"/>
+            </w:tcBorders>
+            <w:tcMar>
+              <w:top w:type="dxa" w:w="70"/>
+              <w:left w:type="dxa" w:w="110"/>
+              <w:bottom w:type="dxa" w:w="70"/>
+              <w:right w:type="dxa" w:w="110"/>
+            </w:tcMar>
+            <w:vAlign w:val="center"/>
+          </w:tcPr>
+          <w:p>
+            <w:pPr>
+              <w:spacing w:after="0"/>
+            </w:pPr>
+            <w:r>
+              <w:rPr>
+                <w:b w:val="false"/>
+                <w:bCs w:val="false"/>
+                <w:color w:val="15181D"/>
+                <w:sz w:val="19"/>
+                <w:szCs w:val="19"/>
+              </w:rPr>
+              <w:t xml:space="preserve">6 poses</w:t>
+            </w:r>
+          </w:p>
+        </w:tc>
+        <w:tc>
+          <w:tcPr>
+            <w:tcW w:type="dxa" w:w="2838"/>
+            <w:tcBorders>
+              <w:top w:val="single" w:color="D6D9D2" w:sz="4"/>
+              <w:left w:val="single" w:color="D6D9D2" w:sz="4"/>
+              <w:bottom w:val="single" w:color="D6D9D2" w:sz="4"/>
+              <w:right w:val="single" w:color="D6D9D2" w:sz="4"/>
+            </w:tcBorders>
+            <w:tcMar>
+              <w:top w:type="dxa" w:w="70"/>
+              <w:left w:type="dxa" w:w="110"/>
+              <w:bottom w:type="dxa" w:w="70"/>
+              <w:right w:type="dxa" w:w="110"/>
+            </w:tcMar>
+            <w:vAlign w:val="center"/>
+          </w:tcPr>
+          <w:p>
+            <w:pPr>
+              <w:spacing w:after="0"/>
+            </w:pPr>
+            <w:r>
+              <w:rPr>
+                <w:b w:val="false"/>
+                <w:bCs w:val="false"/>
+                <w:color w:val="15181D"/>
+                <w:sz w:val="19"/>
+                <w:szCs w:val="19"/>
+              </w:rPr>
+              <w:t xml:space="preserve">8 poses</w:t>
+            </w:r>
+          </w:p>
+        </w:tc>
+      </w:tr>
+      <w:tr>
+        <w:tc>
+          <w:tcPr>
+            <w:tcW w:type="dxa" w:w="4600"/>
+            <w:tcBorders>
+              <w:top w:val="single" w:color="D6D9D2" w:sz="4"/>
+              <w:left w:val="single" w:color="D6D9D2" w:sz="4"/>
+              <w:bottom w:val="single" w:color="D6D9D2" w:sz="4"/>
+              <w:right w:val="single" w:color="D6D9D2" w:sz="4"/>
+            </w:tcBorders>
+            <w:tcMar>
+              <w:top w:type="dxa" w:w="70"/>
+              <w:left w:type="dxa" w:w="110"/>
+              <w:bottom w:type="dxa" w:w="70"/>
+              <w:right w:type="dxa" w:w="110"/>
+            </w:tcMar>
+            <w:vAlign w:val="center"/>
+          </w:tcPr>
+          <w:p>
+            <w:pPr>
+              <w:spacing w:after="0"/>
+            </w:pPr>
+            <w:r>
+              <w:rPr>
+                <w:b w:val="false"/>
+                <w:bCs w:val="false"/>
+                <w:color w:val="15181D"/>
+                <w:sz w:val="19"/>
+                <w:szCs w:val="19"/>
+              </w:rPr>
+              <w:t xml:space="preserve">Barquette</w:t>
+            </w:r>
+          </w:p>
+        </w:tc>
+        <w:tc>
+          <w:tcPr>
+            <w:tcW w:type="dxa" w:w="2200"/>
+            <w:tcBorders>
+              <w:top w:val="single" w:color="D6D9D2" w:sz="4"/>
+              <w:left w:val="single" w:color="D6D9D2" w:sz="4"/>
+              <w:bottom w:val="single" w:color="D6D9D2" w:sz="4"/>
+              <w:right w:val="single" w:color="D6D9D2" w:sz="4"/>
+            </w:tcBorders>
+            <w:tcMar>
+              <w:top w:type="dxa" w:w="70"/>
+              <w:left w:type="dxa" w:w="110"/>
+              <w:bottom w:type="dxa" w:w="70"/>
+              <w:right w:type="dxa" w:w="110"/>
+            </w:tcMar>
+            <w:vAlign w:val="center"/>
+          </w:tcPr>
+          <w:p>
+            <w:pPr>
+              <w:spacing w:after="0"/>
+            </w:pPr>
+            <w:r>
+              <w:rPr>
+                <w:b w:val="false"/>
+                <w:bCs w:val="false"/>
+                <w:color w:val="15181D"/>
+                <w:sz w:val="19"/>
+                <w:szCs w:val="19"/>
+              </w:rPr>
+              <w:t xml:space="preserve">6 poses</w:t>
+            </w:r>
+          </w:p>
+        </w:tc>
+        <w:tc>
+          <w:tcPr>
+            <w:tcW w:type="dxa" w:w="2838"/>
+            <w:tcBorders>
+              <w:top w:val="single" w:color="D6D9D2" w:sz="4"/>
+              <w:left w:val="single" w:color="D6D9D2" w:sz="4"/>
+              <w:bottom w:val="single" w:color="D6D9D2" w:sz="4"/>
+              <w:right w:val="single" w:color="D6D9D2" w:sz="4"/>
+            </w:tcBorders>
+            <w:tcMar>
+              <w:top w:type="dxa" w:w="70"/>
+              <w:left w:type="dxa" w:w="110"/>
+              <w:bottom w:type="dxa" w:w="70"/>
+              <w:right w:type="dxa" w:w="110"/>
+            </w:tcMar>
+            <w:vAlign w:val="center"/>
+          </w:tcPr>
+          <w:p>
+            <w:pPr>
+              <w:spacing w:after="0"/>
+            </w:pPr>
+            <w:r>
+              <w:rPr>
+                <w:b w:val="false"/>
+                <w:bCs w:val="false"/>
+                <w:color w:val="15181D"/>
+                <w:sz w:val="19"/>
+                <w:szCs w:val="19"/>
+              </w:rPr>
+              <w:t xml:space="preserve">8 poses</w:t>
+            </w:r>
+          </w:p>
+        </w:tc>
+      </w:tr>
+      <w:tr>
+        <w:tc>
+          <w:tcPr>
+            <w:tcW w:type="dxa" w:w="4600"/>
+            <w:tcBorders>
+              <w:top w:val="single" w:color="D6D9D2" w:sz="4"/>
+              <w:left w:val="single" w:color="D6D9D2" w:sz="4"/>
+              <w:bottom w:val="single" w:color="D6D9D2" w:sz="4"/>
+              <w:right w:val="single" w:color="D6D9D2" w:sz="4"/>
+            </w:tcBorders>
+            <w:tcMar>
+              <w:top w:type="dxa" w:w="70"/>
+              <w:left w:type="dxa" w:w="110"/>
+              <w:bottom w:type="dxa" w:w="70"/>
+              <w:right w:type="dxa" w:w="110"/>
+            </w:tcMar>
+            <w:vAlign w:val="center"/>
+          </w:tcPr>
+          <w:p>
+            <w:pPr>
+              <w:spacing w:after="0"/>
+            </w:pPr>
+            <w:r>
+              <w:rPr>
+                <w:b w:val="false"/>
+                <w:bCs w:val="false"/>
+                <w:color w:val="15181D"/>
+                <w:sz w:val="19"/>
+                <w:szCs w:val="19"/>
+              </w:rPr>
+              <w:t xml:space="preserve">Boîte à anse</w:t>
+            </w:r>
+          </w:p>
+        </w:tc>
+        <w:tc>
+          <w:tcPr>
+            <w:tcW w:type="dxa" w:w="2200"/>
+            <w:tcBorders>
+              <w:top w:val="single" w:color="D6D9D2" w:sz="4"/>
+              <w:left w:val="single" w:color="D6D9D2" w:sz="4"/>
+              <w:bottom w:val="single" w:color="D6D9D2" w:sz="4"/>
+              <w:right w:val="single" w:color="D6D9D2" w:sz="4"/>
+            </w:tcBorders>
+            <w:tcMar>
+              <w:top w:type="dxa" w:w="70"/>
+              <w:left w:type="dxa" w:w="110"/>
+              <w:bottom w:type="dxa" w:w="70"/>
+              <w:right w:type="dxa" w:w="110"/>
+            </w:tcMar>
+            <w:vAlign w:val="center"/>
+          </w:tcPr>
+          <w:p>
+            <w:pPr>
+              <w:spacing w:after="0"/>
+            </w:pPr>
+            <w:r>
+              <w:rPr>
+                <w:b w:val="false"/>
+                <w:bCs w:val="false"/>
+                <w:color w:val="15181D"/>
+                <w:sz w:val="19"/>
+                <w:szCs w:val="19"/>
+              </w:rPr>
+              <w:t xml:space="preserve">2 poses</w:t>
+            </w:r>
+          </w:p>
+        </w:tc>
+        <w:tc>
+          <w:tcPr>
+            <w:tcW w:type="dxa" w:w="2838"/>
+            <w:tcBorders>
+              <w:top w:val="single" w:color="D6D9D2" w:sz="4"/>
+              <w:left w:val="single" w:color="D6D9D2" w:sz="4"/>
+              <w:bottom w:val="single" w:color="D6D9D2" w:sz="4"/>
+              <w:right w:val="single" w:color="D6D9D2" w:sz="4"/>
+            </w:tcBorders>
+            <w:tcMar>
+              <w:top w:type="dxa" w:w="70"/>
+              <w:left w:type="dxa" w:w="110"/>
+              <w:bottom w:type="dxa" w:w="70"/>
+              <w:right w:type="dxa" w:w="110"/>
+            </w:tcMar>
+            <w:vAlign w:val="center"/>
+          </w:tcPr>
+          <w:p>
+            <w:pPr>
+              <w:spacing w:after="0"/>
+            </w:pPr>
+            <w:r>
+              <w:rPr>
+                <w:b w:val="false"/>
+                <w:bCs w:val="false"/>
+                <w:color w:val="15181D"/>
+                <w:sz w:val="19"/>
+                <w:szCs w:val="19"/>
+              </w:rPr>
+              <w:t xml:space="preserve">3 poses (tête-bêche)</w:t>
+            </w:r>
+          </w:p>
+        </w:tc>
+      </w:tr>
+      <w:tr>
+        <w:tc>
+          <w:tcPr>
+            <w:tcW w:type="dxa" w:w="4600"/>
+            <w:tcBorders>
+              <w:top w:val="single" w:color="D6D9D2" w:sz="4"/>
+              <w:left w:val="single" w:color="D6D9D2" w:sz="4"/>
+              <w:bottom w:val="single" w:color="D6D9D2" w:sz="4"/>
+              <w:right w:val="single" w:color="D6D9D2" w:sz="4"/>
+            </w:tcBorders>
+            <w:tcMar>
+              <w:top w:type="dxa" w:w="70"/>
+              <w:left w:type="dxa" w:w="110"/>
+              <w:bottom w:type="dxa" w:w="70"/>
+              <w:right w:type="dxa" w:w="110"/>
+            </w:tcMar>
+            <w:vAlign w:val="center"/>
+          </w:tcPr>
+          <w:p>
+            <w:pPr>
+              <w:spacing w:after="0"/>
+            </w:pPr>
+            <w:r>
+              <w:rPr>
+                <w:b w:val="false"/>
+                <w:bCs w:val="false"/>
+                <w:color w:val="15181D"/>
+                <w:sz w:val="19"/>
+                <w:szCs w:val="19"/>
+              </w:rPr>
+              <w:t xml:space="preserve">Gobelet</w:t>
+            </w:r>
+          </w:p>
+        </w:tc>
+        <w:tc>
+          <w:tcPr>
+            <w:tcW w:type="dxa" w:w="2200"/>
+            <w:tcBorders>
+              <w:top w:val="single" w:color="D6D9D2" w:sz="4"/>
+              <w:left w:val="single" w:color="D6D9D2" w:sz="4"/>
+              <w:bottom w:val="single" w:color="D6D9D2" w:sz="4"/>
+              <w:right w:val="single" w:color="D6D9D2" w:sz="4"/>
+            </w:tcBorders>
+            <w:tcMar>
+              <w:top w:type="dxa" w:w="70"/>
+              <w:left w:type="dxa" w:w="110"/>
+              <w:bottom w:type="dxa" w:w="70"/>
+              <w:right w:type="dxa" w:w="110"/>
+            </w:tcMar>
+            <w:vAlign w:val="center"/>
+          </w:tcPr>
+          <w:p>
+            <w:pPr>
+              <w:spacing w:after="0"/>
+            </w:pPr>
+            <w:r>
+              <w:rPr>
+                <w:b w:val="false"/>
+                <w:bCs w:val="false"/>
+                <w:color w:val="15181D"/>
+                <w:sz w:val="19"/>
+                <w:szCs w:val="19"/>
+              </w:rPr>
+              <w:t xml:space="preserve">16 poses</w:t>
+            </w:r>
+          </w:p>
+        </w:tc>
+        <w:tc>
+          <w:tcPr>
+            <w:tcW w:type="dxa" w:w="2838"/>
+            <w:tcBorders>
+              <w:top w:val="single" w:color="D6D9D2" w:sz="4"/>
+              <w:left w:val="single" w:color="D6D9D2" w:sz="4"/>
+              <w:bottom w:val="single" w:color="D6D9D2" w:sz="4"/>
+              <w:right w:val="single" w:color="D6D9D2" w:sz="4"/>
+            </w:tcBorders>
+            <w:tcMar>
+              <w:top w:type="dxa" w:w="70"/>
+              <w:left w:type="dxa" w:w="110"/>
+              <w:bottom w:type="dxa" w:w="70"/>
+              <w:right w:type="dxa" w:w="110"/>
+            </w:tcMar>
+            <w:vAlign w:val="center"/>
+          </w:tcPr>
+          <w:p>
+            <w:pPr>
+              <w:spacing w:after="0"/>
+            </w:pPr>
+            <w:r>
+              <w:rPr>
+                <w:b w:val="false"/>
+                <w:bCs w:val="false"/>
+                <w:color w:val="15181D"/>
+                <w:sz w:val="19"/>
+                <w:szCs w:val="19"/>
+              </w:rPr>
+              <w:t xml:space="preserve">20 poses (tête-bêche)</w:t>
+            </w:r>
+          </w:p>
+        </w:tc>
+      </w:tr>
+    </w:tbl>
+    <w:p>
+      <w:pPr>
+        <w:spacing w:after="100"/>
+      </w:pPr>
+    </w:p>
+    <w:p>
+      <w:pPr>
+        <w:keepNext/>
+        <w:spacing w:after="60" w:before="120"/>
+        <w:jc w:val="center"/>
+      </w:pPr>
+      <w:r>
+        <w:drawing>
+          <wp:inline distT="0" distB="0" distL="0" distR="0">
+            <wp:extent cx="5905500" cy="4181475"/>
+            <wp:effectExtent t="0" r="0" b="0" l="0"/>
+            <wp:docPr id="1" name="23-montage.jpg" descr="23-montage.jpg" title="23-montage.jpg"/>
+            <wp:cNvGraphicFramePr>
+              <a:graphicFrameLocks xmlns:a="http://schemas.openxmlformats.org/drawingml/2006/main" noChangeAspect="1"/>
+            </wp:cNvGraphicFramePr>
+            <a:graphic xmlns:a="http://schemas.openxmlformats.org/drawingml/2006/main">
+              <a:graphicData uri="http://schemas.openxmlformats.org/drawingml/2006/picture">
+                <pic:pic xmlns:pic="http://schemas.openxmlformats.org/drawingml/2006/picture">
+                  <pic:nvPicPr>
+                    <pic:cNvPr id="0" name="" descr=""/>
+                    <pic:cNvPicPr>
+                      <a:picLocks noChangeAspect="1" noChangeArrowheads="1"/>
+                    </pic:cNvPicPr>
+                  </pic:nvPicPr>
+                  <pic:blipFill>
+                    <a:blip r:embed="rId34" cstate="none"/>
+                    <a:srcRect/>
+                    <a:stretch>
+                      <a:fillRect/>
+                    </a:stretch>
+                  </pic:blipFill>
+                  <pic:spPr bwMode="auto">
+                    <a:xfrm>
+                      <a:off x="0" y="0"/>
+                      <a:ext cx="5905500" cy="4181475"/>
+                    </a:xfrm>
+                    <a:prstGeom prst="rect">
+                      <a:avLst/>
+                    </a:prstGeom>
+                  </pic:spPr>
+                </pic:pic>
+              </a:graphicData>
+            </a:graphic>
+          </wp:inline>
+        </w:drawing>
+      </w:r>
+    </w:p>
+    <w:p>
+      <w:pPr>
+        <w:pStyle w:val="Caption"/>
+        <w:jc w:val="center"/>
+      </w:pPr>
+      <w:r>
+        <w:rPr>
+          <w:b/>
+          <w:bCs/>
+        </w:rPr>
+        <w:t xml:space="preserve">Figure 11 — </w:t>
+      </w:r>
+      <w:r>
+        <w:t xml:space="preserve">Montage sur la feuille : poses, attaches (points verts), prise de pince, sens des fibres</w:t>
+      </w:r>
+    </w:p>
+    <w:p>
+      <w:pPr>
+        <w:pStyle w:val="Heading2"/>
+      </w:pPr>
+      <w:r>
+        <w:t xml:space="preserve">7.2 Attaches, éjection et traits spéciaux</w:t>
+      </w:r>
+    </w:p>
+    <w:p>
+      <w:pPr>
+        <w:pStyle w:val="ListParagraph"/>
+        <w:numPr>
+          <w:ilvl w:val="0"/>
+          <w:numId w:val="5"/>
+        </w:numPr>
+        <w:spacing w:after="60"/>
+      </w:pPr>
+      <w:r>
+        <w:rPr>
+          <w:b/>
+          <w:bCs/>
+        </w:rPr>
+        <w:t xml:space="preserve">Attaches (ponts)</w:t>
+      </w:r>
+      <w:r>
+        <w:t xml:space="preserve"> : de 0 à 8 par pose, de 0,3 à 1 mm, placées sur les plus longs bords extérieurs.</w:t>
+      </w:r>
+    </w:p>
+    <w:p>
+      <w:pPr>
+        <w:pStyle w:val="ListParagraph"/>
+        <w:numPr>
+          <w:ilvl w:val="0"/>
+          <w:numId w:val="5"/>
+        </w:numPr>
+        <w:spacing w:after="60"/>
+      </w:pPr>
+      <w:r>
+        <w:rPr>
+          <w:b/>
+          <w:bCs/>
+        </w:rPr>
+        <w:t xml:space="preserve">Filets d'éjection</w:t>
+      </w:r>
+      <w:r>
+        <w:t xml:space="preserve"> : proposés entre les colonnes et rangées de poses, sur un calque séparé, à valider par le formiste.</w:t>
+      </w:r>
+    </w:p>
+    <w:p>
+      <w:pPr>
+        <w:pStyle w:val="ListParagraph"/>
+        <w:numPr>
+          <w:ilvl w:val="0"/>
+          <w:numId w:val="5"/>
+        </w:numPr>
+        <w:spacing w:after="60"/>
+      </w:pPr>
+      <w:r>
+        <w:rPr>
+          <w:b/>
+          <w:bCs/>
+        </w:rPr>
+        <w:t xml:space="preserve">Type de chaque pli</w:t>
+      </w:r>
+      <w:r>
+        <w:t xml:space="preserve"> : rainage, contre-rainage (pli inversé), coupe-rainage ou perforation. Le pli survolé dans la liste s'éclaire sur le plan.</w:t>
+      </w:r>
+    </w:p>
+    <w:p>
+      <w:pPr>
+        <w:pStyle w:val="ListParagraph"/>
+        <w:numPr>
+          <w:ilvl w:val="0"/>
+          <w:numId w:val="5"/>
+        </w:numPr>
+        <w:spacing w:after="60"/>
+      </w:pPr>
+      <w:r>
+        <w:rPr>
+          <w:b/>
+          <w:bCs/>
+        </w:rPr>
+        <w:t xml:space="preserve">Bande d'ouverture facile</w:t>
+      </w:r>
+      <w:r>
+        <w:t xml:space="preserve"> : deux filets « zipper » autour du corps de la boîte, hauteur et largeur réglables.</w:t>
+      </w:r>
+    </w:p>
+    <w:p>
+      <w:pPr>
+        <w:pStyle w:val="Heading2"/>
+      </w:pPr>
+      <w:r>
+        <w:t xml:space="preserve">7.3 Le dossier formiste</w:t>
+      </w:r>
+    </w:p>
+    <w:p>
+      <w:pPr>
+        <w:spacing w:after="120"/>
+      </w:pPr>
+      <w:r>
+        <w:t xml:space="preserve">Exporter › </w:t>
+      </w:r>
+      <w:r>
+        <w:rPr>
+          <w:b/>
+          <w:bCs/>
+        </w:rPr>
+        <w:t xml:space="preserve">Dossier formiste</w:t>
+      </w:r>
+      <w:r>
+        <w:t xml:space="preserve"> produit un ZIP : forme 1 pose et montage feuille en DXF R12 (millimètres, échelle 1:1, origine en bas à gauche) et en PDF, plus une notice. Un calque par type de trait (COUPE, RAINAGE, CONTRE_RAINAGE, COUPE_RAINAGE, PERFORATION, ZIPPER, BRAILLE, INFOS), courbes en vrais arcs, aucun double trait. La notice donne les longueurs de filet, des filets conseillés et le résultat du contrôle du tracé.</w:t>
+      </w:r>
+    </w:p>
+    <w:tbl>
+      <w:tblPr>
+        <w:tblW w:type="dxa" w:w="9638"/>
+        <w:tblBorders>
+          <w:top w:val="single" w:color="auto" w:sz="4"/>
+          <w:left w:val="single" w:color="auto" w:sz="4"/>
+          <w:bottom w:val="single" w:color="auto" w:sz="4"/>
+          <w:right w:val="single" w:color="auto" w:sz="4"/>
+          <w:insideH w:val="single" w:color="auto" w:sz="4"/>
+          <w:insideV w:val="single" w:color="auto" w:sz="4"/>
+        </w:tblBorders>
+      </w:tblPr>
+      <w:tblGrid>
+        <w:gridCol w:w="9638"/>
+      </w:tblGrid>
+      <w:tr>
+        <w:tc>
+          <w:tcPr>
+            <w:tcW w:type="dxa" w:w="9638"/>
+            <w:tcBorders>
+              <w:top w:val="none" w:color="FFFFFF" w:sz="0"/>
+              <w:left w:val="single" w:color="B80F5A" w:sz="24"/>
+              <w:bottom w:val="none" w:color="FFFFFF" w:sz="0"/>
+              <w:right w:val="none" w:color="FFFFFF" w:sz="0"/>
+            </w:tcBorders>
+            <w:shd w:fill="F7E7EF" w:color="auto" w:val="clear"/>
+            <w:tcMar>
+              <w:top w:type="dxa" w:w="120"/>
+              <w:left w:type="dxa" w:w="200"/>
+              <w:bottom w:type="dxa" w:w="120"/>
+              <w:right w:type="dxa" w:w="200"/>
+            </w:tcMar>
+          </w:tcPr>
+          <w:p>
+            <w:pPr>
+              <w:spacing w:after="60"/>
+            </w:pPr>
+            <w:r>
+              <w:rPr>
+                <w:b/>
+                <w:bCs/>
+                <w:color w:val="B80F5A"/>
+              </w:rPr>
+              <w:t xml:space="preserve">À valider</w:t>
+            </w:r>
+          </w:p>
+          <w:p>
+            <w:r>
+              <w:t xml:space="preserve">Les attaches, les filets d'éjection et les caractéristiques des filets sont des propositions : faites-les valider par votre formiste, puis validez la forme sur maquette blanche avant la première production.</w:t>
+            </w:r>
+          </w:p>
+        </w:tc>
+      </w:tr>
+    </w:tbl>
+    <w:p>
+      <w:pPr>
+        <w:spacing w:after="80"/>
+      </w:pPr>
+    </w:p>
+    <w:p>
+      <w:pPr>
+        <w:pStyle w:val="Heading1"/>
+        <w:pageBreakBefore/>
+      </w:pPr>
+      <w:r>
+        <w:t xml:space="preserve">8. Codes-barres, braille et mentions</w:t>
+      </w:r>
+    </w:p>
+    <w:p>
+      <w:pPr>
+        <w:spacing w:after="120"/>
+      </w:pPr>
+      <w:r>
+        <w:t xml:space="preserve">Le menu </w:t>
+      </w:r>
+      <w:r>
+        <w:rPr>
+          <w:b/>
+          <w:bCs/>
+        </w:rPr>
+        <w:t xml:space="preserve">+ Code, braille, picto…</w:t>
+      </w:r>
+      <w:r>
+        <w:t xml:space="preserve"> (onglet Éléments) ajoute les éléments réglementaires. Chaque élément se place sur une zone libre de la face, puis se déplace à la souris.</w:t>
+      </w:r>
+    </w:p>
+    <w:p>
+      <w:pPr>
+        <w:keepNext/>
+        <w:spacing w:after="60" w:before="120"/>
+        <w:jc w:val="center"/>
+      </w:pPr>
+      <w:r>
+        <w:drawing>
+          <wp:inline distT="0" distB="0" distL="0" distR="0">
+            <wp:extent cx="5905500" cy="3933825"/>
+            <wp:effectExtent t="0" r="0" b="0" l="0"/>
+            <wp:docPr id="1" name="24-reglementaire.jpg" descr="24-reglementaire.jpg" title="24-reglementaire.jpg"/>
+            <wp:cNvGraphicFramePr>
+              <a:graphicFrameLocks xmlns:a="http://schemas.openxmlformats.org/drawingml/2006/main" noChangeAspect="1"/>
+            </wp:cNvGraphicFramePr>
+            <a:graphic xmlns:a="http://schemas.openxmlformats.org/drawingml/2006/main">
+              <a:graphicData uri="http://schemas.openxmlformats.org/drawingml/2006/picture">
+                <pic:pic xmlns:pic="http://schemas.openxmlformats.org/drawingml/2006/picture">
+                  <pic:nvPicPr>
+                    <pic:cNvPr id="0" name="" descr=""/>
+                    <pic:cNvPicPr>
+                      <a:picLocks noChangeAspect="1" noChangeArrowheads="1"/>
+                    </pic:cNvPicPr>
+                  </pic:nvPicPr>
+                  <pic:blipFill>
+                    <a:blip r:embed="rId35" cstate="none"/>
+                    <a:srcRect/>
+                    <a:stretch>
+                      <a:fillRect/>
+                    </a:stretch>
+                  </pic:blipFill>
+                  <pic:spPr bwMode="auto">
+                    <a:xfrm>
+                      <a:off x="0" y="0"/>
+                      <a:ext cx="5905500" cy="3933825"/>
+                    </a:xfrm>
+                    <a:prstGeom prst="rect">
+                      <a:avLst/>
+                    </a:prstGeom>
+                  </pic:spPr>
+                </pic:pic>
+              </a:graphicData>
+            </a:graphic>
+          </wp:inline>
+        </w:drawing>
+      </w:r>
+    </w:p>
+    <w:p>
+      <w:pPr>
+        <w:pStyle w:val="Caption"/>
+        <w:jc w:val="center"/>
+      </w:pPr>
+      <w:r>
+        <w:rPr>
+          <w:b/>
+          <w:bCs/>
+        </w:rPr>
+        <w:t xml:space="preserve">Figure 12 — </w:t>
+      </w:r>
+      <w:r>
+        <w:t xml:space="preserve">Code EAN-13, braille « néroli », pictogrammes et zone de marquage sur un étui</w:t>
+      </w:r>
+    </w:p>
+    <w:tbl>
+      <w:tblPr>
+        <w:tblW w:type="dxa" w:w="9638"/>
+        <w:tblBorders>
+          <w:top w:val="single" w:color="auto" w:sz="4"/>
+          <w:left w:val="single" w:color="auto" w:sz="4"/>
+          <w:bottom w:val="single" w:color="auto" w:sz="4"/>
+          <w:right w:val="single" w:color="auto" w:sz="4"/>
+          <w:insideH w:val="single" w:color="auto" w:sz="4"/>
+          <w:insideV w:val="single" w:color="auto" w:sz="4"/>
+        </w:tblBorders>
+      </w:tblPr>
+      <w:tblGrid>
+        <w:gridCol w:w="1900"/>
+        <w:gridCol w:w="4400"/>
+        <w:gridCol w:w="3338"/>
+      </w:tblGrid>
+      <w:tr>
+        <w:trPr>
+          <w:tblHeader/>
+        </w:trPr>
+        <w:tc>
+          <w:tcPr>
+            <w:tcW w:type="dxa" w:w="1900"/>
+            <w:tcBorders>
+              <w:top w:val="single" w:color="D6D9D2" w:sz="4"/>
+              <w:left w:val="single" w:color="D6D9D2" w:sz="4"/>
+              <w:bottom w:val="single" w:color="D6D9D2" w:sz="4"/>
+              <w:right w:val="single" w:color="D6D9D2" w:sz="4"/>
+            </w:tcBorders>
+            <w:shd w:fill="15181D" w:color="auto" w:val="clear"/>
+            <w:tcMar>
+              <w:top w:type="dxa" w:w="70"/>
+              <w:left w:type="dxa" w:w="110"/>
+              <w:bottom w:type="dxa" w:w="70"/>
+              <w:right w:type="dxa" w:w="110"/>
+            </w:tcMar>
+            <w:vAlign w:val="center"/>
+          </w:tcPr>
+          <w:p>
+            <w:pPr>
+              <w:spacing w:after="0"/>
+            </w:pPr>
+            <w:r>
+              <w:rPr>
+                <w:b/>
+                <w:bCs/>
+                <w:color w:val="FFFFFF"/>
+                <w:sz w:val="19"/>
+                <w:szCs w:val="19"/>
+              </w:rPr>
+              <w:t xml:space="preserve">Élément</w:t>
+            </w:r>
+          </w:p>
+        </w:tc>
+        <w:tc>
+          <w:tcPr>
+            <w:tcW w:type="dxa" w:w="4400"/>
+            <w:tcBorders>
+              <w:top w:val="single" w:color="D6D9D2" w:sz="4"/>
+              <w:left w:val="single" w:color="D6D9D2" w:sz="4"/>
+              <w:bottom w:val="single" w:color="D6D9D2" w:sz="4"/>
+              <w:right w:val="single" w:color="D6D9D2" w:sz="4"/>
+            </w:tcBorders>
+            <w:shd w:fill="15181D" w:color="auto" w:val="clear"/>
+            <w:tcMar>
+              <w:top w:type="dxa" w:w="70"/>
+              <w:left w:type="dxa" w:w="110"/>
+              <w:bottom w:type="dxa" w:w="70"/>
+              <w:right w:type="dxa" w:w="110"/>
+            </w:tcMar>
+            <w:vAlign w:val="center"/>
+          </w:tcPr>
+          <w:p>
+            <w:pPr>
+              <w:spacing w:after="0"/>
+            </w:pPr>
+            <w:r>
+              <w:rPr>
+                <w:b/>
+                <w:bCs/>
+                <w:color w:val="FFFFFF"/>
+                <w:sz w:val="19"/>
+                <w:szCs w:val="19"/>
+              </w:rPr>
+              <w:t xml:space="preserve">Détail</w:t>
+            </w:r>
+          </w:p>
+        </w:tc>
+        <w:tc>
+          <w:tcPr>
+            <w:tcW w:type="dxa" w:w="3338"/>
+            <w:tcBorders>
+              <w:top w:val="single" w:color="D6D9D2" w:sz="4"/>
+              <w:left w:val="single" w:color="D6D9D2" w:sz="4"/>
+              <w:bottom w:val="single" w:color="D6D9D2" w:sz="4"/>
+              <w:right w:val="single" w:color="D6D9D2" w:sz="4"/>
+            </w:tcBorders>
+            <w:shd w:fill="15181D" w:color="auto" w:val="clear"/>
+            <w:tcMar>
+              <w:top w:type="dxa" w:w="70"/>
+              <w:left w:type="dxa" w:w="110"/>
+              <w:bottom w:type="dxa" w:w="70"/>
+              <w:right w:type="dxa" w:w="110"/>
+            </w:tcMar>
+            <w:vAlign w:val="center"/>
+          </w:tcPr>
+          <w:p>
+            <w:pPr>
+              <w:spacing w:after="0"/>
+            </w:pPr>
+            <w:r>
+              <w:rPr>
+                <w:b/>
+                <w:bCs/>
+                <w:color w:val="FFFFFF"/>
+                <w:sz w:val="19"/>
+                <w:szCs w:val="19"/>
+              </w:rPr>
+              <w:t xml:space="preserve">Contrôles</w:t>
+            </w:r>
+          </w:p>
+        </w:tc>
+      </w:tr>
+      <w:tr>
+        <w:tc>
+          <w:tcPr>
+            <w:tcW w:type="dxa" w:w="1900"/>
+            <w:tcBorders>
+              <w:top w:val="single" w:color="D6D9D2" w:sz="4"/>
+              <w:left w:val="single" w:color="D6D9D2" w:sz="4"/>
+              <w:bottom w:val="single" w:color="D6D9D2" w:sz="4"/>
+              <w:right w:val="single" w:color="D6D9D2" w:sz="4"/>
+            </w:tcBorders>
+            <w:tcMar>
+              <w:top w:type="dxa" w:w="70"/>
+              <w:left w:type="dxa" w:w="110"/>
+              <w:bottom w:type="dxa" w:w="70"/>
+              <w:right w:type="dxa" w:w="110"/>
+            </w:tcMar>
+            <w:vAlign w:val="center"/>
+          </w:tcPr>
+          <w:p>
+            <w:pPr>
+              <w:spacing w:after="0"/>
+            </w:pPr>
+            <w:r>
+              <w:rPr>
+                <w:b w:val="false"/>
+                <w:bCs w:val="false"/>
+                <w:color w:val="15181D"/>
+                <w:sz w:val="19"/>
+                <w:szCs w:val="19"/>
+              </w:rPr>
+              <w:t xml:space="preserve">Code EAN-13</w:t>
+            </w:r>
+          </w:p>
+        </w:tc>
+        <w:tc>
+          <w:tcPr>
+            <w:tcW w:type="dxa" w:w="4400"/>
+            <w:tcBorders>
+              <w:top w:val="single" w:color="D6D9D2" w:sz="4"/>
+              <w:left w:val="single" w:color="D6D9D2" w:sz="4"/>
+              <w:bottom w:val="single" w:color="D6D9D2" w:sz="4"/>
+              <w:right w:val="single" w:color="D6D9D2" w:sz="4"/>
+            </w:tcBorders>
+            <w:tcMar>
+              <w:top w:type="dxa" w:w="70"/>
+              <w:left w:type="dxa" w:w="110"/>
+              <w:bottom w:type="dxa" w:w="70"/>
+              <w:right w:type="dxa" w:w="110"/>
+            </w:tcMar>
+            <w:vAlign w:val="center"/>
+          </w:tcPr>
+          <w:p>
+            <w:pPr>
+              <w:spacing w:after="0"/>
+            </w:pPr>
+            <w:r>
+              <w:rPr>
+                <w:b w:val="false"/>
+                <w:bCs w:val="false"/>
+                <w:color w:val="15181D"/>
+                <w:sz w:val="19"/>
+                <w:szCs w:val="19"/>
+              </w:rPr>
+              <w:t xml:space="preserve">Vente au détail ; grossissement de 80 à 200 %</w:t>
+            </w:r>
+          </w:p>
+        </w:tc>
+        <w:tc>
+          <w:tcPr>
+            <w:tcW w:type="dxa" w:w="3338"/>
+            <w:tcBorders>
+              <w:top w:val="single" w:color="D6D9D2" w:sz="4"/>
+              <w:left w:val="single" w:color="D6D9D2" w:sz="4"/>
+              <w:bottom w:val="single" w:color="D6D9D2" w:sz="4"/>
+              <w:right w:val="single" w:color="D6D9D2" w:sz="4"/>
+            </w:tcBorders>
+            <w:tcMar>
+              <w:top w:type="dxa" w:w="70"/>
+              <w:left w:type="dxa" w:w="110"/>
+              <w:bottom w:type="dxa" w:w="70"/>
+              <w:right w:type="dxa" w:w="110"/>
+            </w:tcMar>
+            <w:vAlign w:val="center"/>
+          </w:tcPr>
+          <w:p>
+            <w:pPr>
+              <w:spacing w:after="0"/>
+            </w:pPr>
+            <w:r>
+              <w:rPr>
+                <w:b w:val="false"/>
+                <w:bCs w:val="false"/>
+                <w:color w:val="15181D"/>
+                <w:sz w:val="19"/>
+                <w:szCs w:val="19"/>
+              </w:rPr>
+              <w:t xml:space="preserve">Clé de contrôle, taille, pli</w:t>
+            </w:r>
+          </w:p>
+        </w:tc>
+      </w:tr>
+      <w:tr>
+        <w:tc>
+          <w:tcPr>
+            <w:tcW w:type="dxa" w:w="1900"/>
+            <w:tcBorders>
+              <w:top w:val="single" w:color="D6D9D2" w:sz="4"/>
+              <w:left w:val="single" w:color="D6D9D2" w:sz="4"/>
+              <w:bottom w:val="single" w:color="D6D9D2" w:sz="4"/>
+              <w:right w:val="single" w:color="D6D9D2" w:sz="4"/>
+            </w:tcBorders>
+            <w:tcMar>
+              <w:top w:type="dxa" w:w="70"/>
+              <w:left w:type="dxa" w:w="110"/>
+              <w:bottom w:type="dxa" w:w="70"/>
+              <w:right w:type="dxa" w:w="110"/>
+            </w:tcMar>
+            <w:vAlign w:val="center"/>
+          </w:tcPr>
+          <w:p>
+            <w:pPr>
+              <w:spacing w:after="0"/>
+            </w:pPr>
+            <w:r>
+              <w:rPr>
+                <w:b w:val="false"/>
+                <w:bCs w:val="false"/>
+                <w:color w:val="15181D"/>
+                <w:sz w:val="19"/>
+                <w:szCs w:val="19"/>
+              </w:rPr>
+              <w:t xml:space="preserve">Code GS1-128</w:t>
+            </w:r>
+          </w:p>
+        </w:tc>
+        <w:tc>
+          <w:tcPr>
+            <w:tcW w:type="dxa" w:w="4400"/>
+            <w:tcBorders>
+              <w:top w:val="single" w:color="D6D9D2" w:sz="4"/>
+              <w:left w:val="single" w:color="D6D9D2" w:sz="4"/>
+              <w:bottom w:val="single" w:color="D6D9D2" w:sz="4"/>
+              <w:right w:val="single" w:color="D6D9D2" w:sz="4"/>
+            </w:tcBorders>
+            <w:tcMar>
+              <w:top w:type="dxa" w:w="70"/>
+              <w:left w:type="dxa" w:w="110"/>
+              <w:bottom w:type="dxa" w:w="70"/>
+              <w:right w:type="dxa" w:w="110"/>
+            </w:tcMar>
+            <w:vAlign w:val="center"/>
+          </w:tcPr>
+          <w:p>
+            <w:pPr>
+              <w:spacing w:after="0"/>
+            </w:pPr>
+            <w:r>
+              <w:rPr>
+                <w:b w:val="false"/>
+                <w:bCs w:val="false"/>
+                <w:color w:val="15181D"/>
+                <w:sz w:val="19"/>
+                <w:szCs w:val="19"/>
+              </w:rPr>
+              <w:t xml:space="preserve">Lot, date, GTIN, logistique : (01)…(17)…(10)…</w:t>
+            </w:r>
+          </w:p>
+        </w:tc>
+        <w:tc>
+          <w:tcPr>
+            <w:tcW w:type="dxa" w:w="3338"/>
+            <w:tcBorders>
+              <w:top w:val="single" w:color="D6D9D2" w:sz="4"/>
+              <w:left w:val="single" w:color="D6D9D2" w:sz="4"/>
+              <w:bottom w:val="single" w:color="D6D9D2" w:sz="4"/>
+              <w:right w:val="single" w:color="D6D9D2" w:sz="4"/>
+            </w:tcBorders>
+            <w:tcMar>
+              <w:top w:type="dxa" w:w="70"/>
+              <w:left w:type="dxa" w:w="110"/>
+              <w:bottom w:type="dxa" w:w="70"/>
+              <w:right w:type="dxa" w:w="110"/>
+            </w:tcMar>
+            <w:vAlign w:val="center"/>
+          </w:tcPr>
+          <w:p>
+            <w:pPr>
+              <w:spacing w:after="0"/>
+            </w:pPr>
+            <w:r>
+              <w:rPr>
+                <w:b w:val="false"/>
+                <w:bCs w:val="false"/>
+                <w:color w:val="15181D"/>
+                <w:sz w:val="19"/>
+                <w:szCs w:val="19"/>
+              </w:rPr>
+              <w:t xml:space="preserve">Format des AI, module ≥ 0,25 mm (0,495 mm en logistique), 165 mm et 48 caractères maximum</w:t>
+            </w:r>
+          </w:p>
+        </w:tc>
+      </w:tr>
+      <w:tr>
+        <w:tc>
+          <w:tcPr>
+            <w:tcW w:type="dxa" w:w="1900"/>
+            <w:tcBorders>
+              <w:top w:val="single" w:color="D6D9D2" w:sz="4"/>
+              <w:left w:val="single" w:color="D6D9D2" w:sz="4"/>
+              <w:bottom w:val="single" w:color="D6D9D2" w:sz="4"/>
+              <w:right w:val="single" w:color="D6D9D2" w:sz="4"/>
+            </w:tcBorders>
+            <w:tcMar>
+              <w:top w:type="dxa" w:w="70"/>
+              <w:left w:type="dxa" w:w="110"/>
+              <w:bottom w:type="dxa" w:w="70"/>
+              <w:right w:type="dxa" w:w="110"/>
+            </w:tcMar>
+            <w:vAlign w:val="center"/>
+          </w:tcPr>
+          <w:p>
+            <w:pPr>
+              <w:spacing w:after="0"/>
+            </w:pPr>
+            <w:r>
+              <w:rPr>
+                <w:b w:val="false"/>
+                <w:bCs w:val="false"/>
+                <w:color w:val="15181D"/>
+                <w:sz w:val="19"/>
+                <w:szCs w:val="19"/>
+              </w:rPr>
+              <w:t xml:space="preserve">Braille</w:t>
+            </w:r>
+          </w:p>
+        </w:tc>
+        <w:tc>
+          <w:tcPr>
+            <w:tcW w:type="dxa" w:w="4400"/>
+            <w:tcBorders>
+              <w:top w:val="single" w:color="D6D9D2" w:sz="4"/>
+              <w:left w:val="single" w:color="D6D9D2" w:sz="4"/>
+              <w:bottom w:val="single" w:color="D6D9D2" w:sz="4"/>
+              <w:right w:val="single" w:color="D6D9D2" w:sz="4"/>
+            </w:tcBorders>
+            <w:tcMar>
+              <w:top w:type="dxa" w:w="70"/>
+              <w:left w:type="dxa" w:w="110"/>
+              <w:bottom w:type="dxa" w:w="70"/>
+              <w:right w:type="dxa" w:w="110"/>
+            </w:tcMar>
+            <w:vAlign w:val="center"/>
+          </w:tcPr>
+          <w:p>
+            <w:pPr>
+              <w:spacing w:after="0"/>
+            </w:pPr>
+            <w:r>
+              <w:rPr>
+                <w:b w:val="false"/>
+                <w:bCs w:val="false"/>
+                <w:color w:val="15181D"/>
+                <w:sz w:val="19"/>
+                <w:szCs w:val="19"/>
+              </w:rPr>
+              <w:t xml:space="preserve">Français intégral (lettres, accents, chiffres, majuscules), dimensions Marburg Medium, gaufré avec la forme</w:t>
+            </w:r>
+          </w:p>
+        </w:tc>
+        <w:tc>
+          <w:tcPr>
+            <w:tcW w:type="dxa" w:w="3338"/>
+            <w:tcBorders>
+              <w:top w:val="single" w:color="D6D9D2" w:sz="4"/>
+              <w:left w:val="single" w:color="D6D9D2" w:sz="4"/>
+              <w:bottom w:val="single" w:color="D6D9D2" w:sz="4"/>
+              <w:right w:val="single" w:color="D6D9D2" w:sz="4"/>
+            </w:tcBorders>
+            <w:tcMar>
+              <w:top w:type="dxa" w:w="70"/>
+              <w:left w:type="dxa" w:w="110"/>
+              <w:bottom w:type="dxa" w:w="70"/>
+              <w:right w:type="dxa" w:w="110"/>
+            </w:tcMar>
+            <w:vAlign w:val="center"/>
+          </w:tcPr>
+          <w:p>
+            <w:pPr>
+              <w:spacing w:after="0"/>
+            </w:pPr>
+            <w:r>
+              <w:rPr>
+                <w:b w:val="false"/>
+                <w:bCs w:val="false"/>
+                <w:color w:val="15181D"/>
+                <w:sz w:val="19"/>
+                <w:szCs w:val="19"/>
+              </w:rPr>
+              <w:t xml:space="preserve">Une seule face, 5 mm des plis, pas de dorure ni de vernis dessous</w:t>
+            </w:r>
+          </w:p>
+        </w:tc>
+      </w:tr>
+      <w:tr>
+        <w:tc>
+          <w:tcPr>
+            <w:tcW w:type="dxa" w:w="1900"/>
+            <w:tcBorders>
+              <w:top w:val="single" w:color="D6D9D2" w:sz="4"/>
+              <w:left w:val="single" w:color="D6D9D2" w:sz="4"/>
+              <w:bottom w:val="single" w:color="D6D9D2" w:sz="4"/>
+              <w:right w:val="single" w:color="D6D9D2" w:sz="4"/>
+            </w:tcBorders>
+            <w:tcMar>
+              <w:top w:type="dxa" w:w="70"/>
+              <w:left w:type="dxa" w:w="110"/>
+              <w:bottom w:type="dxa" w:w="70"/>
+              <w:right w:type="dxa" w:w="110"/>
+            </w:tcMar>
+            <w:vAlign w:val="center"/>
+          </w:tcPr>
+          <w:p>
+            <w:pPr>
+              <w:spacing w:after="0"/>
+            </w:pPr>
+            <w:r>
+              <w:rPr>
+                <w:b w:val="false"/>
+                <w:bCs w:val="false"/>
+                <w:color w:val="15181D"/>
+                <w:sz w:val="19"/>
+                <w:szCs w:val="19"/>
+              </w:rPr>
+              <w:t xml:space="preserve">Pictogrammes</w:t>
+            </w:r>
+          </w:p>
+        </w:tc>
+        <w:tc>
+          <w:tcPr>
+            <w:tcW w:type="dxa" w:w="4400"/>
+            <w:tcBorders>
+              <w:top w:val="single" w:color="D6D9D2" w:sz="4"/>
+              <w:left w:val="single" w:color="D6D9D2" w:sz="4"/>
+              <w:bottom w:val="single" w:color="D6D9D2" w:sz="4"/>
+              <w:right w:val="single" w:color="D6D9D2" w:sz="4"/>
+            </w:tcBorders>
+            <w:tcMar>
+              <w:top w:type="dxa" w:w="70"/>
+              <w:left w:type="dxa" w:w="110"/>
+              <w:bottom w:type="dxa" w:w="70"/>
+              <w:right w:type="dxa" w:w="110"/>
+            </w:tcMar>
+            <w:vAlign w:val="center"/>
+          </w:tcPr>
+          <w:p>
+            <w:pPr>
+              <w:spacing w:after="0"/>
+            </w:pPr>
+            <w:r>
+              <w:rPr>
+                <w:b w:val="false"/>
+                <w:bCs w:val="false"/>
+                <w:color w:val="15181D"/>
+                <w:sz w:val="19"/>
+                <w:szCs w:val="19"/>
+              </w:rPr>
+              <w:t xml:space="preserve">Recyclage, PAP 20 / 21 / 22, poubelle, PAO, ℮, sablier, contact alimentaire, fragile, haut, humidité</w:t>
+            </w:r>
+          </w:p>
+        </w:tc>
+        <w:tc>
+          <w:tcPr>
+            <w:tcW w:type="dxa" w:w="3338"/>
+            <w:tcBorders>
+              <w:top w:val="single" w:color="D6D9D2" w:sz="4"/>
+              <w:left w:val="single" w:color="D6D9D2" w:sz="4"/>
+              <w:bottom w:val="single" w:color="D6D9D2" w:sz="4"/>
+              <w:right w:val="single" w:color="D6D9D2" w:sz="4"/>
+            </w:tcBorders>
+            <w:tcMar>
+              <w:top w:type="dxa" w:w="70"/>
+              <w:left w:type="dxa" w:w="110"/>
+              <w:bottom w:type="dxa" w:w="70"/>
+              <w:right w:type="dxa" w:w="110"/>
+            </w:tcMar>
+            <w:vAlign w:val="center"/>
+          </w:tcPr>
+          <w:p>
+            <w:pPr>
+              <w:spacing w:after="0"/>
+            </w:pPr>
+            <w:r>
+              <w:rPr>
+                <w:b w:val="false"/>
+                <w:bCs w:val="false"/>
+                <w:color w:val="15181D"/>
+                <w:sz w:val="19"/>
+                <w:szCs w:val="19"/>
+              </w:rPr>
+              <w:t xml:space="preserve">Taille minimale (3 mm pour le ℮, 6 mm sinon)</w:t>
+            </w:r>
+          </w:p>
+        </w:tc>
+      </w:tr>
+      <w:tr>
+        <w:tc>
+          <w:tcPr>
+            <w:tcW w:type="dxa" w:w="1900"/>
+            <w:tcBorders>
+              <w:top w:val="single" w:color="D6D9D2" w:sz="4"/>
+              <w:left w:val="single" w:color="D6D9D2" w:sz="4"/>
+              <w:bottom w:val="single" w:color="D6D9D2" w:sz="4"/>
+              <w:right w:val="single" w:color="D6D9D2" w:sz="4"/>
+            </w:tcBorders>
+            <w:tcMar>
+              <w:top w:type="dxa" w:w="70"/>
+              <w:left w:type="dxa" w:w="110"/>
+              <w:bottom w:type="dxa" w:w="70"/>
+              <w:right w:type="dxa" w:w="110"/>
+            </w:tcMar>
+            <w:vAlign w:val="center"/>
+          </w:tcPr>
+          <w:p>
+            <w:pPr>
+              <w:spacing w:after="0"/>
+            </w:pPr>
+            <w:r>
+              <w:rPr>
+                <w:b w:val="false"/>
+                <w:bCs w:val="false"/>
+                <w:color w:val="15181D"/>
+                <w:sz w:val="19"/>
+                <w:szCs w:val="19"/>
+              </w:rPr>
+              <w:t xml:space="preserve">Zone de marquage</w:t>
+            </w:r>
+          </w:p>
+        </w:tc>
+        <w:tc>
+          <w:tcPr>
+            <w:tcW w:type="dxa" w:w="4400"/>
+            <w:tcBorders>
+              <w:top w:val="single" w:color="D6D9D2" w:sz="4"/>
+              <w:left w:val="single" w:color="D6D9D2" w:sz="4"/>
+              <w:bottom w:val="single" w:color="D6D9D2" w:sz="4"/>
+              <w:right w:val="single" w:color="D6D9D2" w:sz="4"/>
+            </w:tcBorders>
+            <w:tcMar>
+              <w:top w:type="dxa" w:w="70"/>
+              <w:left w:type="dxa" w:w="110"/>
+              <w:bottom w:type="dxa" w:w="70"/>
+              <w:right w:type="dxa" w:w="110"/>
+            </w:tcMar>
+            <w:vAlign w:val="center"/>
+          </w:tcPr>
+          <w:p>
+            <w:pPr>
+              <w:spacing w:after="0"/>
+            </w:pPr>
+            <w:r>
+              <w:rPr>
+                <w:b w:val="false"/>
+                <w:bCs w:val="false"/>
+                <w:color w:val="15181D"/>
+                <w:sz w:val="19"/>
+                <w:szCs w:val="19"/>
+              </w:rPr>
+              <w:t xml:space="preserve">Réserve blanche sans vernis pour le lot et la date imprimés au conditionnement</w:t>
+            </w:r>
+          </w:p>
+        </w:tc>
+        <w:tc>
+          <w:tcPr>
+            <w:tcW w:type="dxa" w:w="3338"/>
+            <w:tcBorders>
+              <w:top w:val="single" w:color="D6D9D2" w:sz="4"/>
+              <w:left w:val="single" w:color="D6D9D2" w:sz="4"/>
+              <w:bottom w:val="single" w:color="D6D9D2" w:sz="4"/>
+              <w:right w:val="single" w:color="D6D9D2" w:sz="4"/>
+            </w:tcBorders>
+            <w:tcMar>
+              <w:top w:type="dxa" w:w="70"/>
+              <w:left w:type="dxa" w:w="110"/>
+              <w:bottom w:type="dxa" w:w="70"/>
+              <w:right w:type="dxa" w:w="110"/>
+            </w:tcMar>
+            <w:vAlign w:val="center"/>
+          </w:tcPr>
+          <w:p>
+            <w:pPr>
+              <w:spacing w:after="0"/>
+            </w:pPr>
+            <w:r>
+              <w:rPr>
+                <w:b w:val="false"/>
+                <w:bCs w:val="false"/>
+                <w:color w:val="15181D"/>
+                <w:sz w:val="19"/>
+                <w:szCs w:val="19"/>
+              </w:rPr>
+              <w:t xml:space="preserve">Pas de dorure ni de vernis ; alerte si pelliculage</w:t>
+            </w:r>
+          </w:p>
+        </w:tc>
+      </w:tr>
+      <w:tr>
+        <w:tc>
+          <w:tcPr>
+            <w:tcW w:type="dxa" w:w="1900"/>
+            <w:tcBorders>
+              <w:top w:val="single" w:color="D6D9D2" w:sz="4"/>
+              <w:left w:val="single" w:color="D6D9D2" w:sz="4"/>
+              <w:bottom w:val="single" w:color="D6D9D2" w:sz="4"/>
+              <w:right w:val="single" w:color="D6D9D2" w:sz="4"/>
+            </w:tcBorders>
+            <w:tcMar>
+              <w:top w:type="dxa" w:w="70"/>
+              <w:left w:type="dxa" w:w="110"/>
+              <w:bottom w:type="dxa" w:w="70"/>
+              <w:right w:type="dxa" w:w="110"/>
+            </w:tcMar>
+            <w:vAlign w:val="center"/>
+          </w:tcPr>
+          <w:p>
+            <w:pPr>
+              <w:spacing w:after="0"/>
+            </w:pPr>
+            <w:r>
+              <w:rPr>
+                <w:b w:val="false"/>
+                <w:bCs w:val="false"/>
+                <w:color w:val="15181D"/>
+                <w:sz w:val="19"/>
+                <w:szCs w:val="19"/>
+              </w:rPr>
+              <w:t xml:space="preserve">Kits de mentions</w:t>
+            </w:r>
+          </w:p>
+        </w:tc>
+        <w:tc>
+          <w:tcPr>
+            <w:tcW w:type="dxa" w:w="4400"/>
+            <w:tcBorders>
+              <w:top w:val="single" w:color="D6D9D2" w:sz="4"/>
+              <w:left w:val="single" w:color="D6D9D2" w:sz="4"/>
+              <w:bottom w:val="single" w:color="D6D9D2" w:sz="4"/>
+              <w:right w:val="single" w:color="D6D9D2" w:sz="4"/>
+            </w:tcBorders>
+            <w:tcMar>
+              <w:top w:type="dxa" w:w="70"/>
+              <w:left w:type="dxa" w:w="110"/>
+              <w:bottom w:type="dxa" w:w="70"/>
+              <w:right w:type="dxa" w:w="110"/>
+            </w:tcMar>
+            <w:vAlign w:val="center"/>
+          </w:tcPr>
+          <w:p>
+            <w:pPr>
+              <w:spacing w:after="0"/>
+            </w:pPr>
+            <w:r>
+              <w:rPr>
+                <w:b w:val="false"/>
+                <w:bCs w:val="false"/>
+                <w:color w:val="15181D"/>
+                <w:sz w:val="19"/>
+                <w:szCs w:val="19"/>
+              </w:rPr>
+              <w:t xml:space="preserve">Cosmétique, alimentaire, pharmacie, transport</w:t>
+            </w:r>
+          </w:p>
+        </w:tc>
+        <w:tc>
+          <w:tcPr>
+            <w:tcW w:type="dxa" w:w="3338"/>
+            <w:tcBorders>
+              <w:top w:val="single" w:color="D6D9D2" w:sz="4"/>
+              <w:left w:val="single" w:color="D6D9D2" w:sz="4"/>
+              <w:bottom w:val="single" w:color="D6D9D2" w:sz="4"/>
+              <w:right w:val="single" w:color="D6D9D2" w:sz="4"/>
+            </w:tcBorders>
+            <w:tcMar>
+              <w:top w:type="dxa" w:w="70"/>
+              <w:left w:type="dxa" w:w="110"/>
+              <w:bottom w:type="dxa" w:w="70"/>
+              <w:right w:type="dxa" w:w="110"/>
+            </w:tcMar>
+            <w:vAlign w:val="center"/>
+          </w:tcPr>
+          <w:p>
+            <w:pPr>
+              <w:spacing w:after="0"/>
+            </w:pPr>
+            <w:r>
+              <w:rPr>
+                <w:b w:val="false"/>
+                <w:bCs w:val="false"/>
+                <w:color w:val="15181D"/>
+                <w:sz w:val="19"/>
+                <w:szCs w:val="19"/>
+              </w:rPr>
+              <w:t xml:space="preserve">—</w:t>
+            </w:r>
+          </w:p>
+        </w:tc>
+      </w:tr>
+    </w:tbl>
+    <w:p>
+      <w:pPr>
+        <w:spacing w:after="100"/>
+      </w:pPr>
+    </w:p>
+    <w:p>
+      <w:pPr>
+        <w:keepNext/>
+        <w:spacing w:after="60" w:before="120"/>
+        <w:jc w:val="center"/>
+      </w:pPr>
+      <w:r>
+        <w:drawing>
+          <wp:inline distT="0" distB="0" distL="0" distR="0">
+            <wp:extent cx="1857375" cy="4953000"/>
+            <wp:effectExtent t="0" r="0" b="0" l="0"/>
+            <wp:docPr id="1" name="25-prepresse-codes.jpg" descr="25-prepresse-codes.jpg" title="25-prepresse-codes.jpg"/>
+            <wp:cNvGraphicFramePr>
+              <a:graphicFrameLocks xmlns:a="http://schemas.openxmlformats.org/drawingml/2006/main" noChangeAspect="1"/>
+            </wp:cNvGraphicFramePr>
+            <a:graphic xmlns:a="http://schemas.openxmlformats.org/drawingml/2006/main">
+              <a:graphicData uri="http://schemas.openxmlformats.org/drawingml/2006/picture">
+                <pic:pic xmlns:pic="http://schemas.openxmlformats.org/drawingml/2006/picture">
+                  <pic:nvPicPr>
+                    <pic:cNvPr id="0" name="" descr=""/>
+                    <pic:cNvPicPr>
+                      <a:picLocks noChangeAspect="1" noChangeArrowheads="1"/>
+                    </pic:cNvPicPr>
+                  </pic:nvPicPr>
+                  <pic:blipFill>
+                    <a:blip r:embed="rId36" cstate="none"/>
+                    <a:srcRect/>
+                    <a:stretch>
+                      <a:fillRect/>
+                    </a:stretch>
+                  </pic:blipFill>
+                  <pic:spPr bwMode="auto">
+                    <a:xfrm>
+                      <a:off x="0" y="0"/>
+                      <a:ext cx="1857375" cy="4953000"/>
+                    </a:xfrm>
+                    <a:prstGeom prst="rect">
+                      <a:avLst/>
+                    </a:prstGeom>
+                  </pic:spPr>
+                </pic:pic>
+              </a:graphicData>
+            </a:graphic>
+          </wp:inline>
+        </w:drawing>
+      </w:r>
+    </w:p>
+    <w:p>
+      <w:pPr>
+        <w:pStyle w:val="Caption"/>
+        <w:jc w:val="center"/>
+      </w:pPr>
+      <w:r>
+        <w:rPr>
+          <w:b/>
+          <w:bCs/>
+        </w:rPr>
+        <w:t xml:space="preserve">Figure 13 — </w:t>
+      </w:r>
+      <w:r>
+        <w:t xml:space="preserve">Le contrôle prépresse des codes et du braille</w:t>
+      </w:r>
+    </w:p>
+    <w:tbl>
+      <w:tblPr>
+        <w:tblW w:type="dxa" w:w="9638"/>
+        <w:tblBorders>
+          <w:top w:val="single" w:color="auto" w:sz="4"/>
+          <w:left w:val="single" w:color="auto" w:sz="4"/>
+          <w:bottom w:val="single" w:color="auto" w:sz="4"/>
+          <w:right w:val="single" w:color="auto" w:sz="4"/>
+          <w:insideH w:val="single" w:color="auto" w:sz="4"/>
+          <w:insideV w:val="single" w:color="auto" w:sz="4"/>
+        </w:tblBorders>
+      </w:tblPr>
+      <w:tblGrid>
+        <w:gridCol w:w="9638"/>
+      </w:tblGrid>
+      <w:tr>
+        <w:tc>
+          <w:tcPr>
+            <w:tcW w:type="dxa" w:w="9638"/>
+            <w:tcBorders>
+              <w:top w:val="none" w:color="FFFFFF" w:sz="0"/>
+              <w:left w:val="single" w:color="B80F5A" w:sz="24"/>
+              <w:bottom w:val="none" w:color="FFFFFF" w:sz="0"/>
+              <w:right w:val="none" w:color="FFFFFF" w:sz="0"/>
+            </w:tcBorders>
+            <w:shd w:fill="F7E7EF" w:color="auto" w:val="clear"/>
+            <w:tcMar>
+              <w:top w:type="dxa" w:w="120"/>
+              <w:left w:type="dxa" w:w="200"/>
+              <w:bottom w:type="dxa" w:w="120"/>
+              <w:right w:type="dxa" w:w="200"/>
+            </w:tcMar>
+          </w:tcPr>
+          <w:p>
+            <w:pPr>
+              <w:spacing w:after="60"/>
+            </w:pPr>
+            <w:r>
+              <w:rPr>
+                <w:b/>
+                <w:bCs/>
+                <w:color w:val="B80F5A"/>
+              </w:rPr>
+              <w:t xml:space="preserve">Braille</w:t>
+            </w:r>
+          </w:p>
+          <w:p>
+            <w:r>
+              <w:t xml:space="preserve">Le braille ne s'imprime pas : il est gaufré, et il apparaît sur le masque de gaufrage du PDF d'impression et sur le calque BRAILLE du dossier formiste. Faites toujours relire la transcription par un lecteur braille.</w:t>
+            </w:r>
+          </w:p>
+        </w:tc>
+      </w:tr>
+    </w:tbl>
+    <w:p>
+      <w:pPr>
+        <w:spacing w:after="80"/>
+      </w:pPr>
+    </w:p>
+    <w:p>
+      <w:pPr>
+        <w:pStyle w:val="Heading1"/>
+        <w:pageBreakBefore/>
+      </w:pPr>
+      <w:r>
+        <w:t xml:space="preserve">9. La bibliothèque de modèles</w:t>
       </w:r>
     </w:p>
     <w:tbl>
@@ -6005,398 +8428,6 @@
                   <wp:extent cx="1924050" cy="1390650"/>
                   <wp:effectExtent t="0" r="0" b="0" l="0"/>
                   <wp:docPr id="1" name="12g-dattes.jpg" descr="12g-dattes.jpg" title="12g-dattes.jpg"/>
-                  <wp:cNvGraphicFramePr>
-                    <a:graphicFrameLocks xmlns:a="http://schemas.openxmlformats.org/drawingml/2006/main" noChangeAspect="1"/>
-                  </wp:cNvGraphicFramePr>
-                  <a:graphic xmlns:a="http://schemas.openxmlformats.org/drawingml/2006/main">
-                    <a:graphicData uri="http://schemas.openxmlformats.org/drawingml/2006/picture">
-                      <pic:pic xmlns:pic="http://schemas.openxmlformats.org/drawingml/2006/picture">
-                        <pic:nvPicPr>
-                          <pic:cNvPr id="0" name="" descr=""/>
-                          <pic:cNvPicPr>
-                            <a:picLocks noChangeAspect="1" noChangeArrowheads="1"/>
-                          </pic:cNvPicPr>
-                        </pic:nvPicPr>
-                        <pic:blipFill>
-                          <a:blip r:embed="rId32" cstate="none"/>
-                          <a:srcRect/>
-                          <a:stretch>
-                            <a:fillRect/>
-                          </a:stretch>
-                        </pic:blipFill>
-                        <pic:spPr bwMode="auto">
-                          <a:xfrm>
-                            <a:off x="0" y="0"/>
-                            <a:ext cx="1924050" cy="1390650"/>
-                          </a:xfrm>
-                          <a:prstGeom prst="rect">
-                            <a:avLst/>
-                          </a:prstGeom>
-                        </pic:spPr>
-                      </pic:pic>
-                    </a:graphicData>
-                  </a:graphic>
-                </wp:inline>
-              </w:drawing>
-            </w:r>
-          </w:p>
-          <w:p>
-            <w:pPr>
-              <w:pStyle w:val="Caption"/>
-              <w:jc w:val="center"/>
-            </w:pPr>
-            <w:r>
-              <w:rPr>
-                <w:b/>
-                <w:bCs/>
-              </w:rPr>
-              <w:t xml:space="preserve">Coffret couvercle + fond</w:t>
-            </w:r>
-            <w:r>
-              <w:t xml:space="preserve"> · dattes</w:t>
-            </w:r>
-          </w:p>
-        </w:tc>
-        <w:tc>
-          <w:tcPr>
-            <w:tcW w:type="dxa" w:w="3212"/>
-            <w:tcBorders>
-              <w:top w:val="none" w:color="FFFFFF" w:sz="0"/>
-              <w:left w:val="none" w:color="FFFFFF" w:sz="0"/>
-              <w:bottom w:val="none" w:color="FFFFFF" w:sz="0"/>
-              <w:right w:val="none" w:color="FFFFFF" w:sz="0"/>
-            </w:tcBorders>
-            <w:tcMar>
-              <w:top w:type="dxa" w:w="60"/>
-              <w:left w:type="dxa" w:w="60"/>
-              <w:bottom w:type="dxa" w:w="60"/>
-              <w:right w:type="dxa" w:w="60"/>
-            </w:tcMar>
-          </w:tcPr>
-          <w:p>
-            <w:pPr>
-              <w:jc w:val="center"/>
-            </w:pPr>
-            <w:r>
-              <w:drawing>
-                <wp:inline distT="0" distB="0" distL="0" distR="0">
-                  <wp:extent cx="1924050" cy="1390650"/>
-                  <wp:effectExtent t="0" r="0" b="0" l="0"/>
-                  <wp:docPr id="1" name="12h-huile.jpg" descr="12h-huile.jpg" title="12h-huile.jpg"/>
-                  <wp:cNvGraphicFramePr>
-                    <a:graphicFrameLocks xmlns:a="http://schemas.openxmlformats.org/drawingml/2006/main" noChangeAspect="1"/>
-                  </wp:cNvGraphicFramePr>
-                  <a:graphic xmlns:a="http://schemas.openxmlformats.org/drawingml/2006/main">
-                    <a:graphicData uri="http://schemas.openxmlformats.org/drawingml/2006/picture">
-                      <pic:pic xmlns:pic="http://schemas.openxmlformats.org/drawingml/2006/picture">
-                        <pic:nvPicPr>
-                          <pic:cNvPr id="0" name="" descr=""/>
-                          <pic:cNvPicPr>
-                            <a:picLocks noChangeAspect="1" noChangeArrowheads="1"/>
-                          </pic:cNvPicPr>
-                        </pic:nvPicPr>
-                        <pic:blipFill>
-                          <a:blip r:embed="rId33" cstate="none"/>
-                          <a:srcRect/>
-                          <a:stretch>
-                            <a:fillRect/>
-                          </a:stretch>
-                        </pic:blipFill>
-                        <pic:spPr bwMode="auto">
-                          <a:xfrm>
-                            <a:off x="0" y="0"/>
-                            <a:ext cx="1924050" cy="1390650"/>
-                          </a:xfrm>
-                          <a:prstGeom prst="rect">
-                            <a:avLst/>
-                          </a:prstGeom>
-                        </pic:spPr>
-                      </pic:pic>
-                    </a:graphicData>
-                  </a:graphic>
-                </wp:inline>
-              </w:drawing>
-            </w:r>
-          </w:p>
-          <w:p>
-            <w:pPr>
-              <w:pStyle w:val="Caption"/>
-              <w:jc w:val="center"/>
-            </w:pPr>
-            <w:r>
-              <w:rPr>
-                <w:b/>
-                <w:bCs/>
-              </w:rPr>
-              <w:t xml:space="preserve">Étiquette bouteille</w:t>
-            </w:r>
-            <w:r>
-              <w:t xml:space="preserve"> · huile d'olive</w:t>
-            </w:r>
-          </w:p>
-        </w:tc>
-        <w:tc>
-          <w:tcPr>
-            <w:tcW w:type="dxa" w:w="3212"/>
-            <w:tcBorders>
-              <w:top w:val="none" w:color="FFFFFF" w:sz="0"/>
-              <w:left w:val="none" w:color="FFFFFF" w:sz="0"/>
-              <w:bottom w:val="none" w:color="FFFFFF" w:sz="0"/>
-              <w:right w:val="none" w:color="FFFFFF" w:sz="0"/>
-            </w:tcBorders>
-            <w:tcMar>
-              <w:top w:type="dxa" w:w="60"/>
-              <w:left w:type="dxa" w:w="60"/>
-              <w:bottom w:type="dxa" w:w="60"/>
-              <w:right w:type="dxa" w:w="60"/>
-            </w:tcMar>
-          </w:tcPr>
-          <w:p>
-            <w:pPr>
-              <w:jc w:val="center"/>
-            </w:pPr>
-            <w:r>
-              <w:drawing>
-                <wp:inline distT="0" distB="0" distL="0" distR="0">
-                  <wp:extent cx="1924050" cy="1390650"/>
-                  <wp:effectExtent t="0" r="0" b="0" l="0"/>
-                  <wp:docPr id="1" name="12i-bijoux.jpg" descr="12i-bijoux.jpg" title="12i-bijoux.jpg"/>
-                  <wp:cNvGraphicFramePr>
-                    <a:graphicFrameLocks xmlns:a="http://schemas.openxmlformats.org/drawingml/2006/main" noChangeAspect="1"/>
-                  </wp:cNvGraphicFramePr>
-                  <a:graphic xmlns:a="http://schemas.openxmlformats.org/drawingml/2006/main">
-                    <a:graphicData uri="http://schemas.openxmlformats.org/drawingml/2006/picture">
-                      <pic:pic xmlns:pic="http://schemas.openxmlformats.org/drawingml/2006/picture">
-                        <pic:nvPicPr>
-                          <pic:cNvPr id="0" name="" descr=""/>
-                          <pic:cNvPicPr>
-                            <a:picLocks noChangeAspect="1" noChangeArrowheads="1"/>
-                          </pic:cNvPicPr>
-                        </pic:nvPicPr>
-                        <pic:blipFill>
-                          <a:blip r:embed="rId34" cstate="none"/>
-                          <a:srcRect/>
-                          <a:stretch>
-                            <a:fillRect/>
-                          </a:stretch>
-                        </pic:blipFill>
-                        <pic:spPr bwMode="auto">
-                          <a:xfrm>
-                            <a:off x="0" y="0"/>
-                            <a:ext cx="1924050" cy="1390650"/>
-                          </a:xfrm>
-                          <a:prstGeom prst="rect">
-                            <a:avLst/>
-                          </a:prstGeom>
-                        </pic:spPr>
-                      </pic:pic>
-                    </a:graphicData>
-                  </a:graphic>
-                </wp:inline>
-              </w:drawing>
-            </w:r>
-          </w:p>
-          <w:p>
-            <w:pPr>
-              <w:pStyle w:val="Caption"/>
-              <w:jc w:val="center"/>
-            </w:pPr>
-            <w:r>
-              <w:rPr>
-                <w:b/>
-                <w:bCs/>
-              </w:rPr>
-              <w:t xml:space="preserve">Berlingot</w:t>
-            </w:r>
-            <w:r>
-              <w:t xml:space="preserve"> · bijouterie</w:t>
-            </w:r>
-          </w:p>
-        </w:tc>
-      </w:tr>
-      <w:tr>
-        <w:tc>
-          <w:tcPr>
-            <w:tcW w:type="dxa" w:w="3212"/>
-            <w:tcBorders>
-              <w:top w:val="none" w:color="FFFFFF" w:sz="0"/>
-              <w:left w:val="none" w:color="FFFFFF" w:sz="0"/>
-              <w:bottom w:val="none" w:color="FFFFFF" w:sz="0"/>
-              <w:right w:val="none" w:color="FFFFFF" w:sz="0"/>
-            </w:tcBorders>
-            <w:tcMar>
-              <w:top w:type="dxa" w:w="60"/>
-              <w:left w:type="dxa" w:w="60"/>
-              <w:bottom w:type="dxa" w:w="60"/>
-              <w:right w:type="dxa" w:w="60"/>
-            </w:tcMar>
-          </w:tcPr>
-          <w:p>
-            <w:pPr>
-              <w:jc w:val="center"/>
-            </w:pPr>
-            <w:r>
-              <w:drawing>
-                <wp:inline distT="0" distB="0" distL="0" distR="0">
-                  <wp:extent cx="1924050" cy="1390650"/>
-                  <wp:effectExtent t="0" r="0" b="0" l="0"/>
-                  <wp:docPr id="1" name="12d-dragees.jpg" descr="12d-dragees.jpg" title="12d-dragees.jpg"/>
-                  <wp:cNvGraphicFramePr>
-                    <a:graphicFrameLocks xmlns:a="http://schemas.openxmlformats.org/drawingml/2006/main" noChangeAspect="1"/>
-                  </wp:cNvGraphicFramePr>
-                  <a:graphic xmlns:a="http://schemas.openxmlformats.org/drawingml/2006/main">
-                    <a:graphicData uri="http://schemas.openxmlformats.org/drawingml/2006/picture">
-                      <pic:pic xmlns:pic="http://schemas.openxmlformats.org/drawingml/2006/picture">
-                        <pic:nvPicPr>
-                          <pic:cNvPr id="0" name="" descr=""/>
-                          <pic:cNvPicPr>
-                            <a:picLocks noChangeAspect="1" noChangeArrowheads="1"/>
-                          </pic:cNvPicPr>
-                        </pic:nvPicPr>
-                        <pic:blipFill>
-                          <a:blip r:embed="rId35" cstate="none"/>
-                          <a:srcRect/>
-                          <a:stretch>
-                            <a:fillRect/>
-                          </a:stretch>
-                        </pic:blipFill>
-                        <pic:spPr bwMode="auto">
-                          <a:xfrm>
-                            <a:off x="0" y="0"/>
-                            <a:ext cx="1924050" cy="1390650"/>
-                          </a:xfrm>
-                          <a:prstGeom prst="rect">
-                            <a:avLst/>
-                          </a:prstGeom>
-                        </pic:spPr>
-                      </pic:pic>
-                    </a:graphicData>
-                  </a:graphic>
-                </wp:inline>
-              </w:drawing>
-            </w:r>
-          </w:p>
-          <w:p>
-            <w:pPr>
-              <w:pStyle w:val="Caption"/>
-              <w:jc w:val="center"/>
-            </w:pPr>
-            <w:r>
-              <w:rPr>
-                <w:b/>
-                <w:bCs/>
-              </w:rPr>
-              <w:t xml:space="preserve">Boîte pyramide</w:t>
-            </w:r>
-            <w:r>
-              <w:t xml:space="preserve"> · dragées</w:t>
-            </w:r>
-          </w:p>
-        </w:tc>
-        <w:tc>
-          <w:tcPr>
-            <w:tcW w:type="dxa" w:w="3212"/>
-            <w:tcBorders>
-              <w:top w:val="none" w:color="FFFFFF" w:sz="0"/>
-              <w:left w:val="none" w:color="FFFFFF" w:sz="0"/>
-              <w:bottom w:val="none" w:color="FFFFFF" w:sz="0"/>
-              <w:right w:val="none" w:color="FFFFFF" w:sz="0"/>
-            </w:tcBorders>
-            <w:tcMar>
-              <w:top w:type="dxa" w:w="60"/>
-              <w:left w:type="dxa" w:w="60"/>
-              <w:bottom w:type="dxa" w:w="60"/>
-              <w:right w:type="dxa" w:w="60"/>
-            </w:tcMar>
-          </w:tcPr>
-          <w:p>
-            <w:pPr>
-              <w:jc w:val="center"/>
-            </w:pPr>
-            <w:r>
-              <w:drawing>
-                <wp:inline distT="0" distB="0" distL="0" distR="0">
-                  <wp:extent cx="1924050" cy="1390650"/>
-                  <wp:effectExtent t="0" r="0" b="0" l="0"/>
-                  <wp:docPr id="1" name="12f-gateaux.jpg" descr="12f-gateaux.jpg" title="12f-gateaux.jpg"/>
-                  <wp:cNvGraphicFramePr>
-                    <a:graphicFrameLocks xmlns:a="http://schemas.openxmlformats.org/drawingml/2006/main" noChangeAspect="1"/>
-                  </wp:cNvGraphicFramePr>
-                  <a:graphic xmlns:a="http://schemas.openxmlformats.org/drawingml/2006/main">
-                    <a:graphicData uri="http://schemas.openxmlformats.org/drawingml/2006/picture">
-                      <pic:pic xmlns:pic="http://schemas.openxmlformats.org/drawingml/2006/picture">
-                        <pic:nvPicPr>
-                          <pic:cNvPr id="0" name="" descr=""/>
-                          <pic:cNvPicPr>
-                            <a:picLocks noChangeAspect="1" noChangeArrowheads="1"/>
-                          </pic:cNvPicPr>
-                        </pic:nvPicPr>
-                        <pic:blipFill>
-                          <a:blip r:embed="rId36" cstate="none"/>
-                          <a:srcRect/>
-                          <a:stretch>
-                            <a:fillRect/>
-                          </a:stretch>
-                        </pic:blipFill>
-                        <pic:spPr bwMode="auto">
-                          <a:xfrm>
-                            <a:off x="0" y="0"/>
-                            <a:ext cx="1924050" cy="1390650"/>
-                          </a:xfrm>
-                          <a:prstGeom prst="rect">
-                            <a:avLst/>
-                          </a:prstGeom>
-                        </pic:spPr>
-                      </pic:pic>
-                    </a:graphicData>
-                  </a:graphic>
-                </wp:inline>
-              </w:drawing>
-            </w:r>
-          </w:p>
-          <w:p>
-            <w:pPr>
-              <w:pStyle w:val="Caption"/>
-              <w:jc w:val="center"/>
-            </w:pPr>
-            <w:r>
-              <w:rPr>
-                <w:b/>
-                <w:bCs/>
-              </w:rPr>
-              <w:t xml:space="preserve">Boîte à anse</w:t>
-            </w:r>
-            <w:r>
-              <w:t xml:space="preserve"> · pâtisserie</w:t>
-            </w:r>
-          </w:p>
-        </w:tc>
-        <w:tc>
-          <w:tcPr>
-            <w:tcW w:type="dxa" w:w="3212"/>
-            <w:tcBorders>
-              <w:top w:val="none" w:color="FFFFFF" w:sz="0"/>
-              <w:left w:val="none" w:color="FFFFFF" w:sz="0"/>
-              <w:bottom w:val="none" w:color="FFFFFF" w:sz="0"/>
-              <w:right w:val="none" w:color="FFFFFF" w:sz="0"/>
-            </w:tcBorders>
-            <w:tcMar>
-              <w:top w:type="dxa" w:w="60"/>
-              <w:left w:type="dxa" w:w="60"/>
-              <w:bottom w:type="dxa" w:w="60"/>
-              <w:right w:type="dxa" w:w="60"/>
-            </w:tcMar>
-          </w:tcPr>
-          <w:p>
-            <w:pPr>
-              <w:jc w:val="center"/>
-            </w:pPr>
-            <w:r>
-              <w:drawing>
-                <wp:inline distT="0" distB="0" distL="0" distR="0">
-                  <wp:extent cx="1924050" cy="1390650"/>
-                  <wp:effectExtent t="0" r="0" b="0" l="0"/>
-                  <wp:docPr id="1" name="12e-boutique.jpg" descr="12e-boutique.jpg" title="12e-boutique.jpg"/>
                   <wp:cNvGraphicFramePr>
                     <a:graphicFrameLocks xmlns:a="http://schemas.openxmlformats.org/drawingml/2006/main" noChangeAspect="1"/>
                   </wp:cNvGraphicFramePr>
@@ -6442,15 +8473,13 @@
                 <w:b/>
                 <w:bCs/>
               </w:rPr>
-              <w:t xml:space="preserve">Sac papier</w:t>
-            </w:r>
-            <w:r>
-              <w:t xml:space="preserve"> · boutique</w:t>
-            </w:r>
-          </w:p>
-        </w:tc>
-      </w:tr>
-      <w:tr>
+              <w:t xml:space="preserve">Coffret couvercle + fond</w:t>
+            </w:r>
+            <w:r>
+              <w:t xml:space="preserve"> · dattes</w:t>
+            </w:r>
+          </w:p>
+        </w:tc>
         <w:tc>
           <w:tcPr>
             <w:tcW w:type="dxa" w:w="3212"/>
@@ -6476,7 +8505,7 @@
                 <wp:inline distT="0" distB="0" distL="0" distR="0">
                   <wp:extent cx="1924050" cy="1390650"/>
                   <wp:effectExtent t="0" r="0" b="0" l="0"/>
-                  <wp:docPr id="1" name="12a-limonade.jpg" descr="12a-limonade.jpg" title="12a-limonade.jpg"/>
+                  <wp:docPr id="1" name="12h-huile.jpg" descr="12h-huile.jpg" title="12h-huile.jpg"/>
                   <wp:cNvGraphicFramePr>
                     <a:graphicFrameLocks xmlns:a="http://schemas.openxmlformats.org/drawingml/2006/main" noChangeAspect="1"/>
                   </wp:cNvGraphicFramePr>
@@ -6522,10 +8551,10 @@
                 <w:b/>
                 <w:bCs/>
               </w:rPr>
-              <w:t xml:space="preserve">Canette (sleeve)</w:t>
-            </w:r>
-            <w:r>
-              <w:t xml:space="preserve"> · boissons</w:t>
+              <w:t xml:space="preserve">Étiquette bouteille</w:t>
+            </w:r>
+            <w:r>
+              <w:t xml:space="preserve"> · huile d'olive</w:t>
             </w:r>
           </w:p>
         </w:tc>
@@ -6554,7 +8583,7 @@
                 <wp:inline distT="0" distB="0" distL="0" distR="0">
                   <wp:extent cx="1924050" cy="1390650"/>
                   <wp:effectExtent t="0" r="0" b="0" l="0"/>
-                  <wp:docPr id="1" name="12b-tubecreme.jpg" descr="12b-tubecreme.jpg" title="12b-tubecreme.jpg"/>
+                  <wp:docPr id="1" name="12i-bijoux.jpg" descr="12i-bijoux.jpg" title="12i-bijoux.jpg"/>
                   <wp:cNvGraphicFramePr>
                     <a:graphicFrameLocks xmlns:a="http://schemas.openxmlformats.org/drawingml/2006/main" noChangeAspect="1"/>
                   </wp:cNvGraphicFramePr>
@@ -6600,13 +8629,15 @@
                 <w:b/>
                 <w:bCs/>
               </w:rPr>
-              <w:t xml:space="preserve">Tube cosmétique</w:t>
-            </w:r>
-            <w:r>
-              <w:t xml:space="preserve"> · cosmétique</w:t>
-            </w:r>
-          </w:p>
-        </w:tc>
+              <w:t xml:space="preserve">Berlingot</w:t>
+            </w:r>
+            <w:r>
+              <w:t xml:space="preserve"> · bijouterie</w:t>
+            </w:r>
+          </w:p>
+        </w:tc>
+      </w:tr>
+      <w:tr>
         <w:tc>
           <w:tcPr>
             <w:tcW w:type="dxa" w:w="3212"/>
@@ -6632,7 +8663,7 @@
                 <wp:inline distT="0" distB="0" distL="0" distR="0">
                   <wp:extent cx="1924050" cy="1390650"/>
                   <wp:effectExtent t="0" r="0" b="0" l="0"/>
-                  <wp:docPr id="1" name="12c-cafegrains.jpg" descr="12c-cafegrains.jpg" title="12c-cafegrains.jpg"/>
+                  <wp:docPr id="1" name="12d-dragees.jpg" descr="12d-dragees.jpg" title="12d-dragees.jpg"/>
                   <wp:cNvGraphicFramePr>
                     <a:graphicFrameLocks xmlns:a="http://schemas.openxmlformats.org/drawingml/2006/main" noChangeAspect="1"/>
                   </wp:cNvGraphicFramePr>
@@ -6678,6 +8709,398 @@
                 <w:b/>
                 <w:bCs/>
               </w:rPr>
+              <w:t xml:space="preserve">Boîte pyramide</w:t>
+            </w:r>
+            <w:r>
+              <w:t xml:space="preserve"> · dragées</w:t>
+            </w:r>
+          </w:p>
+        </w:tc>
+        <w:tc>
+          <w:tcPr>
+            <w:tcW w:type="dxa" w:w="3212"/>
+            <w:tcBorders>
+              <w:top w:val="none" w:color="FFFFFF" w:sz="0"/>
+              <w:left w:val="none" w:color="FFFFFF" w:sz="0"/>
+              <w:bottom w:val="none" w:color="FFFFFF" w:sz="0"/>
+              <w:right w:val="none" w:color="FFFFFF" w:sz="0"/>
+            </w:tcBorders>
+            <w:tcMar>
+              <w:top w:type="dxa" w:w="60"/>
+              <w:left w:type="dxa" w:w="60"/>
+              <w:bottom w:type="dxa" w:w="60"/>
+              <w:right w:type="dxa" w:w="60"/>
+            </w:tcMar>
+          </w:tcPr>
+          <w:p>
+            <w:pPr>
+              <w:jc w:val="center"/>
+            </w:pPr>
+            <w:r>
+              <w:drawing>
+                <wp:inline distT="0" distB="0" distL="0" distR="0">
+                  <wp:extent cx="1924050" cy="1390650"/>
+                  <wp:effectExtent t="0" r="0" b="0" l="0"/>
+                  <wp:docPr id="1" name="12f-gateaux.jpg" descr="12f-gateaux.jpg" title="12f-gateaux.jpg"/>
+                  <wp:cNvGraphicFramePr>
+                    <a:graphicFrameLocks xmlns:a="http://schemas.openxmlformats.org/drawingml/2006/main" noChangeAspect="1"/>
+                  </wp:cNvGraphicFramePr>
+                  <a:graphic xmlns:a="http://schemas.openxmlformats.org/drawingml/2006/main">
+                    <a:graphicData uri="http://schemas.openxmlformats.org/drawingml/2006/picture">
+                      <pic:pic xmlns:pic="http://schemas.openxmlformats.org/drawingml/2006/picture">
+                        <pic:nvPicPr>
+                          <pic:cNvPr id="0" name="" descr=""/>
+                          <pic:cNvPicPr>
+                            <a:picLocks noChangeAspect="1" noChangeArrowheads="1"/>
+                          </pic:cNvPicPr>
+                        </pic:nvPicPr>
+                        <pic:blipFill>
+                          <a:blip r:embed="rId41" cstate="none"/>
+                          <a:srcRect/>
+                          <a:stretch>
+                            <a:fillRect/>
+                          </a:stretch>
+                        </pic:blipFill>
+                        <pic:spPr bwMode="auto">
+                          <a:xfrm>
+                            <a:off x="0" y="0"/>
+                            <a:ext cx="1924050" cy="1390650"/>
+                          </a:xfrm>
+                          <a:prstGeom prst="rect">
+                            <a:avLst/>
+                          </a:prstGeom>
+                        </pic:spPr>
+                      </pic:pic>
+                    </a:graphicData>
+                  </a:graphic>
+                </wp:inline>
+              </w:drawing>
+            </w:r>
+          </w:p>
+          <w:p>
+            <w:pPr>
+              <w:pStyle w:val="Caption"/>
+              <w:jc w:val="center"/>
+            </w:pPr>
+            <w:r>
+              <w:rPr>
+                <w:b/>
+                <w:bCs/>
+              </w:rPr>
+              <w:t xml:space="preserve">Boîte à anse</w:t>
+            </w:r>
+            <w:r>
+              <w:t xml:space="preserve"> · pâtisserie</w:t>
+            </w:r>
+          </w:p>
+        </w:tc>
+        <w:tc>
+          <w:tcPr>
+            <w:tcW w:type="dxa" w:w="3212"/>
+            <w:tcBorders>
+              <w:top w:val="none" w:color="FFFFFF" w:sz="0"/>
+              <w:left w:val="none" w:color="FFFFFF" w:sz="0"/>
+              <w:bottom w:val="none" w:color="FFFFFF" w:sz="0"/>
+              <w:right w:val="none" w:color="FFFFFF" w:sz="0"/>
+            </w:tcBorders>
+            <w:tcMar>
+              <w:top w:type="dxa" w:w="60"/>
+              <w:left w:type="dxa" w:w="60"/>
+              <w:bottom w:type="dxa" w:w="60"/>
+              <w:right w:type="dxa" w:w="60"/>
+            </w:tcMar>
+          </w:tcPr>
+          <w:p>
+            <w:pPr>
+              <w:jc w:val="center"/>
+            </w:pPr>
+            <w:r>
+              <w:drawing>
+                <wp:inline distT="0" distB="0" distL="0" distR="0">
+                  <wp:extent cx="1924050" cy="1390650"/>
+                  <wp:effectExtent t="0" r="0" b="0" l="0"/>
+                  <wp:docPr id="1" name="12e-boutique.jpg" descr="12e-boutique.jpg" title="12e-boutique.jpg"/>
+                  <wp:cNvGraphicFramePr>
+                    <a:graphicFrameLocks xmlns:a="http://schemas.openxmlformats.org/drawingml/2006/main" noChangeAspect="1"/>
+                  </wp:cNvGraphicFramePr>
+                  <a:graphic xmlns:a="http://schemas.openxmlformats.org/drawingml/2006/main">
+                    <a:graphicData uri="http://schemas.openxmlformats.org/drawingml/2006/picture">
+                      <pic:pic xmlns:pic="http://schemas.openxmlformats.org/drawingml/2006/picture">
+                        <pic:nvPicPr>
+                          <pic:cNvPr id="0" name="" descr=""/>
+                          <pic:cNvPicPr>
+                            <a:picLocks noChangeAspect="1" noChangeArrowheads="1"/>
+                          </pic:cNvPicPr>
+                        </pic:nvPicPr>
+                        <pic:blipFill>
+                          <a:blip r:embed="rId42" cstate="none"/>
+                          <a:srcRect/>
+                          <a:stretch>
+                            <a:fillRect/>
+                          </a:stretch>
+                        </pic:blipFill>
+                        <pic:spPr bwMode="auto">
+                          <a:xfrm>
+                            <a:off x="0" y="0"/>
+                            <a:ext cx="1924050" cy="1390650"/>
+                          </a:xfrm>
+                          <a:prstGeom prst="rect">
+                            <a:avLst/>
+                          </a:prstGeom>
+                        </pic:spPr>
+                      </pic:pic>
+                    </a:graphicData>
+                  </a:graphic>
+                </wp:inline>
+              </w:drawing>
+            </w:r>
+          </w:p>
+          <w:p>
+            <w:pPr>
+              <w:pStyle w:val="Caption"/>
+              <w:jc w:val="center"/>
+            </w:pPr>
+            <w:r>
+              <w:rPr>
+                <w:b/>
+                <w:bCs/>
+              </w:rPr>
+              <w:t xml:space="preserve">Sac papier</w:t>
+            </w:r>
+            <w:r>
+              <w:t xml:space="preserve"> · boutique</w:t>
+            </w:r>
+          </w:p>
+        </w:tc>
+      </w:tr>
+      <w:tr>
+        <w:tc>
+          <w:tcPr>
+            <w:tcW w:type="dxa" w:w="3212"/>
+            <w:tcBorders>
+              <w:top w:val="none" w:color="FFFFFF" w:sz="0"/>
+              <w:left w:val="none" w:color="FFFFFF" w:sz="0"/>
+              <w:bottom w:val="none" w:color="FFFFFF" w:sz="0"/>
+              <w:right w:val="none" w:color="FFFFFF" w:sz="0"/>
+            </w:tcBorders>
+            <w:tcMar>
+              <w:top w:type="dxa" w:w="60"/>
+              <w:left w:type="dxa" w:w="60"/>
+              <w:bottom w:type="dxa" w:w="60"/>
+              <w:right w:type="dxa" w:w="60"/>
+            </w:tcMar>
+          </w:tcPr>
+          <w:p>
+            <w:pPr>
+              <w:jc w:val="center"/>
+            </w:pPr>
+            <w:r>
+              <w:drawing>
+                <wp:inline distT="0" distB="0" distL="0" distR="0">
+                  <wp:extent cx="1924050" cy="1390650"/>
+                  <wp:effectExtent t="0" r="0" b="0" l="0"/>
+                  <wp:docPr id="1" name="12a-limonade.jpg" descr="12a-limonade.jpg" title="12a-limonade.jpg"/>
+                  <wp:cNvGraphicFramePr>
+                    <a:graphicFrameLocks xmlns:a="http://schemas.openxmlformats.org/drawingml/2006/main" noChangeAspect="1"/>
+                  </wp:cNvGraphicFramePr>
+                  <a:graphic xmlns:a="http://schemas.openxmlformats.org/drawingml/2006/main">
+                    <a:graphicData uri="http://schemas.openxmlformats.org/drawingml/2006/picture">
+                      <pic:pic xmlns:pic="http://schemas.openxmlformats.org/drawingml/2006/picture">
+                        <pic:nvPicPr>
+                          <pic:cNvPr id="0" name="" descr=""/>
+                          <pic:cNvPicPr>
+                            <a:picLocks noChangeAspect="1" noChangeArrowheads="1"/>
+                          </pic:cNvPicPr>
+                        </pic:nvPicPr>
+                        <pic:blipFill>
+                          <a:blip r:embed="rId43" cstate="none"/>
+                          <a:srcRect/>
+                          <a:stretch>
+                            <a:fillRect/>
+                          </a:stretch>
+                        </pic:blipFill>
+                        <pic:spPr bwMode="auto">
+                          <a:xfrm>
+                            <a:off x="0" y="0"/>
+                            <a:ext cx="1924050" cy="1390650"/>
+                          </a:xfrm>
+                          <a:prstGeom prst="rect">
+                            <a:avLst/>
+                          </a:prstGeom>
+                        </pic:spPr>
+                      </pic:pic>
+                    </a:graphicData>
+                  </a:graphic>
+                </wp:inline>
+              </w:drawing>
+            </w:r>
+          </w:p>
+          <w:p>
+            <w:pPr>
+              <w:pStyle w:val="Caption"/>
+              <w:jc w:val="center"/>
+            </w:pPr>
+            <w:r>
+              <w:rPr>
+                <w:b/>
+                <w:bCs/>
+              </w:rPr>
+              <w:t xml:space="preserve">Canette (sleeve)</w:t>
+            </w:r>
+            <w:r>
+              <w:t xml:space="preserve"> · boissons</w:t>
+            </w:r>
+          </w:p>
+        </w:tc>
+        <w:tc>
+          <w:tcPr>
+            <w:tcW w:type="dxa" w:w="3212"/>
+            <w:tcBorders>
+              <w:top w:val="none" w:color="FFFFFF" w:sz="0"/>
+              <w:left w:val="none" w:color="FFFFFF" w:sz="0"/>
+              <w:bottom w:val="none" w:color="FFFFFF" w:sz="0"/>
+              <w:right w:val="none" w:color="FFFFFF" w:sz="0"/>
+            </w:tcBorders>
+            <w:tcMar>
+              <w:top w:type="dxa" w:w="60"/>
+              <w:left w:type="dxa" w:w="60"/>
+              <w:bottom w:type="dxa" w:w="60"/>
+              <w:right w:type="dxa" w:w="60"/>
+            </w:tcMar>
+          </w:tcPr>
+          <w:p>
+            <w:pPr>
+              <w:jc w:val="center"/>
+            </w:pPr>
+            <w:r>
+              <w:drawing>
+                <wp:inline distT="0" distB="0" distL="0" distR="0">
+                  <wp:extent cx="1924050" cy="1390650"/>
+                  <wp:effectExtent t="0" r="0" b="0" l="0"/>
+                  <wp:docPr id="1" name="12b-tubecreme.jpg" descr="12b-tubecreme.jpg" title="12b-tubecreme.jpg"/>
+                  <wp:cNvGraphicFramePr>
+                    <a:graphicFrameLocks xmlns:a="http://schemas.openxmlformats.org/drawingml/2006/main" noChangeAspect="1"/>
+                  </wp:cNvGraphicFramePr>
+                  <a:graphic xmlns:a="http://schemas.openxmlformats.org/drawingml/2006/main">
+                    <a:graphicData uri="http://schemas.openxmlformats.org/drawingml/2006/picture">
+                      <pic:pic xmlns:pic="http://schemas.openxmlformats.org/drawingml/2006/picture">
+                        <pic:nvPicPr>
+                          <pic:cNvPr id="0" name="" descr=""/>
+                          <pic:cNvPicPr>
+                            <a:picLocks noChangeAspect="1" noChangeArrowheads="1"/>
+                          </pic:cNvPicPr>
+                        </pic:nvPicPr>
+                        <pic:blipFill>
+                          <a:blip r:embed="rId44" cstate="none"/>
+                          <a:srcRect/>
+                          <a:stretch>
+                            <a:fillRect/>
+                          </a:stretch>
+                        </pic:blipFill>
+                        <pic:spPr bwMode="auto">
+                          <a:xfrm>
+                            <a:off x="0" y="0"/>
+                            <a:ext cx="1924050" cy="1390650"/>
+                          </a:xfrm>
+                          <a:prstGeom prst="rect">
+                            <a:avLst/>
+                          </a:prstGeom>
+                        </pic:spPr>
+                      </pic:pic>
+                    </a:graphicData>
+                  </a:graphic>
+                </wp:inline>
+              </w:drawing>
+            </w:r>
+          </w:p>
+          <w:p>
+            <w:pPr>
+              <w:pStyle w:val="Caption"/>
+              <w:jc w:val="center"/>
+            </w:pPr>
+            <w:r>
+              <w:rPr>
+                <w:b/>
+                <w:bCs/>
+              </w:rPr>
+              <w:t xml:space="preserve">Tube cosmétique</w:t>
+            </w:r>
+            <w:r>
+              <w:t xml:space="preserve"> · cosmétique</w:t>
+            </w:r>
+          </w:p>
+        </w:tc>
+        <w:tc>
+          <w:tcPr>
+            <w:tcW w:type="dxa" w:w="3212"/>
+            <w:tcBorders>
+              <w:top w:val="none" w:color="FFFFFF" w:sz="0"/>
+              <w:left w:val="none" w:color="FFFFFF" w:sz="0"/>
+              <w:bottom w:val="none" w:color="FFFFFF" w:sz="0"/>
+              <w:right w:val="none" w:color="FFFFFF" w:sz="0"/>
+            </w:tcBorders>
+            <w:tcMar>
+              <w:top w:type="dxa" w:w="60"/>
+              <w:left w:type="dxa" w:w="60"/>
+              <w:bottom w:type="dxa" w:w="60"/>
+              <w:right w:type="dxa" w:w="60"/>
+            </w:tcMar>
+          </w:tcPr>
+          <w:p>
+            <w:pPr>
+              <w:jc w:val="center"/>
+            </w:pPr>
+            <w:r>
+              <w:drawing>
+                <wp:inline distT="0" distB="0" distL="0" distR="0">
+                  <wp:extent cx="1924050" cy="1390650"/>
+                  <wp:effectExtent t="0" r="0" b="0" l="0"/>
+                  <wp:docPr id="1" name="12c-cafegrains.jpg" descr="12c-cafegrains.jpg" title="12c-cafegrains.jpg"/>
+                  <wp:cNvGraphicFramePr>
+                    <a:graphicFrameLocks xmlns:a="http://schemas.openxmlformats.org/drawingml/2006/main" noChangeAspect="1"/>
+                  </wp:cNvGraphicFramePr>
+                  <a:graphic xmlns:a="http://schemas.openxmlformats.org/drawingml/2006/main">
+                    <a:graphicData uri="http://schemas.openxmlformats.org/drawingml/2006/picture">
+                      <pic:pic xmlns:pic="http://schemas.openxmlformats.org/drawingml/2006/picture">
+                        <pic:nvPicPr>
+                          <pic:cNvPr id="0" name="" descr=""/>
+                          <pic:cNvPicPr>
+                            <a:picLocks noChangeAspect="1" noChangeArrowheads="1"/>
+                          </pic:cNvPicPr>
+                        </pic:nvPicPr>
+                        <pic:blipFill>
+                          <a:blip r:embed="rId45" cstate="none"/>
+                          <a:srcRect/>
+                          <a:stretch>
+                            <a:fillRect/>
+                          </a:stretch>
+                        </pic:blipFill>
+                        <pic:spPr bwMode="auto">
+                          <a:xfrm>
+                            <a:off x="0" y="0"/>
+                            <a:ext cx="1924050" cy="1390650"/>
+                          </a:xfrm>
+                          <a:prstGeom prst="rect">
+                            <a:avLst/>
+                          </a:prstGeom>
+                        </pic:spPr>
+                      </pic:pic>
+                    </a:graphicData>
+                  </a:graphic>
+                </wp:inline>
+              </w:drawing>
+            </w:r>
+          </w:p>
+          <w:p>
+            <w:pPr>
+              <w:pStyle w:val="Caption"/>
+              <w:jc w:val="center"/>
+            </w:pPr>
+            <w:r>
+              <w:rPr>
+                <w:b/>
+                <w:bCs/>
+              </w:rPr>
               <w:t xml:space="preserve">Sachet doypack</w:t>
             </w:r>
             <w:r>
@@ -7405,7 +9828,7 @@
         <w:pageBreakBefore/>
       </w:pPr>
       <w:r>
-        <w:t xml:space="preserve">8. Travailler avec Illustrator</w:t>
+        <w:t xml:space="preserve">10. Travailler avec Illustrator</w:t>
       </w:r>
     </w:p>
     <w:p>
@@ -7596,7 +10019,7 @@
         <w:pageBreakBefore/>
       </w:pPr>
       <w:r>
-        <w:t xml:space="preserve">9. Projets, paramètres et données</w:t>
+        <w:t xml:space="preserve">11. Projets, paramètres et données</w:t>
       </w:r>
     </w:p>
     <w:p>
@@ -7608,9 +10031,9 @@
       <w:r>
         <w:drawing>
           <wp:inline distT="0" distB="0" distL="0" distR="0">
-            <wp:extent cx="5791200" cy="3619500"/>
+            <wp:extent cx="5905500" cy="2543175"/>
             <wp:effectExtent t="0" r="0" b="0" l="0"/>
-            <wp:docPr id="1" name="13-projets.jpg" descr="13-projets.jpg" title="13-projets.jpg"/>
+            <wp:docPr id="1" name="27-dossiers.jpg" descr="27-dossiers.jpg" title="27-dossiers.jpg"/>
             <wp:cNvGraphicFramePr>
               <a:graphicFrameLocks xmlns:a="http://schemas.openxmlformats.org/drawingml/2006/main" noChangeAspect="1"/>
             </wp:cNvGraphicFramePr>
@@ -7624,7 +10047,7 @@
                     </pic:cNvPicPr>
                   </pic:nvPicPr>
                   <pic:blipFill>
-                    <a:blip r:embed="rId41" cstate="none"/>
+                    <a:blip r:embed="rId46" cstate="none"/>
                     <a:srcRect/>
                     <a:stretch>
                       <a:fillRect/>
@@ -7633,7 +10056,7 @@
                   <pic:spPr bwMode="auto">
                     <a:xfrm>
                       <a:off x="0" y="0"/>
-                      <a:ext cx="5791200" cy="3619500"/>
+                      <a:ext cx="5905500" cy="2543175"/>
                     </a:xfrm>
                     <a:prstGeom prst="rect">
                       <a:avLst/>
@@ -7656,10 +10079,73 @@
           <w:b/>
           <w:bCs/>
         </w:rPr>
-        <w:t xml:space="preserve">Figure 9 — </w:t>
-      </w:r>
-      <w:r>
-        <w:t xml:space="preserve">Le tableau des projets, classés par statut</w:t>
+        <w:t xml:space="preserve">Figure 14 — </w:t>
+      </w:r>
+      <w:r>
+        <w:t xml:space="preserve">Le tableau des projets : BAT validé en ligne, historique et dossier à relancer</w:t>
+      </w:r>
+    </w:p>
+    <w:p>
+      <w:pPr>
+        <w:keepNext/>
+        <w:spacing w:after="60" w:before="120"/>
+        <w:jc w:val="center"/>
+      </w:pPr>
+      <w:r>
+        <w:drawing>
+          <wp:inline distT="0" distB="0" distL="0" distR="0">
+            <wp:extent cx="5905500" cy="1066800"/>
+            <wp:effectExtent t="0" r="0" b="0" l="0"/>
+            <wp:docPr id="1" name="28-clients.jpg" descr="28-clients.jpg" title="28-clients.jpg"/>
+            <wp:cNvGraphicFramePr>
+              <a:graphicFrameLocks xmlns:a="http://schemas.openxmlformats.org/drawingml/2006/main" noChangeAspect="1"/>
+            </wp:cNvGraphicFramePr>
+            <a:graphic xmlns:a="http://schemas.openxmlformats.org/drawingml/2006/main">
+              <a:graphicData uri="http://schemas.openxmlformats.org/drawingml/2006/picture">
+                <pic:pic xmlns:pic="http://schemas.openxmlformats.org/drawingml/2006/picture">
+                  <pic:nvPicPr>
+                    <pic:cNvPr id="0" name="" descr=""/>
+                    <pic:cNvPicPr>
+                      <a:picLocks noChangeAspect="1" noChangeArrowheads="1"/>
+                    </pic:cNvPicPr>
+                  </pic:nvPicPr>
+                  <pic:blipFill>
+                    <a:blip r:embed="rId47" cstate="none"/>
+                    <a:srcRect/>
+                    <a:stretch>
+                      <a:fillRect/>
+                    </a:stretch>
+                  </pic:blipFill>
+                  <pic:spPr bwMode="auto">
+                    <a:xfrm>
+                      <a:off x="0" y="0"/>
+                      <a:ext cx="5905500" cy="1066800"/>
+                    </a:xfrm>
+                    <a:prstGeom prst="rect">
+                      <a:avLst/>
+                    </a:prstGeom>
+                  </pic:spPr>
+                </pic:pic>
+              </a:graphicData>
+            </a:graphic>
+          </wp:inline>
+        </w:drawing>
+      </w:r>
+    </w:p>
+    <w:p>
+      <w:pPr>
+        <w:pStyle w:val="Caption"/>
+        <w:jc w:val="center"/>
+      </w:pPr>
+      <w:r>
+        <w:rPr>
+          <w:b/>
+          <w:bCs/>
+        </w:rPr>
+        <w:t xml:space="preserve">Figure 15 — </w:t>
+      </w:r>
+      <w:r>
+        <w:t xml:space="preserve">La vue par client</w:t>
       </w:r>
     </w:p>
     <w:p>
@@ -7699,7 +10185,27 @@
         <w:t xml:space="preserve">Statuts</w:t>
       </w:r>
       <w:r>
-        <w:t xml:space="preserve"> : brouillon → BAT envoyé → validé → en production → livré, avec historique.</w:t>
+        <w:t xml:space="preserve"> : brouillon → devis envoyé → BAT envoyé → validé → en production → livré. Chaque carte affiche son historique, la dernière réponse du client et un badge « À relancer » après 7 jours sans réponse.</w:t>
+      </w:r>
+    </w:p>
+    <w:p>
+      <w:pPr>
+        <w:pStyle w:val="ListParagraph"/>
+        <w:numPr>
+          <w:ilvl w:val="0"/>
+          <w:numId w:val="5"/>
+        </w:numPr>
+        <w:spacing w:after="60"/>
+      </w:pPr>
+      <w:r>
+        <w:rPr>
+          <w:b/>
+          <w:bCs/>
+        </w:rPr>
+        <w:t xml:space="preserve">Vue « Par client »</w:t>
+      </w:r>
+      <w:r>
+        <w:t xml:space="preserve"> : nombre de dossiers, dossiers en cours et à relancer, montant HT total et dernière activité ; un clic sur le client affiche ses dossiers.</w:t>
       </w:r>
     </w:p>
     <w:p>
@@ -7767,7 +10273,7 @@
                     </pic:cNvPicPr>
                   </pic:nvPicPr>
                   <pic:blipFill>
-                    <a:blip r:embed="rId42" cstate="none"/>
+                    <a:blip r:embed="rId48" cstate="none"/>
                     <a:srcRect/>
                     <a:stretch>
                       <a:fillRect/>
@@ -7799,7 +10305,7 @@
           <w:b/>
           <w:bCs/>
         </w:rPr>
-        <w:t xml:space="preserve">Figure 10 — </w:t>
+        <w:t xml:space="preserve">Figure 16 — </w:t>
       </w:r>
       <w:r>
         <w:t xml:space="preserve">Les paramètres : coordonnées, conditions et grille tarifaire de l'imprimerie</w:t>
@@ -7870,7 +10376,7 @@
         <w:pageBreakBefore/>
       </w:pPr>
       <w:r>
-        <w:t xml:space="preserve">10. Le guide intégré</w:t>
+        <w:t xml:space="preserve">12. Le guide intégré</w:t>
       </w:r>
     </w:p>
     <w:p>
@@ -7888,7 +10394,7 @@
         <w:t xml:space="preserve">Guide</w:t>
       </w:r>
       <w:r>
-        <w:t xml:space="preserve"> ouvre un manuel interactif en 11 chapitres. Le bouton « Me montrer » de chaque étape met en évidence la vraie commande dans l'interface ; la </w:t>
+        <w:t xml:space="preserve"> ouvre un manuel interactif en 11 chapitres, mis à jour avec les nouveautés. Le bouton « Me montrer » de chaque étape met en évidence la vraie commande dans l'interface ; la </w:t>
       </w:r>
       <w:r>
         <w:rPr>
@@ -7898,7 +10404,7 @@
         <w:t xml:space="preserve">visite guidée</w:t>
       </w:r>
       <w:r>
-        <w:t xml:space="preserve"> (41 étapes) parcourt tout le logiciel, au clavier ← → et Échap. Une visite est proposée au premier lancement.</w:t>
+        <w:t xml:space="preserve"> (46 étapes) parcourt tout le logiciel, au clavier ← → et Échap. Une visite est proposée au premier lancement.</w:t>
       </w:r>
     </w:p>
     <w:p>
@@ -7926,7 +10432,7 @@
                     </pic:cNvPicPr>
                   </pic:nvPicPr>
                   <pic:blipFill>
-                    <a:blip r:embed="rId43" cstate="none"/>
+                    <a:blip r:embed="rId49" cstate="none"/>
                     <a:srcRect/>
                     <a:stretch>
                       <a:fillRect/>
@@ -7958,7 +10464,7 @@
           <w:b/>
           <w:bCs/>
         </w:rPr>
-        <w:t xml:space="preserve">Figure 11 — </w:t>
+        <w:t xml:space="preserve">Figure 17 — </w:t>
       </w:r>
       <w:r>
         <w:t xml:space="preserve">Le guide de l'infographiste</w:t>
@@ -7989,7 +10495,7 @@
                     </pic:cNvPicPr>
                   </pic:nvPicPr>
                   <pic:blipFill>
-                    <a:blip r:embed="rId44" cstate="none"/>
+                    <a:blip r:embed="rId50" cstate="none"/>
                     <a:srcRect/>
                     <a:stretch>
                       <a:fillRect/>
@@ -8021,7 +10527,7 @@
           <w:b/>
           <w:bCs/>
         </w:rPr>
-        <w:t xml:space="preserve">Figure 12 — </w:t>
+        <w:t xml:space="preserve">Figure 18 — </w:t>
       </w:r>
       <w:r>
         <w:t xml:space="preserve">Visite guidée : la commande expliquée est mise en évidence à l'écran</w:t>
@@ -8033,7 +10539,7 @@
         <w:pageBreakBefore/>
       </w:pPr>
       <w:r>
-        <w:t xml:space="preserve">11. Check-list avant BAT</w:t>
+        <w:t xml:space="preserve">13. Check-list avant BAT</w:t>
       </w:r>
     </w:p>
     <w:tbl>
@@ -8563,6 +11069,278 @@
                 <w:sz w:val="19"/>
                 <w:szCs w:val="19"/>
               </w:rPr>
+              <w:t xml:space="preserve">GS1-128</w:t>
+            </w:r>
+          </w:p>
+        </w:tc>
+        <w:tc>
+          <w:tcPr>
+            <w:tcW w:type="dxa" w:w="7238"/>
+            <w:tcBorders>
+              <w:top w:val="single" w:color="D6D9D2" w:sz="4"/>
+              <w:left w:val="single" w:color="D6D9D2" w:sz="4"/>
+              <w:bottom w:val="single" w:color="D6D9D2" w:sz="4"/>
+              <w:right w:val="single" w:color="D6D9D2" w:sz="4"/>
+            </w:tcBorders>
+            <w:tcMar>
+              <w:top w:type="dxa" w:w="70"/>
+              <w:left w:type="dxa" w:w="110"/>
+              <w:bottom w:type="dxa" w:w="70"/>
+              <w:right w:type="dxa" w:w="110"/>
+            </w:tcMar>
+            <w:vAlign w:val="center"/>
+          </w:tcPr>
+          <w:p>
+            <w:pPr>
+              <w:spacing w:after="0"/>
+            </w:pPr>
+            <w:r>
+              <w:rPr>
+                <w:b w:val="false"/>
+                <w:bCs w:val="false"/>
+                <w:color w:val="15181D"/>
+                <w:sz w:val="19"/>
+                <w:szCs w:val="19"/>
+              </w:rPr>
+              <w:t xml:space="preserve">Module ≥ 0,25 mm (0,495 mm et 32 mm de haut pour la logistique), jamais sur un pli.</w:t>
+            </w:r>
+          </w:p>
+        </w:tc>
+      </w:tr>
+      <w:tr>
+        <w:tc>
+          <w:tcPr>
+            <w:tcW w:type="dxa" w:w="2400"/>
+            <w:tcBorders>
+              <w:top w:val="single" w:color="D6D9D2" w:sz="4"/>
+              <w:left w:val="single" w:color="D6D9D2" w:sz="4"/>
+              <w:bottom w:val="single" w:color="D6D9D2" w:sz="4"/>
+              <w:right w:val="single" w:color="D6D9D2" w:sz="4"/>
+            </w:tcBorders>
+            <w:tcMar>
+              <w:top w:type="dxa" w:w="70"/>
+              <w:left w:type="dxa" w:w="110"/>
+              <w:bottom w:type="dxa" w:w="70"/>
+              <w:right w:type="dxa" w:w="110"/>
+            </w:tcMar>
+            <w:vAlign w:val="center"/>
+          </w:tcPr>
+          <w:p>
+            <w:pPr>
+              <w:spacing w:after="0"/>
+            </w:pPr>
+            <w:r>
+              <w:rPr>
+                <w:b w:val="false"/>
+                <w:bCs w:val="false"/>
+                <w:color w:val="15181D"/>
+                <w:sz w:val="19"/>
+                <w:szCs w:val="19"/>
+              </w:rPr>
+              <w:t xml:space="preserve">Braille</w:t>
+            </w:r>
+          </w:p>
+        </w:tc>
+        <w:tc>
+          <w:tcPr>
+            <w:tcW w:type="dxa" w:w="7238"/>
+            <w:tcBorders>
+              <w:top w:val="single" w:color="D6D9D2" w:sz="4"/>
+              <w:left w:val="single" w:color="D6D9D2" w:sz="4"/>
+              <w:bottom w:val="single" w:color="D6D9D2" w:sz="4"/>
+              <w:right w:val="single" w:color="D6D9D2" w:sz="4"/>
+            </w:tcBorders>
+            <w:tcMar>
+              <w:top w:type="dxa" w:w="70"/>
+              <w:left w:type="dxa" w:w="110"/>
+              <w:bottom w:type="dxa" w:w="70"/>
+              <w:right w:type="dxa" w:w="110"/>
+            </w:tcMar>
+            <w:vAlign w:val="center"/>
+          </w:tcPr>
+          <w:p>
+            <w:pPr>
+              <w:spacing w:after="0"/>
+            </w:pPr>
+            <w:r>
+              <w:rPr>
+                <w:b w:val="false"/>
+                <w:bCs w:val="false"/>
+                <w:color w:val="15181D"/>
+                <w:sz w:val="19"/>
+                <w:szCs w:val="19"/>
+              </w:rPr>
+              <w:t xml:space="preserve">Sur une seule face, à 5 mm des plis, sans dorure ni vernis dessous, transcription relue.</w:t>
+            </w:r>
+          </w:p>
+        </w:tc>
+      </w:tr>
+      <w:tr>
+        <w:tc>
+          <w:tcPr>
+            <w:tcW w:type="dxa" w:w="2400"/>
+            <w:tcBorders>
+              <w:top w:val="single" w:color="D6D9D2" w:sz="4"/>
+              <w:left w:val="single" w:color="D6D9D2" w:sz="4"/>
+              <w:bottom w:val="single" w:color="D6D9D2" w:sz="4"/>
+              <w:right w:val="single" w:color="D6D9D2" w:sz="4"/>
+            </w:tcBorders>
+            <w:tcMar>
+              <w:top w:type="dxa" w:w="70"/>
+              <w:left w:type="dxa" w:w="110"/>
+              <w:bottom w:type="dxa" w:w="70"/>
+              <w:right w:type="dxa" w:w="110"/>
+            </w:tcMar>
+            <w:vAlign w:val="center"/>
+          </w:tcPr>
+          <w:p>
+            <w:pPr>
+              <w:spacing w:after="0"/>
+            </w:pPr>
+            <w:r>
+              <w:rPr>
+                <w:b w:val="false"/>
+                <w:bCs w:val="false"/>
+                <w:color w:val="15181D"/>
+                <w:sz w:val="19"/>
+                <w:szCs w:val="19"/>
+              </w:rPr>
+              <w:t xml:space="preserve">Forme de découpe</w:t>
+            </w:r>
+          </w:p>
+        </w:tc>
+        <w:tc>
+          <w:tcPr>
+            <w:tcW w:type="dxa" w:w="7238"/>
+            <w:tcBorders>
+              <w:top w:val="single" w:color="D6D9D2" w:sz="4"/>
+              <w:left w:val="single" w:color="D6D9D2" w:sz="4"/>
+              <w:bottom w:val="single" w:color="D6D9D2" w:sz="4"/>
+              <w:right w:val="single" w:color="D6D9D2" w:sz="4"/>
+            </w:tcBorders>
+            <w:tcMar>
+              <w:top w:type="dxa" w:w="70"/>
+              <w:left w:type="dxa" w:w="110"/>
+              <w:bottom w:type="dxa" w:w="70"/>
+              <w:right w:type="dxa" w:w="110"/>
+            </w:tcMar>
+            <w:vAlign w:val="center"/>
+          </w:tcPr>
+          <w:p>
+            <w:pPr>
+              <w:spacing w:after="0"/>
+            </w:pPr>
+            <w:r>
+              <w:rPr>
+                <w:b w:val="false"/>
+                <w:bCs w:val="false"/>
+                <w:color w:val="15181D"/>
+                <w:sz w:val="19"/>
+                <w:szCs w:val="19"/>
+              </w:rPr>
+              <w:t xml:space="preserve">Contrôle du tracé conforme ; sens des fibres, attaches et montage validés avec le formiste.</w:t>
+            </w:r>
+          </w:p>
+        </w:tc>
+      </w:tr>
+      <w:tr>
+        <w:tc>
+          <w:tcPr>
+            <w:tcW w:type="dxa" w:w="2400"/>
+            <w:tcBorders>
+              <w:top w:val="single" w:color="D6D9D2" w:sz="4"/>
+              <w:left w:val="single" w:color="D6D9D2" w:sz="4"/>
+              <w:bottom w:val="single" w:color="D6D9D2" w:sz="4"/>
+              <w:right w:val="single" w:color="D6D9D2" w:sz="4"/>
+            </w:tcBorders>
+            <w:tcMar>
+              <w:top w:type="dxa" w:w="70"/>
+              <w:left w:type="dxa" w:w="110"/>
+              <w:bottom w:type="dxa" w:w="70"/>
+              <w:right w:type="dxa" w:w="110"/>
+            </w:tcMar>
+            <w:vAlign w:val="center"/>
+          </w:tcPr>
+          <w:p>
+            <w:pPr>
+              <w:spacing w:after="0"/>
+            </w:pPr>
+            <w:r>
+              <w:rPr>
+                <w:b w:val="false"/>
+                <w:bCs w:val="false"/>
+                <w:color w:val="15181D"/>
+                <w:sz w:val="19"/>
+                <w:szCs w:val="19"/>
+              </w:rPr>
+              <w:t xml:space="preserve">PDF d'impression</w:t>
+            </w:r>
+          </w:p>
+        </w:tc>
+        <w:tc>
+          <w:tcPr>
+            <w:tcW w:type="dxa" w:w="7238"/>
+            <w:tcBorders>
+              <w:top w:val="single" w:color="D6D9D2" w:sz="4"/>
+              <w:left w:val="single" w:color="D6D9D2" w:sz="4"/>
+              <w:bottom w:val="single" w:color="D6D9D2" w:sz="4"/>
+              <w:right w:val="single" w:color="D6D9D2" w:sz="4"/>
+            </w:tcBorders>
+            <w:tcMar>
+              <w:top w:type="dxa" w:w="70"/>
+              <w:left w:type="dxa" w:w="110"/>
+              <w:bottom w:type="dxa" w:w="70"/>
+              <w:right w:type="dxa" w:w="110"/>
+            </w:tcMar>
+            <w:vAlign w:val="center"/>
+          </w:tcPr>
+          <w:p>
+            <w:pPr>
+              <w:spacing w:after="0"/>
+            </w:pPr>
+            <w:r>
+              <w:rPr>
+                <w:b w:val="false"/>
+                <w:bCs w:val="false"/>
+                <w:color w:val="15181D"/>
+                <w:sz w:val="19"/>
+                <w:szCs w:val="19"/>
+              </w:rPr>
+              <w:t xml:space="preserve">Contrôlé dans le logiciel de prépresse de l'imprimerie (PDF/X-3, FOGRA39 ou FOGRA47).</w:t>
+            </w:r>
+          </w:p>
+        </w:tc>
+      </w:tr>
+      <w:tr>
+        <w:tc>
+          <w:tcPr>
+            <w:tcW w:type="dxa" w:w="2400"/>
+            <w:tcBorders>
+              <w:top w:val="single" w:color="D6D9D2" w:sz="4"/>
+              <w:left w:val="single" w:color="D6D9D2" w:sz="4"/>
+              <w:bottom w:val="single" w:color="D6D9D2" w:sz="4"/>
+              <w:right w:val="single" w:color="D6D9D2" w:sz="4"/>
+            </w:tcBorders>
+            <w:tcMar>
+              <w:top w:type="dxa" w:w="70"/>
+              <w:left w:type="dxa" w:w="110"/>
+              <w:bottom w:type="dxa" w:w="70"/>
+              <w:right w:type="dxa" w:w="110"/>
+            </w:tcMar>
+            <w:vAlign w:val="center"/>
+          </w:tcPr>
+          <w:p>
+            <w:pPr>
+              <w:spacing w:after="0"/>
+            </w:pPr>
+            <w:r>
+              <w:rPr>
+                <w:b w:val="false"/>
+                <w:bCs w:val="false"/>
+                <w:color w:val="15181D"/>
+                <w:sz w:val="19"/>
+                <w:szCs w:val="19"/>
+              </w:rPr>
               <w:t xml:space="preserve">Finitions</w:t>
             </w:r>
           </w:p>
@@ -9248,6 +12026,210 @@
           </w:p>
         </w:tc>
       </w:tr>
+      <w:tr>
+        <w:tc>
+          <w:tcPr>
+            <w:tcW w:type="dxa" w:w="3300"/>
+            <w:tcBorders>
+              <w:top w:val="single" w:color="D6D9D2" w:sz="4"/>
+              <w:left w:val="single" w:color="D6D9D2" w:sz="4"/>
+              <w:bottom w:val="single" w:color="D6D9D2" w:sz="4"/>
+              <w:right w:val="single" w:color="D6D9D2" w:sz="4"/>
+            </w:tcBorders>
+            <w:tcMar>
+              <w:top w:type="dxa" w:w="70"/>
+              <w:left w:type="dxa" w:w="110"/>
+              <w:bottom w:type="dxa" w:w="70"/>
+              <w:right w:type="dxa" w:w="110"/>
+            </w:tcMar>
+            <w:vAlign w:val="center"/>
+          </w:tcPr>
+          <w:p>
+            <w:pPr>
+              <w:spacing w:after="0"/>
+            </w:pPr>
+            <w:r>
+              <w:rPr>
+                <w:b w:val="false"/>
+                <w:bCs w:val="false"/>
+                <w:color w:val="15181D"/>
+                <w:sz w:val="19"/>
+                <w:szCs w:val="19"/>
+              </w:rPr>
+              <w:t xml:space="preserve">Moins de poses qu'avant sur la feuille ?</w:t>
+            </w:r>
+          </w:p>
+        </w:tc>
+        <w:tc>
+          <w:tcPr>
+            <w:tcW w:type="dxa" w:w="6338"/>
+            <w:tcBorders>
+              <w:top w:val="single" w:color="D6D9D2" w:sz="4"/>
+              <w:left w:val="single" w:color="D6D9D2" w:sz="4"/>
+              <w:bottom w:val="single" w:color="D6D9D2" w:sz="4"/>
+              <w:right w:val="single" w:color="D6D9D2" w:sz="4"/>
+            </w:tcBorders>
+            <w:tcMar>
+              <w:top w:type="dxa" w:w="70"/>
+              <w:left w:type="dxa" w:w="110"/>
+              <w:bottom w:type="dxa" w:w="70"/>
+              <w:right w:type="dxa" w:w="110"/>
+            </w:tcMar>
+            <w:vAlign w:val="center"/>
+          </w:tcPr>
+          <w:p>
+            <w:pPr>
+              <w:spacing w:after="0"/>
+            </w:pPr>
+            <w:r>
+              <w:rPr>
+                <w:b w:val="false"/>
+                <w:bCs w:val="false"/>
+                <w:color w:val="15181D"/>
+                <w:sz w:val="19"/>
+                <w:szCs w:val="19"/>
+              </w:rPr>
+              <w:t xml:space="preserve">Le sens des fibres est maintenant respecté. Laissez « Fibres de la feuille : Automatique » : l'application choisit le papier qui donne le plus de poses.</w:t>
+            </w:r>
+          </w:p>
+        </w:tc>
+      </w:tr>
+      <w:tr>
+        <w:tc>
+          <w:tcPr>
+            <w:tcW w:type="dxa" w:w="3300"/>
+            <w:tcBorders>
+              <w:top w:val="single" w:color="D6D9D2" w:sz="4"/>
+              <w:left w:val="single" w:color="D6D9D2" w:sz="4"/>
+              <w:bottom w:val="single" w:color="D6D9D2" w:sz="4"/>
+              <w:right w:val="single" w:color="D6D9D2" w:sz="4"/>
+            </w:tcBorders>
+            <w:tcMar>
+              <w:top w:type="dxa" w:w="70"/>
+              <w:left w:type="dxa" w:w="110"/>
+              <w:bottom w:type="dxa" w:w="70"/>
+              <w:right w:type="dxa" w:w="110"/>
+            </w:tcMar>
+            <w:vAlign w:val="center"/>
+          </w:tcPr>
+          <w:p>
+            <w:pPr>
+              <w:spacing w:after="0"/>
+            </w:pPr>
+            <w:r>
+              <w:rPr>
+                <w:b w:val="false"/>
+                <w:bCs w:val="false"/>
+                <w:color w:val="15181D"/>
+                <w:sz w:val="19"/>
+                <w:szCs w:val="19"/>
+              </w:rPr>
+              <w:t xml:space="preserve">Le client ne peut pas valider en ligne ?</w:t>
+            </w:r>
+          </w:p>
+        </w:tc>
+        <w:tc>
+          <w:tcPr>
+            <w:tcW w:type="dxa" w:w="6338"/>
+            <w:tcBorders>
+              <w:top w:val="single" w:color="D6D9D2" w:sz="4"/>
+              <w:left w:val="single" w:color="D6D9D2" w:sz="4"/>
+              <w:bottom w:val="single" w:color="D6D9D2" w:sz="4"/>
+              <w:right w:val="single" w:color="D6D9D2" w:sz="4"/>
+            </w:tcBorders>
+            <w:tcMar>
+              <w:top w:type="dxa" w:w="70"/>
+              <w:left w:type="dxa" w:w="110"/>
+              <w:bottom w:type="dxa" w:w="70"/>
+              <w:right w:type="dxa" w:w="110"/>
+            </w:tcMar>
+            <w:vAlign w:val="center"/>
+          </w:tcPr>
+          <w:p>
+            <w:pPr>
+              <w:spacing w:after="0"/>
+            </w:pPr>
+            <w:r>
+              <w:rPr>
+                <w:b w:val="false"/>
+                <w:bCs w:val="false"/>
+                <w:color w:val="15181D"/>
+                <w:sz w:val="19"/>
+                <w:szCs w:val="19"/>
+              </w:rPr>
+              <w:t xml:space="preserve">Donnez-lui le niveau « Contributeur » dans le menu Partager, ou enregistrez sa réponse avec « Réponse client au BAT… ».</w:t>
+            </w:r>
+          </w:p>
+        </w:tc>
+      </w:tr>
+      <w:tr>
+        <w:tc>
+          <w:tcPr>
+            <w:tcW w:type="dxa" w:w="3300"/>
+            <w:tcBorders>
+              <w:top w:val="single" w:color="D6D9D2" w:sz="4"/>
+              <w:left w:val="single" w:color="D6D9D2" w:sz="4"/>
+              <w:bottom w:val="single" w:color="D6D9D2" w:sz="4"/>
+              <w:right w:val="single" w:color="D6D9D2" w:sz="4"/>
+            </w:tcBorders>
+            <w:tcMar>
+              <w:top w:type="dxa" w:w="70"/>
+              <w:left w:type="dxa" w:w="110"/>
+              <w:bottom w:type="dxa" w:w="70"/>
+              <w:right w:type="dxa" w:w="110"/>
+            </w:tcMar>
+            <w:vAlign w:val="center"/>
+          </w:tcPr>
+          <w:p>
+            <w:pPr>
+              <w:spacing w:after="0"/>
+            </w:pPr>
+            <w:r>
+              <w:rPr>
+                <w:b w:val="false"/>
+                <w:bCs w:val="false"/>
+                <w:color w:val="15181D"/>
+                <w:sz w:val="19"/>
+                <w:szCs w:val="19"/>
+              </w:rPr>
+              <w:t xml:space="preserve">Code GS1-128 trop fin ?</w:t>
+            </w:r>
+          </w:p>
+        </w:tc>
+        <w:tc>
+          <w:tcPr>
+            <w:tcW w:type="dxa" w:w="6338"/>
+            <w:tcBorders>
+              <w:top w:val="single" w:color="D6D9D2" w:sz="4"/>
+              <w:left w:val="single" w:color="D6D9D2" w:sz="4"/>
+              <w:bottom w:val="single" w:color="D6D9D2" w:sz="4"/>
+              <w:right w:val="single" w:color="D6D9D2" w:sz="4"/>
+            </w:tcBorders>
+            <w:tcMar>
+              <w:top w:type="dxa" w:w="70"/>
+              <w:left w:type="dxa" w:w="110"/>
+              <w:bottom w:type="dxa" w:w="70"/>
+              <w:right w:type="dxa" w:w="110"/>
+            </w:tcMar>
+            <w:vAlign w:val="center"/>
+          </w:tcPr>
+          <w:p>
+            <w:pPr>
+              <w:spacing w:after="0"/>
+            </w:pPr>
+            <w:r>
+              <w:rPr>
+                <w:b w:val="false"/>
+                <w:bCs w:val="false"/>
+                <w:color w:val="15181D"/>
+                <w:sz w:val="19"/>
+                <w:szCs w:val="19"/>
+              </w:rPr>
+              <w:t xml:space="preserve">Élargissez le code ou réduisez les données : le module doit rester ≥ 0,25 mm.</w:t>
+            </w:r>
+          </w:p>
+        </w:tc>
+      </w:tr>
     </w:tbl>
     <w:p>
       <w:pPr>
@@ -9619,7 +12601,75 @@
                 <w:sz w:val="19"/>
                 <w:szCs w:val="19"/>
               </w:rPr>
-              <w:t xml:space="preserve">PDF d'impression d'exemple (visuel, forme de découpe, masque de dorure)</w:t>
+              <w:t xml:space="preserve">PDF d'impression d'exemple au format PDF/X-3 (visuel, forme de découpe, masque de dorure)</w:t>
+            </w:r>
+          </w:p>
+        </w:tc>
+      </w:tr>
+      <w:tr>
+        <w:tc>
+          <w:tcPr>
+            <w:tcW w:type="dxa" w:w="3600"/>
+            <w:tcBorders>
+              <w:top w:val="single" w:color="D6D9D2" w:sz="4"/>
+              <w:left w:val="single" w:color="D6D9D2" w:sz="4"/>
+              <w:bottom w:val="single" w:color="D6D9D2" w:sz="4"/>
+              <w:right w:val="single" w:color="D6D9D2" w:sz="4"/>
+            </w:tcBorders>
+            <w:tcMar>
+              <w:top w:type="dxa" w:w="70"/>
+              <w:left w:type="dxa" w:w="110"/>
+              <w:bottom w:type="dxa" w:w="70"/>
+              <w:right w:type="dxa" w:w="110"/>
+            </w:tcMar>
+            <w:vAlign w:val="center"/>
+          </w:tcPr>
+          <w:p>
+            <w:pPr>
+              <w:spacing w:after="0"/>
+            </w:pPr>
+            <w:r>
+              <w:rPr>
+                <w:b w:val="false"/>
+                <w:bCs w:val="false"/>
+                <w:color w:val="15181D"/>
+                <w:sz w:val="19"/>
+                <w:szCs w:val="19"/>
+              </w:rPr>
+              <w:t xml:space="preserve">exemples/montage-feuille.pdf</w:t>
+            </w:r>
+          </w:p>
+        </w:tc>
+        <w:tc>
+          <w:tcPr>
+            <w:tcW w:type="dxa" w:w="6038"/>
+            <w:tcBorders>
+              <w:top w:val="single" w:color="D6D9D2" w:sz="4"/>
+              <w:left w:val="single" w:color="D6D9D2" w:sz="4"/>
+              <w:bottom w:val="single" w:color="D6D9D2" w:sz="4"/>
+              <w:right w:val="single" w:color="D6D9D2" w:sz="4"/>
+            </w:tcBorders>
+            <w:tcMar>
+              <w:top w:type="dxa" w:w="70"/>
+              <w:left w:type="dxa" w:w="110"/>
+              <w:bottom w:type="dxa" w:w="70"/>
+              <w:right w:type="dxa" w:w="110"/>
+            </w:tcMar>
+            <w:vAlign w:val="center"/>
+          </w:tcPr>
+          <w:p>
+            <w:pPr>
+              <w:spacing w:after="0"/>
+            </w:pPr>
+            <w:r>
+              <w:rPr>
+                <w:b w:val="false"/>
+                <w:bCs w:val="false"/>
+                <w:color w:val="15181D"/>
+                <w:sz w:val="19"/>
+                <w:szCs w:val="19"/>
+              </w:rPr>
+              <w:t xml:space="preserve">Montage d'exemple sur feuille 70 × 100 avec attaches</w:t>
             </w:r>
           </w:p>
         </w:tc>

</xml_diff>

<commit_message>
Atelier et relation client : feuille partagée, formes en stock, versions du visuel, planning, stock de carton, coût réel, tarifs clients, relances, espace client, QR code, réalité augmentée, relecture IA
Co-Authored-By: Claude Opus 5.5 <noreply@anthropic.com>
Claude-Session: https://claude.ai/code/session_01WZ3wizDnKCJzxgWNJLJomm
</commit_message>
<xml_diff>
--- a/label-pack-studio/docs/Note-Label-Pack-Studio.docx
+++ b/label-pack-studio/docs/Note-Label-Pack-Studio.docx
@@ -5750,7 +5750,7 @@
       <w:r>
         <w:t xml:space="preserve">Vidéos jointes : </w:t>
       </w:r>
-      <w:hyperlink w:history="1" r:id="rIdw19ivjl3qbusvvreasrj6">
+      <w:hyperlink w:history="1" r:id="rIdel-8og_9aytlxt20isysk">
         <w:r>
           <w:rPr>
             <w:rStyle w:val="Hyperlink"/>
@@ -5761,7 +5761,7 @@
       <w:r>
         <w:t xml:space="preserve"> et </w:t>
       </w:r>
-      <w:hyperlink w:history="1" r:id="rIdapclo9h6nxvzyfqc7b5az">
+      <w:hyperlink w:history="1" r:id="rIdbcpygpum4r9jk-jk19wh8">
         <w:r>
           <w:rPr>
             <w:rStyle w:val="Hyperlink"/>
@@ -10376,7 +10376,7 @@
         <w:pageBreakBefore/>
       </w:pPr>
       <w:r>
-        <w:t xml:space="preserve">12. Le guide intégré</w:t>
+        <w:t xml:space="preserve">12. Gestion de l'atelier et relation client</w:t>
       </w:r>
     </w:p>
     <w:p>
@@ -10384,27 +10384,15 @@
         <w:spacing w:after="120"/>
       </w:pPr>
       <w:r>
-        <w:t xml:space="preserve">Le bouton </w:t>
-      </w:r>
-      <w:r>
-        <w:rPr>
-          <w:b/>
-          <w:bCs/>
-        </w:rPr>
-        <w:t xml:space="preserve">Guide</w:t>
-      </w:r>
-      <w:r>
-        <w:t xml:space="preserve"> ouvre un manuel interactif en 11 chapitres, mis à jour avec les nouveautés. Le bouton « Me montrer » de chaque étape met en évidence la vraie commande dans l'interface ; la </w:t>
-      </w:r>
-      <w:r>
-        <w:rPr>
-          <w:b/>
-          <w:bCs/>
-        </w:rPr>
-        <w:t xml:space="preserve">visite guidée</w:t>
-      </w:r>
-      <w:r>
-        <w:t xml:space="preserve"> (46 étapes) parcourt tout le logiciel, au clavier ← → et Échap. Une visite est proposée au premier lancement.</w:t>
+        <w:t xml:space="preserve">Ces fonctions relient le devis à la fabrication : ce qui est vendu, ce qui est planifié, ce qui est consommé et ce qui est réellement gagné.</w:t>
+      </w:r>
+    </w:p>
+    <w:p>
+      <w:pPr>
+        <w:pStyle w:val="Heading2"/>
+      </w:pPr>
+      <w:r>
+        <w:t xml:space="preserve">Planning des machines</w:t>
       </w:r>
     </w:p>
     <w:p>
@@ -10416,9 +10404,9 @@
       <w:r>
         <w:drawing>
           <wp:inline distT="0" distB="0" distL="0" distR="0">
-            <wp:extent cx="4200525" cy="3810000"/>
+            <wp:extent cx="5905500" cy="1724025"/>
             <wp:effectExtent t="0" r="0" b="0" l="0"/>
-            <wp:docPr id="1" name="15-guide.jpg" descr="15-guide.jpg" title="15-guide.jpg"/>
+            <wp:docPr id="1" name="29-planning.jpg" descr="29-planning.jpg" title="29-planning.jpg"/>
             <wp:cNvGraphicFramePr>
               <a:graphicFrameLocks xmlns:a="http://schemas.openxmlformats.org/drawingml/2006/main" noChangeAspect="1"/>
             </wp:cNvGraphicFramePr>
@@ -10441,7 +10429,7 @@
                   <pic:spPr bwMode="auto">
                     <a:xfrm>
                       <a:off x="0" y="0"/>
-                      <a:ext cx="4200525" cy="3810000"/>
+                      <a:ext cx="5905500" cy="1724025"/>
                     </a:xfrm>
                     <a:prstGeom prst="rect">
                       <a:avLst/>
@@ -10467,7 +10455,75 @@
         <w:t xml:space="preserve">Figure 17 — </w:t>
       </w:r>
       <w:r>
-        <w:t xml:space="preserve">Le guide de l'infographiste</w:t>
+        <w:t xml:space="preserve">Onglet « Planning » : passage des dossiers validés sur chaque machine et retards par rapport à la date promise</w:t>
+      </w:r>
+    </w:p>
+    <w:p>
+      <w:pPr>
+        <w:pStyle w:val="ListParagraph"/>
+        <w:numPr>
+          <w:ilvl w:val="0"/>
+          <w:numId w:val="5"/>
+        </w:numPr>
+        <w:spacing w:after="60"/>
+      </w:pPr>
+      <w:r>
+        <w:rPr>
+          <w:b/>
+          <w:bCs/>
+        </w:rPr>
+        <w:t xml:space="preserve">Dossiers planifiés</w:t>
+      </w:r>
+      <w:r>
+        <w:t xml:space="preserve"> : BAT validé et en production, dans l'ordre de validation du BAT.</w:t>
+      </w:r>
+    </w:p>
+    <w:p>
+      <w:pPr>
+        <w:pStyle w:val="ListParagraph"/>
+        <w:numPr>
+          <w:ilvl w:val="0"/>
+          <w:numId w:val="5"/>
+        </w:numPr>
+        <w:spacing w:after="60"/>
+      </w:pPr>
+      <w:r>
+        <w:rPr>
+          <w:b/>
+          <w:bCs/>
+        </w:rPr>
+        <w:t xml:space="preserve">Durées</w:t>
+      </w:r>
+      <w:r>
+        <w:t xml:space="preserve"> : calculées avec les cadences des Paramètres (impression, pelliculage, dorure, découpe, collage), en jours ouvrés du lundi au vendredi.</w:t>
+      </w:r>
+    </w:p>
+    <w:p>
+      <w:pPr>
+        <w:pStyle w:val="ListParagraph"/>
+        <w:numPr>
+          <w:ilvl w:val="0"/>
+          <w:numId w:val="5"/>
+        </w:numPr>
+        <w:spacing w:after="60"/>
+      </w:pPr>
+      <w:r>
+        <w:rPr>
+          <w:b/>
+          <w:bCs/>
+        </w:rPr>
+        <w:t xml:space="preserve">Date promise</w:t>
+      </w:r>
+      <w:r>
+        <w:t xml:space="preserve"> : se saisit dans le projet, section devis ; un dossier dont la fin estimée la dépasse apparaît « En retard ».</w:t>
+      </w:r>
+    </w:p>
+    <w:p>
+      <w:pPr>
+        <w:pStyle w:val="Heading2"/>
+      </w:pPr>
+      <w:r>
+        <w:t xml:space="preserve">Feuille partagée (plusieurs produits sur une même feuille)</w:t>
       </w:r>
     </w:p>
     <w:p>
@@ -10479,9 +10535,9 @@
       <w:r>
         <w:drawing>
           <wp:inline distT="0" distB="0" distL="0" distR="0">
-            <wp:extent cx="5715000" cy="3571875"/>
+            <wp:extent cx="5334000" cy="3228975"/>
             <wp:effectExtent t="0" r="0" b="0" l="0"/>
-            <wp:docPr id="1" name="16-visite.jpg" descr="16-visite.jpg" title="16-visite.jpg"/>
+            <wp:docPr id="1" name="30-feuille-partagee.jpg" descr="30-feuille-partagee.jpg" title="30-feuille-partagee.jpg"/>
             <wp:cNvGraphicFramePr>
               <a:graphicFrameLocks xmlns:a="http://schemas.openxmlformats.org/drawingml/2006/main" noChangeAspect="1"/>
             </wp:cNvGraphicFramePr>
@@ -10504,6 +10560,620 @@
                   <pic:spPr bwMode="auto">
                     <a:xfrm>
                       <a:off x="0" y="0"/>
+                      <a:ext cx="5334000" cy="3228975"/>
+                    </a:xfrm>
+                    <a:prstGeom prst="rect">
+                      <a:avLst/>
+                    </a:prstGeom>
+                  </pic:spPr>
+                </pic:pic>
+              </a:graphicData>
+            </a:graphic>
+          </wp:inline>
+        </w:drawing>
+      </w:r>
+    </w:p>
+    <w:p>
+      <w:pPr>
+        <w:pStyle w:val="Caption"/>
+        <w:jc w:val="center"/>
+      </w:pPr>
+      <w:r>
+        <w:rPr>
+          <w:b/>
+          <w:bCs/>
+        </w:rPr>
+        <w:t xml:space="preserve">Figure 18 — </w:t>
+      </w:r>
+      <w:r>
+        <w:t xml:space="preserve">Feuille partagée : poses réparties selon les quantités et comparaison avec des commandes séparées</w:t>
+      </w:r>
+    </w:p>
+    <w:p>
+      <w:pPr>
+        <w:spacing w:after="120"/>
+      </w:pPr>
+      <w:r>
+        <w:t xml:space="preserve">Bouton </w:t>
+      </w:r>
+      <w:r>
+        <w:rPr>
+          <w:b/>
+          <w:bCs/>
+        </w:rPr>
+        <w:t xml:space="preserve">Feuille partagée</w:t>
+      </w:r>
+      <w:r>
+        <w:t xml:space="preserve"> dans Projets : cochez des étuis de même support, même impression et même finition. L'application répartit les poses selon les quantités, calcule le nombre de feuilles, répartit le coût au prorata de la surface de carton de chaque produit et affiche l'économie par rapport à des commandes séparées. Le montage s'exporte en PDF et en DXF (calques COUPE et RAINAGE) pour le formiste.</w:t>
+      </w:r>
+    </w:p>
+    <w:tbl>
+      <w:tblPr>
+        <w:tblW w:type="dxa" w:w="9638"/>
+        <w:tblBorders>
+          <w:top w:val="single" w:color="auto" w:sz="4"/>
+          <w:left w:val="single" w:color="auto" w:sz="4"/>
+          <w:bottom w:val="single" w:color="auto" w:sz="4"/>
+          <w:right w:val="single" w:color="auto" w:sz="4"/>
+          <w:insideH w:val="single" w:color="auto" w:sz="4"/>
+          <w:insideV w:val="single" w:color="auto" w:sz="4"/>
+        </w:tblBorders>
+      </w:tblPr>
+      <w:tblGrid>
+        <w:gridCol w:w="9638"/>
+      </w:tblGrid>
+      <w:tr>
+        <w:tc>
+          <w:tcPr>
+            <w:tcW w:type="dxa" w:w="9638"/>
+            <w:tcBorders>
+              <w:top w:val="none" w:color="FFFFFF" w:sz="0"/>
+              <w:left w:val="single" w:color="B80F5A" w:sz="24"/>
+              <w:bottom w:val="none" w:color="FFFFFF" w:sz="0"/>
+              <w:right w:val="none" w:color="FFFFFF" w:sz="0"/>
+            </w:tcBorders>
+            <w:shd w:fill="F7E7EF" w:color="auto" w:val="clear"/>
+            <w:tcMar>
+              <w:top w:type="dxa" w:w="120"/>
+              <w:left w:type="dxa" w:w="200"/>
+              <w:bottom w:type="dxa" w:w="120"/>
+              <w:right w:type="dxa" w:w="200"/>
+            </w:tcMar>
+          </w:tcPr>
+          <w:p>
+            <w:pPr>
+              <w:spacing w:after="60"/>
+            </w:pPr>
+            <w:r>
+              <w:rPr>
+                <w:b/>
+                <w:bCs/>
+                <w:color w:val="B80F5A"/>
+              </w:rPr>
+              <w:t xml:space="preserve">À savoir</w:t>
+            </w:r>
+          </w:p>
+          <w:p>
+            <w:r>
+              <w:t xml:space="preserve">L'imposition est faite en rectangles, sans emboîtement : le formiste peut encore la resserrer. Un produit qui réutilise déjà une forme en stock peut revenir plus cher en feuille partagée : comparez la colonne « Seul ».</w:t>
+            </w:r>
+          </w:p>
+        </w:tc>
+      </w:tr>
+    </w:tbl>
+    <w:p>
+      <w:pPr>
+        <w:spacing w:after="80"/>
+      </w:pPr>
+    </w:p>
+    <w:p>
+      <w:pPr>
+        <w:pStyle w:val="Heading2"/>
+      </w:pPr>
+      <w:r>
+        <w:t xml:space="preserve">Formes de découpe en stock</w:t>
+      </w:r>
+    </w:p>
+    <w:p>
+      <w:pPr>
+        <w:pStyle w:val="ListParagraph"/>
+        <w:numPr>
+          <w:ilvl w:val="0"/>
+          <w:numId w:val="5"/>
+        </w:numPr>
+        <w:spacing w:after="60"/>
+      </w:pPr>
+      <w:r>
+        <w:rPr>
+          <w:b/>
+          <w:bCs/>
+        </w:rPr>
+        <w:t xml:space="preserve">Inventaire</w:t>
+      </w:r>
+      <w:r>
+        <w:t xml:space="preserve"> : « Formes en stock » enregistre la forme du projet en cours (référence, emplacement, poses, épaisseur).</w:t>
+      </w:r>
+    </w:p>
+    <w:p>
+      <w:pPr>
+        <w:pStyle w:val="ListParagraph"/>
+        <w:numPr>
+          <w:ilvl w:val="0"/>
+          <w:numId w:val="5"/>
+        </w:numPr>
+        <w:spacing w:after="60"/>
+      </w:pPr>
+      <w:r>
+        <w:rPr>
+          <w:b/>
+          <w:bCs/>
+        </w:rPr>
+        <w:t xml:space="preserve">Suggestion automatique</w:t>
+      </w:r>
+      <w:r>
+        <w:t xml:space="preserve"> : si un nouveau projet a le même gabarit et des cotes identiques ou proches (5 mm), un encadré propose « Utiliser cette forme » (pas de frais de forme, délai raccourci) ou « Adapter les cotes à cette forme ».</w:t>
+      </w:r>
+    </w:p>
+    <w:p>
+      <w:pPr>
+        <w:pStyle w:val="Heading2"/>
+      </w:pPr>
+      <w:r>
+        <w:t xml:space="preserve">Stock de carton, coût réel et tarifs clients</w:t>
+      </w:r>
+    </w:p>
+    <w:p>
+      <w:pPr>
+        <w:pStyle w:val="ListParagraph"/>
+        <w:numPr>
+          <w:ilvl w:val="0"/>
+          <w:numId w:val="5"/>
+        </w:numPr>
+        <w:spacing w:after="60"/>
+      </w:pPr>
+      <w:r>
+        <w:rPr>
+          <w:b/>
+          <w:bCs/>
+        </w:rPr>
+        <w:t xml:space="preserve">Stock</w:t>
+      </w:r>
+      <w:r>
+        <w:t xml:space="preserve"> : Paramètres › Stock de carton. Les dossiers validés ou en production réservent leurs feuilles ; le contrôle prépresse prévient si le stock disponible ne suffit pas, et le tableau de bord affiche stock, réservé et disponible.</w:t>
+      </w:r>
+    </w:p>
+    <w:p>
+      <w:pPr>
+        <w:pStyle w:val="ListParagraph"/>
+        <w:numPr>
+          <w:ilvl w:val="0"/>
+          <w:numId w:val="5"/>
+        </w:numPr>
+        <w:spacing w:after="60"/>
+      </w:pPr>
+      <w:r>
+        <w:rPr>
+          <w:b/>
+          <w:bCs/>
+        </w:rPr>
+        <w:t xml:space="preserve">Coût réel</w:t>
+      </w:r>
+      <w:r>
+        <w:t xml:space="preserve"> : sur la carte d'un dossier validé ou livré, « Coût réel… » : feuilles consommées, heures par poste (coûts horaires dans Paramètres), achats extérieurs. La marge réelle s'affiche sur la carte, dans la vue par client et dans le tableau de bord.</w:t>
+      </w:r>
+    </w:p>
+    <w:p>
+      <w:pPr>
+        <w:pStyle w:val="ListParagraph"/>
+        <w:numPr>
+          <w:ilvl w:val="0"/>
+          <w:numId w:val="5"/>
+        </w:numPr>
+        <w:spacing w:after="60"/>
+      </w:pPr>
+      <w:r>
+        <w:rPr>
+          <w:b/>
+          <w:bCs/>
+        </w:rPr>
+        <w:t xml:space="preserve">Tarifs par client</w:t>
+      </w:r>
+      <w:r>
+        <w:t xml:space="preserve"> : Paramètres › Tarifs par client (remise, marge spécifique, note de contrat), appliqués automatiquement dès que le nom du client du projet correspond.</w:t>
+      </w:r>
+    </w:p>
+    <w:p>
+      <w:pPr>
+        <w:pStyle w:val="Heading2"/>
+      </w:pPr>
+      <w:r>
+        <w:t xml:space="preserve">Versions du visuel</w:t>
+      </w:r>
+    </w:p>
+    <w:p>
+      <w:pPr>
+        <w:keepNext/>
+        <w:spacing w:after="60" w:before="120"/>
+        <w:jc w:val="center"/>
+      </w:pPr>
+      <w:r>
+        <w:drawing>
+          <wp:inline distT="0" distB="0" distL="0" distR="0">
+            <wp:extent cx="4686300" cy="3619500"/>
+            <wp:effectExtent t="0" r="0" b="0" l="0"/>
+            <wp:docPr id="1" name="31-versions.jpg" descr="31-versions.jpg" title="31-versions.jpg"/>
+            <wp:cNvGraphicFramePr>
+              <a:graphicFrameLocks xmlns:a="http://schemas.openxmlformats.org/drawingml/2006/main" noChangeAspect="1"/>
+            </wp:cNvGraphicFramePr>
+            <a:graphic xmlns:a="http://schemas.openxmlformats.org/drawingml/2006/main">
+              <a:graphicData uri="http://schemas.openxmlformats.org/drawingml/2006/picture">
+                <pic:pic xmlns:pic="http://schemas.openxmlformats.org/drawingml/2006/picture">
+                  <pic:nvPicPr>
+                    <pic:cNvPr id="0" name="" descr=""/>
+                    <pic:cNvPicPr>
+                      <a:picLocks noChangeAspect="1" noChangeArrowheads="1"/>
+                    </pic:cNvPicPr>
+                  </pic:nvPicPr>
+                  <pic:blipFill>
+                    <a:blip r:embed="rId51" cstate="none"/>
+                    <a:srcRect/>
+                    <a:stretch>
+                      <a:fillRect/>
+                    </a:stretch>
+                  </pic:blipFill>
+                  <pic:spPr bwMode="auto">
+                    <a:xfrm>
+                      <a:off x="0" y="0"/>
+                      <a:ext cx="4686300" cy="3619500"/>
+                    </a:xfrm>
+                    <a:prstGeom prst="rect">
+                      <a:avLst/>
+                    </a:prstGeom>
+                  </pic:spPr>
+                </pic:pic>
+              </a:graphicData>
+            </a:graphic>
+          </wp:inline>
+        </w:drawing>
+      </w:r>
+    </w:p>
+    <w:p>
+      <w:pPr>
+        <w:pStyle w:val="Caption"/>
+        <w:jc w:val="center"/>
+      </w:pPr>
+      <w:r>
+        <w:rPr>
+          <w:b/>
+          <w:bCs/>
+        </w:rPr>
+        <w:t xml:space="preserve">Figure 19 — </w:t>
+      </w:r>
+      <w:r>
+        <w:t xml:space="preserve">Comparaison de deux versions : les zones modifiées apparaissent en rouge</w:t>
+      </w:r>
+    </w:p>
+    <w:p>
+      <w:pPr>
+        <w:spacing w:after="120"/>
+      </w:pPr>
+      <w:r>
+        <w:t xml:space="preserve">Une version est gardée à chaque BAT exporté, signé ou envoyé en lien client. « Versions du visuel » compare deux versions et indique la part de la surface modifiée : utile pour vérifier qu'une correction demandée n'a rien changé d'autre.</w:t>
+      </w:r>
+    </w:p>
+    <w:p>
+      <w:pPr>
+        <w:pStyle w:val="Heading2"/>
+      </w:pPr>
+      <w:r>
+        <w:t xml:space="preserve">Relances et espace client</w:t>
+      </w:r>
+    </w:p>
+    <w:p>
+      <w:pPr>
+        <w:pStyle w:val="ListParagraph"/>
+        <w:numPr>
+          <w:ilvl w:val="0"/>
+          <w:numId w:val="5"/>
+        </w:numPr>
+        <w:spacing w:after="60"/>
+      </w:pPr>
+      <w:r>
+        <w:rPr>
+          <w:b/>
+          <w:bCs/>
+        </w:rPr>
+        <w:t xml:space="preserve">Relancer…</w:t>
+      </w:r>
+      <w:r>
+        <w:t xml:space="preserve"> : sur la carte d'un devis ou d'un BAT envoyé, un message prérempli s'envoie par WhatsApp ou par e-mail ; la relance s'inscrit dans l'historique.</w:t>
+      </w:r>
+    </w:p>
+    <w:p>
+      <w:pPr>
+        <w:pStyle w:val="ListParagraph"/>
+        <w:numPr>
+          <w:ilvl w:val="0"/>
+          <w:numId w:val="5"/>
+        </w:numPr>
+        <w:spacing w:after="60"/>
+      </w:pPr>
+      <w:r>
+        <w:rPr>
+          <w:b/>
+          <w:bCs/>
+        </w:rPr>
+        <w:t xml:space="preserve">Espace client</w:t>
+      </w:r>
+      <w:r>
+        <w:t xml:space="preserve"> (version en ligne) : vue « Par client » › « Espace client ». Le client retrouve toutes ses maquettes 3D et l'état de ses dossiers, et peut demander une réimpression ; la demande arrive dans l'historique du dossier.</w:t>
+      </w:r>
+    </w:p>
+    <w:p>
+      <w:pPr>
+        <w:keepNext/>
+        <w:spacing w:after="60" w:before="120"/>
+        <w:jc w:val="center"/>
+      </w:pPr>
+      <w:r>
+        <w:drawing>
+          <wp:inline distT="0" distB="0" distL="0" distR="0">
+            <wp:extent cx="4000500" cy="3362325"/>
+            <wp:effectExtent t="0" r="0" b="0" l="0"/>
+            <wp:docPr id="1" name="32-espace-client.jpg" descr="32-espace-client.jpg" title="32-espace-client.jpg"/>
+            <wp:cNvGraphicFramePr>
+              <a:graphicFrameLocks xmlns:a="http://schemas.openxmlformats.org/drawingml/2006/main" noChangeAspect="1"/>
+            </wp:cNvGraphicFramePr>
+            <a:graphic xmlns:a="http://schemas.openxmlformats.org/drawingml/2006/main">
+              <a:graphicData uri="http://schemas.openxmlformats.org/drawingml/2006/picture">
+                <pic:pic xmlns:pic="http://schemas.openxmlformats.org/drawingml/2006/picture">
+                  <pic:nvPicPr>
+                    <pic:cNvPr id="0" name="" descr=""/>
+                    <pic:cNvPicPr>
+                      <a:picLocks noChangeAspect="1" noChangeArrowheads="1"/>
+                    </pic:cNvPicPr>
+                  </pic:nvPicPr>
+                  <pic:blipFill>
+                    <a:blip r:embed="rId52" cstate="none"/>
+                    <a:srcRect/>
+                    <a:stretch>
+                      <a:fillRect/>
+                    </a:stretch>
+                  </pic:blipFill>
+                  <pic:spPr bwMode="auto">
+                    <a:xfrm>
+                      <a:off x="0" y="0"/>
+                      <a:ext cx="4000500" cy="3362325"/>
+                    </a:xfrm>
+                    <a:prstGeom prst="rect">
+                      <a:avLst/>
+                    </a:prstGeom>
+                  </pic:spPr>
+                </pic:pic>
+              </a:graphicData>
+            </a:graphic>
+          </wp:inline>
+        </w:drawing>
+      </w:r>
+    </w:p>
+    <w:p>
+      <w:pPr>
+        <w:pStyle w:val="Caption"/>
+        <w:jc w:val="center"/>
+      </w:pPr>
+      <w:r>
+        <w:rPr>
+          <w:b/>
+          <w:bCs/>
+        </w:rPr>
+        <w:t xml:space="preserve">Figure 20 — </w:t>
+      </w:r>
+      <w:r>
+        <w:t xml:space="preserve">L'espace client : maquettes, statut et demande de réimpression</w:t>
+      </w:r>
+    </w:p>
+    <w:p>
+      <w:pPr>
+        <w:pStyle w:val="Heading2"/>
+      </w:pPr>
+      <w:r>
+        <w:t xml:space="preserve">QR code, réalité augmentée, relecture IA</w:t>
+      </w:r>
+    </w:p>
+    <w:p>
+      <w:pPr>
+        <w:pStyle w:val="ListParagraph"/>
+        <w:numPr>
+          <w:ilvl w:val="0"/>
+          <w:numId w:val="5"/>
+        </w:numPr>
+        <w:spacing w:after="60"/>
+      </w:pPr>
+      <w:r>
+        <w:rPr>
+          <w:b/>
+          <w:bCs/>
+        </w:rPr>
+        <w:t xml:space="preserve">QR code</w:t>
+      </w:r>
+      <w:r>
+        <w:t xml:space="preserve"> : menu « + Code, braille, picto… » › QR code (lien vers le site, la notice, la traçabilité). Le contrôle prépresse vérifie la taille du module (0,33 mm minimum) et la zone de silence.</w:t>
+      </w:r>
+    </w:p>
+    <w:p>
+      <w:pPr>
+        <w:pStyle w:val="ListParagraph"/>
+        <w:numPr>
+          <w:ilvl w:val="0"/>
+          <w:numId w:val="5"/>
+        </w:numPr>
+        <w:spacing w:after="60"/>
+      </w:pPr>
+      <w:r>
+        <w:rPr>
+          <w:b/>
+          <w:bCs/>
+        </w:rPr>
+        <w:t xml:space="preserve">Réalité augmentée</w:t>
+      </w:r>
+      <w:r>
+        <w:t xml:space="preserve"> : Exporter › « Maquette 3D et réalité augmentée » : modèle 3D standard .glb en taille réelle et page pour téléphone ; « Voir chez moi » pose l'emballage sur la table du client (Android et iPhone, connexion Internet requise).</w:t>
+      </w:r>
+    </w:p>
+    <w:p>
+      <w:pPr>
+        <w:pStyle w:val="ListParagraph"/>
+        <w:numPr>
+          <w:ilvl w:val="0"/>
+          <w:numId w:val="5"/>
+        </w:numPr>
+        <w:spacing w:after="60"/>
+      </w:pPr>
+      <w:r>
+        <w:rPr>
+          <w:b/>
+          <w:bCs/>
+        </w:rPr>
+        <w:t xml:space="preserve">Relecture des textes (IA)</w:t>
+      </w:r>
+      <w:r>
+        <w:t xml:space="preserve"> : version en ligne ; l'IA relit marque, produit, mentions et textes (orthographe, typographie, cohérence) et propose des corrections à appliquer d'un clic, après vérification.</w:t>
+      </w:r>
+    </w:p>
+    <w:p>
+      <w:pPr>
+        <w:pStyle w:val="Heading1"/>
+        <w:pageBreakBefore/>
+      </w:pPr>
+      <w:r>
+        <w:t xml:space="preserve">13. Le guide intégré</w:t>
+      </w:r>
+    </w:p>
+    <w:p>
+      <w:pPr>
+        <w:spacing w:after="120"/>
+      </w:pPr>
+      <w:r>
+        <w:t xml:space="preserve">Le bouton </w:t>
+      </w:r>
+      <w:r>
+        <w:rPr>
+          <w:b/>
+          <w:bCs/>
+        </w:rPr>
+        <w:t xml:space="preserve">Guide</w:t>
+      </w:r>
+      <w:r>
+        <w:t xml:space="preserve"> ouvre un manuel interactif en 11 chapitres, mis à jour avec les nouveautés. Le bouton « Me montrer » de chaque étape met en évidence la vraie commande dans l'interface ; la </w:t>
+      </w:r>
+      <w:r>
+        <w:rPr>
+          <w:b/>
+          <w:bCs/>
+        </w:rPr>
+        <w:t xml:space="preserve">visite guidée</w:t>
+      </w:r>
+      <w:r>
+        <w:t xml:space="preserve"> (46 étapes) parcourt tout le logiciel, au clavier ← → et Échap. Une visite est proposée au premier lancement.</w:t>
+      </w:r>
+    </w:p>
+    <w:p>
+      <w:pPr>
+        <w:keepNext/>
+        <w:spacing w:after="60" w:before="120"/>
+        <w:jc w:val="center"/>
+      </w:pPr>
+      <w:r>
+        <w:drawing>
+          <wp:inline distT="0" distB="0" distL="0" distR="0">
+            <wp:extent cx="4200525" cy="3810000"/>
+            <wp:effectExtent t="0" r="0" b="0" l="0"/>
+            <wp:docPr id="1" name="15-guide.jpg" descr="15-guide.jpg" title="15-guide.jpg"/>
+            <wp:cNvGraphicFramePr>
+              <a:graphicFrameLocks xmlns:a="http://schemas.openxmlformats.org/drawingml/2006/main" noChangeAspect="1"/>
+            </wp:cNvGraphicFramePr>
+            <a:graphic xmlns:a="http://schemas.openxmlformats.org/drawingml/2006/main">
+              <a:graphicData uri="http://schemas.openxmlformats.org/drawingml/2006/picture">
+                <pic:pic xmlns:pic="http://schemas.openxmlformats.org/drawingml/2006/picture">
+                  <pic:nvPicPr>
+                    <pic:cNvPr id="0" name="" descr=""/>
+                    <pic:cNvPicPr>
+                      <a:picLocks noChangeAspect="1" noChangeArrowheads="1"/>
+                    </pic:cNvPicPr>
+                  </pic:nvPicPr>
+                  <pic:blipFill>
+                    <a:blip r:embed="rId53" cstate="none"/>
+                    <a:srcRect/>
+                    <a:stretch>
+                      <a:fillRect/>
+                    </a:stretch>
+                  </pic:blipFill>
+                  <pic:spPr bwMode="auto">
+                    <a:xfrm>
+                      <a:off x="0" y="0"/>
+                      <a:ext cx="4200525" cy="3810000"/>
+                    </a:xfrm>
+                    <a:prstGeom prst="rect">
+                      <a:avLst/>
+                    </a:prstGeom>
+                  </pic:spPr>
+                </pic:pic>
+              </a:graphicData>
+            </a:graphic>
+          </wp:inline>
+        </w:drawing>
+      </w:r>
+    </w:p>
+    <w:p>
+      <w:pPr>
+        <w:pStyle w:val="Caption"/>
+        <w:jc w:val="center"/>
+      </w:pPr>
+      <w:r>
+        <w:rPr>
+          <w:b/>
+          <w:bCs/>
+        </w:rPr>
+        <w:t xml:space="preserve">Figure 21 — </w:t>
+      </w:r>
+      <w:r>
+        <w:t xml:space="preserve">Le guide de l'infographiste</w:t>
+      </w:r>
+    </w:p>
+    <w:p>
+      <w:pPr>
+        <w:keepNext/>
+        <w:spacing w:after="60" w:before="120"/>
+        <w:jc w:val="center"/>
+      </w:pPr>
+      <w:r>
+        <w:drawing>
+          <wp:inline distT="0" distB="0" distL="0" distR="0">
+            <wp:extent cx="5715000" cy="3571875"/>
+            <wp:effectExtent t="0" r="0" b="0" l="0"/>
+            <wp:docPr id="1" name="16-visite.jpg" descr="16-visite.jpg" title="16-visite.jpg"/>
+            <wp:cNvGraphicFramePr>
+              <a:graphicFrameLocks xmlns:a="http://schemas.openxmlformats.org/drawingml/2006/main" noChangeAspect="1"/>
+            </wp:cNvGraphicFramePr>
+            <a:graphic xmlns:a="http://schemas.openxmlformats.org/drawingml/2006/main">
+              <a:graphicData uri="http://schemas.openxmlformats.org/drawingml/2006/picture">
+                <pic:pic xmlns:pic="http://schemas.openxmlformats.org/drawingml/2006/picture">
+                  <pic:nvPicPr>
+                    <pic:cNvPr id="0" name="" descr=""/>
+                    <pic:cNvPicPr>
+                      <a:picLocks noChangeAspect="1" noChangeArrowheads="1"/>
+                    </pic:cNvPicPr>
+                  </pic:nvPicPr>
+                  <pic:blipFill>
+                    <a:blip r:embed="rId54" cstate="none"/>
+                    <a:srcRect/>
+                    <a:stretch>
+                      <a:fillRect/>
+                    </a:stretch>
+                  </pic:blipFill>
+                  <pic:spPr bwMode="auto">
+                    <a:xfrm>
+                      <a:off x="0" y="0"/>
                       <a:ext cx="5715000" cy="3571875"/>
                     </a:xfrm>
                     <a:prstGeom prst="rect">
@@ -10527,7 +11197,7 @@
           <w:b/>
           <w:bCs/>
         </w:rPr>
-        <w:t xml:space="preserve">Figure 18 — </w:t>
+        <w:t xml:space="preserve">Figure 22 — </w:t>
       </w:r>
       <w:r>
         <w:t xml:space="preserve">Visite guidée : la commande expliquée est mise en évidence à l'écran</w:t>
@@ -10539,7 +11209,7 @@
         <w:pageBreakBefore/>
       </w:pPr>
       <w:r>
-        <w:t xml:space="preserve">13. Check-list avant BAT</w:t>
+        <w:t xml:space="preserve">14. Check-list avant BAT</w:t>
       </w:r>
     </w:p>
     <w:tbl>

</xml_diff>